<commit_message>
Docx: thêm Appendix A (bảng đầy đủ 25 configs từ summary.csv) + Appendix B (reproducibility) + §5.5 số LR-sweep (recipe CNN không chuyển sang SNN)
</commit_message>
<xml_diff>
--- a/paper/SNN-Flood-Paper.docx
+++ b/paper/SNN-Flood-Paper.docx
@@ -1671,7 +1671,31 @@
         <w:rPr>
           <w:i w:val="0"/>
         </w:rPr>
-        <w:t>Within T2–T8 accuracy is flat (T2 0.391 ≈ T8 0.388; SNN-T2 vs SNN-T6 n.s.), so larger T buys no accuracy but costs more energy. At extreme T (T1, T10) occasional seed-level training collapse appears (a seed drops to ≈0.08); re-running T6 with 5 seeds reduced std from 0.13 (n=3) to 0.022 (n=5), confirming a small-sample artifact, not a bimodal property. LR affects SNN stability more than mean accuracy. INT8 preserves accuracy (−0.008 IoU) at 20× energy; INT4 was inconclusive in our tooling (Conv2d unsupported).</w:t>
+        <w:t>Timesteps T. Within T2–T8 accuracy is flat (T2 0.391 ≈ T8 0.388; SNN-T2 vs SNN-T6 n.s.), so larger T buys no accuracy but costs more energy. At extreme T (T1, T10) occasional seed-level training collapse appears (a seed drops to ≈0.08); re-running T6 with 5 seeds reduced std from 0.13 (n=3) to 0.022 (n=5), confirming a small-sample artifact, not a bimodal property.</w:t>
+      </w:r>
+    </w:p>
+    <w:p>
+      <w:pPr>
+        <w:spacing w:after="120"/>
+        <w:jc w:val="both"/>
+      </w:pPr>
+      <w:r>
+        <w:rPr>
+          <w:i w:val="0"/>
+        </w:rPr>
+        <w:t>Learning rate. LR = 2e-4 improved the CNN (MobileNet-UNet 0.480 → 0.498) but degraded the SNN (SNN-T2 0.391 → 0.370; SNN-T8 0.388 → 0.355): the winning CNN recipe does not transfer to SNNs, and LR mainly affects SNN training stability rather than raising its accuracy ceiling. The symmetric LR sweep also establishes a fair comparison (both families tuned).</w:t>
+      </w:r>
+    </w:p>
+    <w:p>
+      <w:pPr>
+        <w:spacing w:after="120"/>
+        <w:jc w:val="both"/>
+      </w:pPr>
+      <w:r>
+        <w:rPr>
+          <w:i w:val="0"/>
+        </w:rPr>
+        <w:t>Quantization bits. INT8 preserves accuracy (−0.008 IoU) at 20× lower energy; INT4 was inconclusive in our tooling (torchao int4 did not cover Conv2d) — reported as a tooling limitation, not a scientific conclusion.</w:t>
       </w:r>
     </w:p>
     <w:p>
@@ -1852,6 +1876,2849 @@
           <w:sz w:val="18"/>
         </w:rPr>
         <w:t>[TODO] SpikingJelly; SNN segmentation (Shi 2022, Su 2023); MobileNetV2; SegFormer; DeepLabV3; SAR-SNN works. Cần đủ 20–30 trích dẫn.</w:t>
+      </w:r>
+    </w:p>
+    <w:p>
+      <w:r>
+        <w:br w:type="page"/>
+      </w:r>
+    </w:p>
+    <w:p>
+      <w:pPr>
+        <w:spacing w:before="200" w:after="80"/>
+      </w:pPr>
+      <w:r>
+        <w:rPr>
+          <w:b/>
+          <w:sz w:val="26"/>
+        </w:rPr>
+        <w:t>Appendix A. Full benchmark (all configurations)</w:t>
+      </w:r>
+    </w:p>
+    <w:p>
+      <w:pPr>
+        <w:spacing w:after="120"/>
+        <w:jc w:val="both"/>
+      </w:pPr>
+      <w:r>
+        <w:rPr>
+          <w:i/>
+        </w:rPr>
+        <w:t>Complete results for all 25 configurations (mean over seeds; n in parentheses). Pooled = pooled flood-IoU; Per-chip = mean per-chip flood-IoU; F1 = flood Dice; pwIoU = permanent-water IoU. Sorted by pooled flood-IoU.</w:t>
+      </w:r>
+    </w:p>
+    <w:tbl>
+      <w:tblPr>
+        <w:tblStyle w:val="LightGrid-Accent1"/>
+        <w:tblW w:type="auto" w:w="0"/>
+        <w:tblLook w:firstColumn="1" w:firstRow="1" w:lastColumn="0" w:lastRow="0" w:noHBand="0" w:noVBand="1" w:val="04A0"/>
+      </w:tblPr>
+      <w:tblGrid>
+        <w:gridCol w:w="1080"/>
+        <w:gridCol w:w="1080"/>
+        <w:gridCol w:w="1080"/>
+        <w:gridCol w:w="1080"/>
+        <w:gridCol w:w="1080"/>
+        <w:gridCol w:w="1080"/>
+        <w:gridCol w:w="1080"/>
+        <w:gridCol w:w="1080"/>
+      </w:tblGrid>
+      <w:tr>
+        <w:tc>
+          <w:tcPr>
+            <w:tcW w:type="dxa" w:w="1080"/>
+          </w:tcPr>
+          <w:p>
+            <w:r>
+              <w:rPr>
+                <w:b/>
+                <w:sz w:val="16"/>
+              </w:rPr>
+              <w:t>Model</w:t>
+            </w:r>
+          </w:p>
+        </w:tc>
+        <w:tc>
+          <w:tcPr>
+            <w:tcW w:type="dxa" w:w="1080"/>
+          </w:tcPr>
+          <w:p>
+            <w:r>
+              <w:rPr>
+                <w:b/>
+                <w:sz w:val="16"/>
+              </w:rPr>
+              <w:t>Pooled IoU (±std, n)</w:t>
+            </w:r>
+          </w:p>
+        </w:tc>
+        <w:tc>
+          <w:tcPr>
+            <w:tcW w:type="dxa" w:w="1080"/>
+          </w:tcPr>
+          <w:p>
+            <w:r>
+              <w:rPr>
+                <w:b/>
+                <w:sz w:val="16"/>
+              </w:rPr>
+              <w:t>Per-chip</w:t>
+            </w:r>
+          </w:p>
+        </w:tc>
+        <w:tc>
+          <w:tcPr>
+            <w:tcW w:type="dxa" w:w="1080"/>
+          </w:tcPr>
+          <w:p>
+            <w:r>
+              <w:rPr>
+                <w:b/>
+                <w:sz w:val="16"/>
+              </w:rPr>
+              <w:t>F1</w:t>
+            </w:r>
+          </w:p>
+        </w:tc>
+        <w:tc>
+          <w:tcPr>
+            <w:tcW w:type="dxa" w:w="1080"/>
+          </w:tcPr>
+          <w:p>
+            <w:r>
+              <w:rPr>
+                <w:b/>
+                <w:sz w:val="16"/>
+              </w:rPr>
+              <w:t>pwIoU</w:t>
+            </w:r>
+          </w:p>
+        </w:tc>
+        <w:tc>
+          <w:tcPr>
+            <w:tcW w:type="dxa" w:w="1080"/>
+          </w:tcPr>
+          <w:p>
+            <w:r>
+              <w:rPr>
+                <w:b/>
+                <w:sz w:val="16"/>
+              </w:rPr>
+              <w:t>Params</w:t>
+            </w:r>
+          </w:p>
+        </w:tc>
+        <w:tc>
+          <w:tcPr>
+            <w:tcW w:type="dxa" w:w="1080"/>
+          </w:tcPr>
+          <w:p>
+            <w:r>
+              <w:rPr>
+                <w:b/>
+                <w:sz w:val="16"/>
+              </w:rPr>
+              <w:t>Energy(mJ)</w:t>
+            </w:r>
+          </w:p>
+        </w:tc>
+        <w:tc>
+          <w:tcPr>
+            <w:tcW w:type="dxa" w:w="1080"/>
+          </w:tcPr>
+          <w:p>
+            <w:r>
+              <w:rPr>
+                <w:b/>
+                <w:sz w:val="16"/>
+              </w:rPr>
+              <w:t>Spike%</w:t>
+            </w:r>
+          </w:p>
+        </w:tc>
+      </w:tr>
+      <w:tr>
+        <w:tc>
+          <w:tcPr>
+            <w:tcW w:type="dxa" w:w="1080"/>
+          </w:tcPr>
+          <w:p>
+            <w:r>
+              <w:rPr>
+                <w:sz w:val="16"/>
+              </w:rPr>
+              <w:t>segformer_b2</w:t>
+            </w:r>
+          </w:p>
+        </w:tc>
+        <w:tc>
+          <w:tcPr>
+            <w:tcW w:type="dxa" w:w="1080"/>
+          </w:tcPr>
+          <w:p>
+            <w:r>
+              <w:rPr>
+                <w:sz w:val="16"/>
+              </w:rPr>
+              <w:t>0.525±0.018 (n3)</w:t>
+            </w:r>
+          </w:p>
+        </w:tc>
+        <w:tc>
+          <w:tcPr>
+            <w:tcW w:type="dxa" w:w="1080"/>
+          </w:tcPr>
+          <w:p>
+            <w:r>
+              <w:rPr>
+                <w:sz w:val="16"/>
+              </w:rPr>
+              <w:t>0.251</w:t>
+            </w:r>
+          </w:p>
+        </w:tc>
+        <w:tc>
+          <w:tcPr>
+            <w:tcW w:type="dxa" w:w="1080"/>
+          </w:tcPr>
+          <w:p>
+            <w:r>
+              <w:rPr>
+                <w:sz w:val="16"/>
+              </w:rPr>
+              <w:t>0.688</w:t>
+            </w:r>
+          </w:p>
+        </w:tc>
+        <w:tc>
+          <w:tcPr>
+            <w:tcW w:type="dxa" w:w="1080"/>
+          </w:tcPr>
+          <w:p>
+            <w:r>
+              <w:rPr>
+                <w:sz w:val="16"/>
+              </w:rPr>
+              <w:t>0.700</w:t>
+            </w:r>
+          </w:p>
+        </w:tc>
+        <w:tc>
+          <w:tcPr>
+            <w:tcW w:type="dxa" w:w="1080"/>
+          </w:tcPr>
+          <w:p>
+            <w:r>
+              <w:rPr>
+                <w:sz w:val="16"/>
+              </w:rPr>
+              <w:t>24.72</w:t>
+            </w:r>
+          </w:p>
+        </w:tc>
+        <w:tc>
+          <w:tcPr>
+            <w:tcW w:type="dxa" w:w="1080"/>
+          </w:tcPr>
+          <w:p>
+            <w:r>
+              <w:rPr>
+                <w:sz w:val="16"/>
+              </w:rPr>
+              <w:t>98.0</w:t>
+            </w:r>
+          </w:p>
+        </w:tc>
+        <w:tc>
+          <w:tcPr>
+            <w:tcW w:type="dxa" w:w="1080"/>
+          </w:tcPr>
+          <w:p>
+            <w:r>
+              <w:rPr>
+                <w:sz w:val="16"/>
+              </w:rPr>
+              <w:t>—</w:t>
+            </w:r>
+          </w:p>
+        </w:tc>
+      </w:tr>
+      <w:tr>
+        <w:tc>
+          <w:tcPr>
+            <w:tcW w:type="dxa" w:w="1080"/>
+          </w:tcPr>
+          <w:p>
+            <w:r>
+              <w:rPr>
+                <w:sz w:val="16"/>
+              </w:rPr>
+              <w:t>unet_smp</w:t>
+            </w:r>
+          </w:p>
+        </w:tc>
+        <w:tc>
+          <w:tcPr>
+            <w:tcW w:type="dxa" w:w="1080"/>
+          </w:tcPr>
+          <w:p>
+            <w:r>
+              <w:rPr>
+                <w:sz w:val="16"/>
+              </w:rPr>
+              <w:t>0.509±0.028 (n3)</w:t>
+            </w:r>
+          </w:p>
+        </w:tc>
+        <w:tc>
+          <w:tcPr>
+            <w:tcW w:type="dxa" w:w="1080"/>
+          </w:tcPr>
+          <w:p>
+            <w:r>
+              <w:rPr>
+                <w:sz w:val="16"/>
+              </w:rPr>
+              <w:t>0.291</w:t>
+            </w:r>
+          </w:p>
+        </w:tc>
+        <w:tc>
+          <w:tcPr>
+            <w:tcW w:type="dxa" w:w="1080"/>
+          </w:tcPr>
+          <w:p>
+            <w:r>
+              <w:rPr>
+                <w:sz w:val="16"/>
+              </w:rPr>
+              <w:t>0.674</w:t>
+            </w:r>
+          </w:p>
+        </w:tc>
+        <w:tc>
+          <w:tcPr>
+            <w:tcW w:type="dxa" w:w="1080"/>
+          </w:tcPr>
+          <w:p>
+            <w:r>
+              <w:rPr>
+                <w:sz w:val="16"/>
+              </w:rPr>
+              <w:t>0.626</w:t>
+            </w:r>
+          </w:p>
+        </w:tc>
+        <w:tc>
+          <w:tcPr>
+            <w:tcW w:type="dxa" w:w="1080"/>
+          </w:tcPr>
+          <w:p>
+            <w:r>
+              <w:rPr>
+                <w:sz w:val="16"/>
+              </w:rPr>
+              <w:t>24.43</w:t>
+            </w:r>
+          </w:p>
+        </w:tc>
+        <w:tc>
+          <w:tcPr>
+            <w:tcW w:type="dxa" w:w="1080"/>
+          </w:tcPr>
+          <w:p>
+            <w:r>
+              <w:rPr>
+                <w:sz w:val="16"/>
+              </w:rPr>
+              <w:t>143.9</w:t>
+            </w:r>
+          </w:p>
+        </w:tc>
+        <w:tc>
+          <w:tcPr>
+            <w:tcW w:type="dxa" w:w="1080"/>
+          </w:tcPr>
+          <w:p>
+            <w:r>
+              <w:rPr>
+                <w:sz w:val="16"/>
+              </w:rPr>
+              <w:t>—</w:t>
+            </w:r>
+          </w:p>
+        </w:tc>
+      </w:tr>
+      <w:tr>
+        <w:tc>
+          <w:tcPr>
+            <w:tcW w:type="dxa" w:w="1080"/>
+          </w:tcPr>
+          <w:p>
+            <w:r>
+              <w:rPr>
+                <w:sz w:val="16"/>
+              </w:rPr>
+              <w:t>unetpp</w:t>
+            </w:r>
+          </w:p>
+        </w:tc>
+        <w:tc>
+          <w:tcPr>
+            <w:tcW w:type="dxa" w:w="1080"/>
+          </w:tcPr>
+          <w:p>
+            <w:r>
+              <w:rPr>
+                <w:sz w:val="16"/>
+              </w:rPr>
+              <w:t>0.500±0.026 (n3)</w:t>
+            </w:r>
+          </w:p>
+        </w:tc>
+        <w:tc>
+          <w:tcPr>
+            <w:tcW w:type="dxa" w:w="1080"/>
+          </w:tcPr>
+          <w:p>
+            <w:r>
+              <w:rPr>
+                <w:sz w:val="16"/>
+              </w:rPr>
+              <w:t>0.264</w:t>
+            </w:r>
+          </w:p>
+        </w:tc>
+        <w:tc>
+          <w:tcPr>
+            <w:tcW w:type="dxa" w:w="1080"/>
+          </w:tcPr>
+          <w:p>
+            <w:r>
+              <w:rPr>
+                <w:sz w:val="16"/>
+              </w:rPr>
+              <w:t>0.666</w:t>
+            </w:r>
+          </w:p>
+        </w:tc>
+        <w:tc>
+          <w:tcPr>
+            <w:tcW w:type="dxa" w:w="1080"/>
+          </w:tcPr>
+          <w:p>
+            <w:r>
+              <w:rPr>
+                <w:sz w:val="16"/>
+              </w:rPr>
+              <w:t>0.585</w:t>
+            </w:r>
+          </w:p>
+        </w:tc>
+        <w:tc>
+          <w:tcPr>
+            <w:tcW w:type="dxa" w:w="1080"/>
+          </w:tcPr>
+          <w:p>
+            <w:r>
+              <w:rPr>
+                <w:sz w:val="16"/>
+              </w:rPr>
+              <w:t>26.08</w:t>
+            </w:r>
+          </w:p>
+        </w:tc>
+        <w:tc>
+          <w:tcPr>
+            <w:tcW w:type="dxa" w:w="1080"/>
+          </w:tcPr>
+          <w:p>
+            <w:r>
+              <w:rPr>
+                <w:sz w:val="16"/>
+              </w:rPr>
+              <w:t>339.1</w:t>
+            </w:r>
+          </w:p>
+        </w:tc>
+        <w:tc>
+          <w:tcPr>
+            <w:tcW w:type="dxa" w:w="1080"/>
+          </w:tcPr>
+          <w:p>
+            <w:r>
+              <w:rPr>
+                <w:sz w:val="16"/>
+              </w:rPr>
+              <w:t>—</w:t>
+            </w:r>
+          </w:p>
+        </w:tc>
+      </w:tr>
+      <w:tr>
+        <w:tc>
+          <w:tcPr>
+            <w:tcW w:type="dxa" w:w="1080"/>
+          </w:tcPr>
+          <w:p>
+            <w:r>
+              <w:rPr>
+                <w:sz w:val="16"/>
+              </w:rPr>
+              <w:t>mobilenet_unet_lr2e4</w:t>
+            </w:r>
+          </w:p>
+        </w:tc>
+        <w:tc>
+          <w:tcPr>
+            <w:tcW w:type="dxa" w:w="1080"/>
+          </w:tcPr>
+          <w:p>
+            <w:r>
+              <w:rPr>
+                <w:sz w:val="16"/>
+              </w:rPr>
+              <w:t>0.498±0.007 (n3)</w:t>
+            </w:r>
+          </w:p>
+        </w:tc>
+        <w:tc>
+          <w:tcPr>
+            <w:tcW w:type="dxa" w:w="1080"/>
+          </w:tcPr>
+          <w:p>
+            <w:r>
+              <w:rPr>
+                <w:sz w:val="16"/>
+              </w:rPr>
+              <w:t>0.272</w:t>
+            </w:r>
+          </w:p>
+        </w:tc>
+        <w:tc>
+          <w:tcPr>
+            <w:tcW w:type="dxa" w:w="1080"/>
+          </w:tcPr>
+          <w:p>
+            <w:r>
+              <w:rPr>
+                <w:sz w:val="16"/>
+              </w:rPr>
+              <w:t>0.665</w:t>
+            </w:r>
+          </w:p>
+        </w:tc>
+        <w:tc>
+          <w:tcPr>
+            <w:tcW w:type="dxa" w:w="1080"/>
+          </w:tcPr>
+          <w:p>
+            <w:r>
+              <w:rPr>
+                <w:sz w:val="16"/>
+              </w:rPr>
+              <w:t>0.631</w:t>
+            </w:r>
+          </w:p>
+        </w:tc>
+        <w:tc>
+          <w:tcPr>
+            <w:tcW w:type="dxa" w:w="1080"/>
+          </w:tcPr>
+          <w:p>
+            <w:r>
+              <w:rPr>
+                <w:sz w:val="16"/>
+              </w:rPr>
+              <w:t>6.63</w:t>
+            </w:r>
+          </w:p>
+        </w:tc>
+        <w:tc>
+          <w:tcPr>
+            <w:tcW w:type="dxa" w:w="1080"/>
+          </w:tcPr>
+          <w:p>
+            <w:r>
+              <w:rPr>
+                <w:sz w:val="16"/>
+              </w:rPr>
+              <w:t>62.7</w:t>
+            </w:r>
+          </w:p>
+        </w:tc>
+        <w:tc>
+          <w:tcPr>
+            <w:tcW w:type="dxa" w:w="1080"/>
+          </w:tcPr>
+          <w:p>
+            <w:r>
+              <w:rPr>
+                <w:sz w:val="16"/>
+              </w:rPr>
+              <w:t>—</w:t>
+            </w:r>
+          </w:p>
+        </w:tc>
+      </w:tr>
+      <w:tr>
+        <w:tc>
+          <w:tcPr>
+            <w:tcW w:type="dxa" w:w="1080"/>
+          </w:tcPr>
+          <w:p>
+            <w:r>
+              <w:rPr>
+                <w:sz w:val="16"/>
+              </w:rPr>
+              <w:t>mobilenet_int8</w:t>
+            </w:r>
+          </w:p>
+        </w:tc>
+        <w:tc>
+          <w:tcPr>
+            <w:tcW w:type="dxa" w:w="1080"/>
+          </w:tcPr>
+          <w:p>
+            <w:r>
+              <w:rPr>
+                <w:sz w:val="16"/>
+              </w:rPr>
+              <w:t>0.490±0.003 (n3)</w:t>
+            </w:r>
+          </w:p>
+        </w:tc>
+        <w:tc>
+          <w:tcPr>
+            <w:tcW w:type="dxa" w:w="1080"/>
+          </w:tcPr>
+          <w:p>
+            <w:r>
+              <w:rPr>
+                <w:sz w:val="16"/>
+              </w:rPr>
+              <w:t>0.258</w:t>
+            </w:r>
+          </w:p>
+        </w:tc>
+        <w:tc>
+          <w:tcPr>
+            <w:tcW w:type="dxa" w:w="1080"/>
+          </w:tcPr>
+          <w:p>
+            <w:r>
+              <w:rPr>
+                <w:sz w:val="16"/>
+              </w:rPr>
+              <w:t>0.658</w:t>
+            </w:r>
+          </w:p>
+        </w:tc>
+        <w:tc>
+          <w:tcPr>
+            <w:tcW w:type="dxa" w:w="1080"/>
+          </w:tcPr>
+          <w:p>
+            <w:r>
+              <w:rPr>
+                <w:sz w:val="16"/>
+              </w:rPr>
+              <w:t>0.616</w:t>
+            </w:r>
+          </w:p>
+        </w:tc>
+        <w:tc>
+          <w:tcPr>
+            <w:tcW w:type="dxa" w:w="1080"/>
+          </w:tcPr>
+          <w:p>
+            <w:r>
+              <w:rPr>
+                <w:sz w:val="16"/>
+              </w:rPr>
+              <w:t>6.63</w:t>
+            </w:r>
+          </w:p>
+        </w:tc>
+        <w:tc>
+          <w:tcPr>
+            <w:tcW w:type="dxa" w:w="1080"/>
+          </w:tcPr>
+          <w:p>
+            <w:r>
+              <w:rPr>
+                <w:sz w:val="16"/>
+              </w:rPr>
+              <w:t>3.1</w:t>
+            </w:r>
+          </w:p>
+        </w:tc>
+        <w:tc>
+          <w:tcPr>
+            <w:tcW w:type="dxa" w:w="1080"/>
+          </w:tcPr>
+          <w:p>
+            <w:r>
+              <w:rPr>
+                <w:sz w:val="16"/>
+              </w:rPr>
+              <w:t>—</w:t>
+            </w:r>
+          </w:p>
+        </w:tc>
+      </w:tr>
+      <w:tr>
+        <w:tc>
+          <w:tcPr>
+            <w:tcW w:type="dxa" w:w="1080"/>
+          </w:tcPr>
+          <w:p>
+            <w:r>
+              <w:rPr>
+                <w:sz w:val="16"/>
+              </w:rPr>
+              <w:t>mobilenet_unet_lr5e5</w:t>
+            </w:r>
+          </w:p>
+        </w:tc>
+        <w:tc>
+          <w:tcPr>
+            <w:tcW w:type="dxa" w:w="1080"/>
+          </w:tcPr>
+          <w:p>
+            <w:r>
+              <w:rPr>
+                <w:sz w:val="16"/>
+              </w:rPr>
+              <w:t>0.490±0.002 (n3)</w:t>
+            </w:r>
+          </w:p>
+        </w:tc>
+        <w:tc>
+          <w:tcPr>
+            <w:tcW w:type="dxa" w:w="1080"/>
+          </w:tcPr>
+          <w:p>
+            <w:r>
+              <w:rPr>
+                <w:sz w:val="16"/>
+              </w:rPr>
+              <w:t>0.262</w:t>
+            </w:r>
+          </w:p>
+        </w:tc>
+        <w:tc>
+          <w:tcPr>
+            <w:tcW w:type="dxa" w:w="1080"/>
+          </w:tcPr>
+          <w:p>
+            <w:r>
+              <w:rPr>
+                <w:sz w:val="16"/>
+              </w:rPr>
+              <w:t>0.658</w:t>
+            </w:r>
+          </w:p>
+        </w:tc>
+        <w:tc>
+          <w:tcPr>
+            <w:tcW w:type="dxa" w:w="1080"/>
+          </w:tcPr>
+          <w:p>
+            <w:r>
+              <w:rPr>
+                <w:sz w:val="16"/>
+              </w:rPr>
+              <w:t>0.656</w:t>
+            </w:r>
+          </w:p>
+        </w:tc>
+        <w:tc>
+          <w:tcPr>
+            <w:tcW w:type="dxa" w:w="1080"/>
+          </w:tcPr>
+          <w:p>
+            <w:r>
+              <w:rPr>
+                <w:sz w:val="16"/>
+              </w:rPr>
+              <w:t>6.63</w:t>
+            </w:r>
+          </w:p>
+        </w:tc>
+        <w:tc>
+          <w:tcPr>
+            <w:tcW w:type="dxa" w:w="1080"/>
+          </w:tcPr>
+          <w:p>
+            <w:r>
+              <w:rPr>
+                <w:sz w:val="16"/>
+              </w:rPr>
+              <w:t>62.7</w:t>
+            </w:r>
+          </w:p>
+        </w:tc>
+        <w:tc>
+          <w:tcPr>
+            <w:tcW w:type="dxa" w:w="1080"/>
+          </w:tcPr>
+          <w:p>
+            <w:r>
+              <w:rPr>
+                <w:sz w:val="16"/>
+              </w:rPr>
+              <w:t>—</w:t>
+            </w:r>
+          </w:p>
+        </w:tc>
+      </w:tr>
+      <w:tr>
+        <w:tc>
+          <w:tcPr>
+            <w:tcW w:type="dxa" w:w="1080"/>
+          </w:tcPr>
+          <w:p>
+            <w:r>
+              <w:rPr>
+                <w:sz w:val="16"/>
+              </w:rPr>
+              <w:t>unet</w:t>
+            </w:r>
+          </w:p>
+        </w:tc>
+        <w:tc>
+          <w:tcPr>
+            <w:tcW w:type="dxa" w:w="1080"/>
+          </w:tcPr>
+          <w:p>
+            <w:r>
+              <w:rPr>
+                <w:sz w:val="16"/>
+              </w:rPr>
+              <w:t>0.482±0.019 (n3)</w:t>
+            </w:r>
+          </w:p>
+        </w:tc>
+        <w:tc>
+          <w:tcPr>
+            <w:tcW w:type="dxa" w:w="1080"/>
+          </w:tcPr>
+          <w:p>
+            <w:r>
+              <w:rPr>
+                <w:sz w:val="16"/>
+              </w:rPr>
+              <w:t>0.306</w:t>
+            </w:r>
+          </w:p>
+        </w:tc>
+        <w:tc>
+          <w:tcPr>
+            <w:tcW w:type="dxa" w:w="1080"/>
+          </w:tcPr>
+          <w:p>
+            <w:r>
+              <w:rPr>
+                <w:sz w:val="16"/>
+              </w:rPr>
+              <w:t>0.650</w:t>
+            </w:r>
+          </w:p>
+        </w:tc>
+        <w:tc>
+          <w:tcPr>
+            <w:tcW w:type="dxa" w:w="1080"/>
+          </w:tcPr>
+          <w:p>
+            <w:r>
+              <w:rPr>
+                <w:sz w:val="16"/>
+              </w:rPr>
+              <w:t>0.632</w:t>
+            </w:r>
+          </w:p>
+        </w:tc>
+        <w:tc>
+          <w:tcPr>
+            <w:tcW w:type="dxa" w:w="1080"/>
+          </w:tcPr>
+          <w:p>
+            <w:r>
+              <w:rPr>
+                <w:sz w:val="16"/>
+              </w:rPr>
+              <w:t>7.76</w:t>
+            </w:r>
+          </w:p>
+        </w:tc>
+        <w:tc>
+          <w:tcPr>
+            <w:tcW w:type="dxa" w:w="1080"/>
+          </w:tcPr>
+          <w:p>
+            <w:r>
+              <w:rPr>
+                <w:sz w:val="16"/>
+              </w:rPr>
+              <w:t>223.2</w:t>
+            </w:r>
+          </w:p>
+        </w:tc>
+        <w:tc>
+          <w:tcPr>
+            <w:tcW w:type="dxa" w:w="1080"/>
+          </w:tcPr>
+          <w:p>
+            <w:r>
+              <w:rPr>
+                <w:sz w:val="16"/>
+              </w:rPr>
+              <w:t>—</w:t>
+            </w:r>
+          </w:p>
+        </w:tc>
+      </w:tr>
+      <w:tr>
+        <w:tc>
+          <w:tcPr>
+            <w:tcW w:type="dxa" w:w="1080"/>
+          </w:tcPr>
+          <w:p>
+            <w:r>
+              <w:rPr>
+                <w:sz w:val="16"/>
+              </w:rPr>
+              <w:t>mobilenet_unet</w:t>
+            </w:r>
+          </w:p>
+        </w:tc>
+        <w:tc>
+          <w:tcPr>
+            <w:tcW w:type="dxa" w:w="1080"/>
+          </w:tcPr>
+          <w:p>
+            <w:r>
+              <w:rPr>
+                <w:sz w:val="16"/>
+              </w:rPr>
+              <w:t>0.480±0.017 (n3)</w:t>
+            </w:r>
+          </w:p>
+        </w:tc>
+        <w:tc>
+          <w:tcPr>
+            <w:tcW w:type="dxa" w:w="1080"/>
+          </w:tcPr>
+          <w:p>
+            <w:r>
+              <w:rPr>
+                <w:sz w:val="16"/>
+              </w:rPr>
+              <w:t>0.250</w:t>
+            </w:r>
+          </w:p>
+        </w:tc>
+        <w:tc>
+          <w:tcPr>
+            <w:tcW w:type="dxa" w:w="1080"/>
+          </w:tcPr>
+          <w:p>
+            <w:r>
+              <w:rPr>
+                <w:sz w:val="16"/>
+              </w:rPr>
+              <w:t>0.649</w:t>
+            </w:r>
+          </w:p>
+        </w:tc>
+        <w:tc>
+          <w:tcPr>
+            <w:tcW w:type="dxa" w:w="1080"/>
+          </w:tcPr>
+          <w:p>
+            <w:r>
+              <w:rPr>
+                <w:sz w:val="16"/>
+              </w:rPr>
+              <w:t>0.634</w:t>
+            </w:r>
+          </w:p>
+        </w:tc>
+        <w:tc>
+          <w:tcPr>
+            <w:tcW w:type="dxa" w:w="1080"/>
+          </w:tcPr>
+          <w:p>
+            <w:r>
+              <w:rPr>
+                <w:sz w:val="16"/>
+              </w:rPr>
+              <w:t>6.63</w:t>
+            </w:r>
+          </w:p>
+        </w:tc>
+        <w:tc>
+          <w:tcPr>
+            <w:tcW w:type="dxa" w:w="1080"/>
+          </w:tcPr>
+          <w:p>
+            <w:r>
+              <w:rPr>
+                <w:sz w:val="16"/>
+              </w:rPr>
+              <w:t>62.7</w:t>
+            </w:r>
+          </w:p>
+        </w:tc>
+        <w:tc>
+          <w:tcPr>
+            <w:tcW w:type="dxa" w:w="1080"/>
+          </w:tcPr>
+          <w:p>
+            <w:r>
+              <w:rPr>
+                <w:sz w:val="16"/>
+              </w:rPr>
+              <w:t>—</w:t>
+            </w:r>
+          </w:p>
+        </w:tc>
+      </w:tr>
+      <w:tr>
+        <w:tc>
+          <w:tcPr>
+            <w:tcW w:type="dxa" w:w="1080"/>
+          </w:tcPr>
+          <w:p>
+            <w:r>
+              <w:rPr>
+                <w:sz w:val="16"/>
+              </w:rPr>
+              <w:t>deeplabv3</w:t>
+            </w:r>
+          </w:p>
+        </w:tc>
+        <w:tc>
+          <w:tcPr>
+            <w:tcW w:type="dxa" w:w="1080"/>
+          </w:tcPr>
+          <w:p>
+            <w:r>
+              <w:rPr>
+                <w:sz w:val="16"/>
+              </w:rPr>
+              <w:t>0.419±0.014 (n3)</w:t>
+            </w:r>
+          </w:p>
+        </w:tc>
+        <w:tc>
+          <w:tcPr>
+            <w:tcW w:type="dxa" w:w="1080"/>
+          </w:tcPr>
+          <w:p>
+            <w:r>
+              <w:rPr>
+                <w:sz w:val="16"/>
+              </w:rPr>
+              <w:t>0.127</w:t>
+            </w:r>
+          </w:p>
+        </w:tc>
+        <w:tc>
+          <w:tcPr>
+            <w:tcW w:type="dxa" w:w="1080"/>
+          </w:tcPr>
+          <w:p>
+            <w:r>
+              <w:rPr>
+                <w:sz w:val="16"/>
+              </w:rPr>
+              <w:t>0.590</w:t>
+            </w:r>
+          </w:p>
+        </w:tc>
+        <w:tc>
+          <w:tcPr>
+            <w:tcW w:type="dxa" w:w="1080"/>
+          </w:tcPr>
+          <w:p>
+            <w:r>
+              <w:rPr>
+                <w:sz w:val="16"/>
+              </w:rPr>
+              <w:t>0.496</w:t>
+            </w:r>
+          </w:p>
+        </w:tc>
+        <w:tc>
+          <w:tcPr>
+            <w:tcW w:type="dxa" w:w="1080"/>
+          </w:tcPr>
+          <w:p>
+            <w:r>
+              <w:rPr>
+                <w:sz w:val="16"/>
+              </w:rPr>
+              <w:t>26.00</w:t>
+            </w:r>
+          </w:p>
+        </w:tc>
+        <w:tc>
+          <w:tcPr>
+            <w:tcW w:type="dxa" w:w="1080"/>
+          </w:tcPr>
+          <w:p>
+            <w:r>
+              <w:rPr>
+                <w:sz w:val="16"/>
+              </w:rPr>
+              <w:t>502.3</w:t>
+            </w:r>
+          </w:p>
+        </w:tc>
+        <w:tc>
+          <w:tcPr>
+            <w:tcW w:type="dxa" w:w="1080"/>
+          </w:tcPr>
+          <w:p>
+            <w:r>
+              <w:rPr>
+                <w:sz w:val="16"/>
+              </w:rPr>
+              <w:t>—</w:t>
+            </w:r>
+          </w:p>
+        </w:tc>
+      </w:tr>
+      <w:tr>
+        <w:tc>
+          <w:tcPr>
+            <w:tcW w:type="dxa" w:w="1080"/>
+          </w:tcPr>
+          <w:p>
+            <w:r>
+              <w:rPr>
+                <w:sz w:val="16"/>
+              </w:rPr>
+              <w:t>spiking_unet_T2</w:t>
+            </w:r>
+          </w:p>
+        </w:tc>
+        <w:tc>
+          <w:tcPr>
+            <w:tcW w:type="dxa" w:w="1080"/>
+          </w:tcPr>
+          <w:p>
+            <w:r>
+              <w:rPr>
+                <w:sz w:val="16"/>
+              </w:rPr>
+              <w:t>0.391±0.045 (n3)</w:t>
+            </w:r>
+          </w:p>
+        </w:tc>
+        <w:tc>
+          <w:tcPr>
+            <w:tcW w:type="dxa" w:w="1080"/>
+          </w:tcPr>
+          <w:p>
+            <w:r>
+              <w:rPr>
+                <w:sz w:val="16"/>
+              </w:rPr>
+              <w:t>0.240</w:t>
+            </w:r>
+          </w:p>
+        </w:tc>
+        <w:tc>
+          <w:tcPr>
+            <w:tcW w:type="dxa" w:w="1080"/>
+          </w:tcPr>
+          <w:p>
+            <w:r>
+              <w:rPr>
+                <w:sz w:val="16"/>
+              </w:rPr>
+              <w:t>0.561</w:t>
+            </w:r>
+          </w:p>
+        </w:tc>
+        <w:tc>
+          <w:tcPr>
+            <w:tcW w:type="dxa" w:w="1080"/>
+          </w:tcPr>
+          <w:p>
+            <w:r>
+              <w:rPr>
+                <w:sz w:val="16"/>
+              </w:rPr>
+              <w:t>0.508</w:t>
+            </w:r>
+          </w:p>
+        </w:tc>
+        <w:tc>
+          <w:tcPr>
+            <w:tcW w:type="dxa" w:w="1080"/>
+          </w:tcPr>
+          <w:p>
+            <w:r>
+              <w:rPr>
+                <w:sz w:val="16"/>
+              </w:rPr>
+              <w:t>7.76</w:t>
+            </w:r>
+          </w:p>
+        </w:tc>
+        <w:tc>
+          <w:tcPr>
+            <w:tcW w:type="dxa" w:w="1080"/>
+          </w:tcPr>
+          <w:p>
+            <w:r>
+              <w:rPr>
+                <w:sz w:val="16"/>
+              </w:rPr>
+              <w:t>31.4</w:t>
+            </w:r>
+          </w:p>
+        </w:tc>
+        <w:tc>
+          <w:tcPr>
+            <w:tcW w:type="dxa" w:w="1080"/>
+          </w:tcPr>
+          <w:p>
+            <w:r>
+              <w:rPr>
+                <w:sz w:val="16"/>
+              </w:rPr>
+              <w:t>13.6</w:t>
+            </w:r>
+          </w:p>
+        </w:tc>
+      </w:tr>
+      <w:tr>
+        <w:tc>
+          <w:tcPr>
+            <w:tcW w:type="dxa" w:w="1080"/>
+          </w:tcPr>
+          <w:p>
+            <w:r>
+              <w:rPr>
+                <w:sz w:val="16"/>
+              </w:rPr>
+              <w:t>spiking_unet_T8</w:t>
+            </w:r>
+          </w:p>
+        </w:tc>
+        <w:tc>
+          <w:tcPr>
+            <w:tcW w:type="dxa" w:w="1080"/>
+          </w:tcPr>
+          <w:p>
+            <w:r>
+              <w:rPr>
+                <w:sz w:val="16"/>
+              </w:rPr>
+              <w:t>0.388±0.030 (n3)</w:t>
+            </w:r>
+          </w:p>
+        </w:tc>
+        <w:tc>
+          <w:tcPr>
+            <w:tcW w:type="dxa" w:w="1080"/>
+          </w:tcPr>
+          <w:p>
+            <w:r>
+              <w:rPr>
+                <w:sz w:val="16"/>
+              </w:rPr>
+              <w:t>0.246</w:t>
+            </w:r>
+          </w:p>
+        </w:tc>
+        <w:tc>
+          <w:tcPr>
+            <w:tcW w:type="dxa" w:w="1080"/>
+          </w:tcPr>
+          <w:p>
+            <w:r>
+              <w:rPr>
+                <w:sz w:val="16"/>
+              </w:rPr>
+              <w:t>0.558</w:t>
+            </w:r>
+          </w:p>
+        </w:tc>
+        <w:tc>
+          <w:tcPr>
+            <w:tcW w:type="dxa" w:w="1080"/>
+          </w:tcPr>
+          <w:p>
+            <w:r>
+              <w:rPr>
+                <w:sz w:val="16"/>
+              </w:rPr>
+              <w:t>0.368</w:t>
+            </w:r>
+          </w:p>
+        </w:tc>
+        <w:tc>
+          <w:tcPr>
+            <w:tcW w:type="dxa" w:w="1080"/>
+          </w:tcPr>
+          <w:p>
+            <w:r>
+              <w:rPr>
+                <w:sz w:val="16"/>
+              </w:rPr>
+              <w:t>7.76</w:t>
+            </w:r>
+          </w:p>
+        </w:tc>
+        <w:tc>
+          <w:tcPr>
+            <w:tcW w:type="dxa" w:w="1080"/>
+          </w:tcPr>
+          <w:p>
+            <w:r>
+              <w:rPr>
+                <w:sz w:val="16"/>
+              </w:rPr>
+              <w:t>166.8</w:t>
+            </w:r>
+          </w:p>
+        </w:tc>
+        <w:tc>
+          <w:tcPr>
+            <w:tcW w:type="dxa" w:w="1080"/>
+          </w:tcPr>
+          <w:p>
+            <w:r>
+              <w:rPr>
+                <w:sz w:val="16"/>
+              </w:rPr>
+              <w:t>23.8</w:t>
+            </w:r>
+          </w:p>
+        </w:tc>
+      </w:tr>
+      <w:tr>
+        <w:tc>
+          <w:tcPr>
+            <w:tcW w:type="dxa" w:w="1080"/>
+          </w:tcPr>
+          <w:p>
+            <w:r>
+              <w:rPr>
+                <w:sz w:val="16"/>
+              </w:rPr>
+              <w:t>spiking_unet_T2_lr2e4</w:t>
+            </w:r>
+          </w:p>
+        </w:tc>
+        <w:tc>
+          <w:tcPr>
+            <w:tcW w:type="dxa" w:w="1080"/>
+          </w:tcPr>
+          <w:p>
+            <w:r>
+              <w:rPr>
+                <w:sz w:val="16"/>
+              </w:rPr>
+              <w:t>0.370±0.034 (n3)</w:t>
+            </w:r>
+          </w:p>
+        </w:tc>
+        <w:tc>
+          <w:tcPr>
+            <w:tcW w:type="dxa" w:w="1080"/>
+          </w:tcPr>
+          <w:p>
+            <w:r>
+              <w:rPr>
+                <w:sz w:val="16"/>
+              </w:rPr>
+              <w:t>0.245</w:t>
+            </w:r>
+          </w:p>
+        </w:tc>
+        <w:tc>
+          <w:tcPr>
+            <w:tcW w:type="dxa" w:w="1080"/>
+          </w:tcPr>
+          <w:p>
+            <w:r>
+              <w:rPr>
+                <w:sz w:val="16"/>
+              </w:rPr>
+              <w:t>0.539</w:t>
+            </w:r>
+          </w:p>
+        </w:tc>
+        <w:tc>
+          <w:tcPr>
+            <w:tcW w:type="dxa" w:w="1080"/>
+          </w:tcPr>
+          <w:p>
+            <w:r>
+              <w:rPr>
+                <w:sz w:val="16"/>
+              </w:rPr>
+              <w:t>0.315</w:t>
+            </w:r>
+          </w:p>
+        </w:tc>
+        <w:tc>
+          <w:tcPr>
+            <w:tcW w:type="dxa" w:w="1080"/>
+          </w:tcPr>
+          <w:p>
+            <w:r>
+              <w:rPr>
+                <w:sz w:val="16"/>
+              </w:rPr>
+              <w:t>7.76</w:t>
+            </w:r>
+          </w:p>
+        </w:tc>
+        <w:tc>
+          <w:tcPr>
+            <w:tcW w:type="dxa" w:w="1080"/>
+          </w:tcPr>
+          <w:p>
+            <w:r>
+              <w:rPr>
+                <w:sz w:val="16"/>
+              </w:rPr>
+              <w:t>26.6</w:t>
+            </w:r>
+          </w:p>
+        </w:tc>
+        <w:tc>
+          <w:tcPr>
+            <w:tcW w:type="dxa" w:w="1080"/>
+          </w:tcPr>
+          <w:p>
+            <w:r>
+              <w:rPr>
+                <w:sz w:val="16"/>
+              </w:rPr>
+              <w:t>12.7</w:t>
+            </w:r>
+          </w:p>
+        </w:tc>
+      </w:tr>
+      <w:tr>
+        <w:tc>
+          <w:tcPr>
+            <w:tcW w:type="dxa" w:w="1080"/>
+          </w:tcPr>
+          <w:p>
+            <w:r>
+              <w:rPr>
+                <w:sz w:val="16"/>
+              </w:rPr>
+              <w:t>spiking_unet_T7</w:t>
+            </w:r>
+          </w:p>
+        </w:tc>
+        <w:tc>
+          <w:tcPr>
+            <w:tcW w:type="dxa" w:w="1080"/>
+          </w:tcPr>
+          <w:p>
+            <w:r>
+              <w:rPr>
+                <w:sz w:val="16"/>
+              </w:rPr>
+              <w:t>0.365±0.022 (n3)</w:t>
+            </w:r>
+          </w:p>
+        </w:tc>
+        <w:tc>
+          <w:tcPr>
+            <w:tcW w:type="dxa" w:w="1080"/>
+          </w:tcPr>
+          <w:p>
+            <w:r>
+              <w:rPr>
+                <w:sz w:val="16"/>
+              </w:rPr>
+              <w:t>0.251</w:t>
+            </w:r>
+          </w:p>
+        </w:tc>
+        <w:tc>
+          <w:tcPr>
+            <w:tcW w:type="dxa" w:w="1080"/>
+          </w:tcPr>
+          <w:p>
+            <w:r>
+              <w:rPr>
+                <w:sz w:val="16"/>
+              </w:rPr>
+              <w:t>0.534</w:t>
+            </w:r>
+          </w:p>
+        </w:tc>
+        <w:tc>
+          <w:tcPr>
+            <w:tcW w:type="dxa" w:w="1080"/>
+          </w:tcPr>
+          <w:p>
+            <w:r>
+              <w:rPr>
+                <w:sz w:val="16"/>
+              </w:rPr>
+              <w:t>0.533</w:t>
+            </w:r>
+          </w:p>
+        </w:tc>
+        <w:tc>
+          <w:tcPr>
+            <w:tcW w:type="dxa" w:w="1080"/>
+          </w:tcPr>
+          <w:p>
+            <w:r>
+              <w:rPr>
+                <w:sz w:val="16"/>
+              </w:rPr>
+              <w:t>7.76</w:t>
+            </w:r>
+          </w:p>
+        </w:tc>
+        <w:tc>
+          <w:tcPr>
+            <w:tcW w:type="dxa" w:w="1080"/>
+          </w:tcPr>
+          <w:p>
+            <w:r>
+              <w:rPr>
+                <w:sz w:val="16"/>
+              </w:rPr>
+              <w:t>115.0</w:t>
+            </w:r>
+          </w:p>
+        </w:tc>
+        <w:tc>
+          <w:tcPr>
+            <w:tcW w:type="dxa" w:w="1080"/>
+          </w:tcPr>
+          <w:p>
+            <w:r>
+              <w:rPr>
+                <w:sz w:val="16"/>
+              </w:rPr>
+              <w:t>23.9</w:t>
+            </w:r>
+          </w:p>
+        </w:tc>
+      </w:tr>
+      <w:tr>
+        <w:tc>
+          <w:tcPr>
+            <w:tcW w:type="dxa" w:w="1080"/>
+          </w:tcPr>
+          <w:p>
+            <w:r>
+              <w:rPr>
+                <w:sz w:val="16"/>
+              </w:rPr>
+              <w:t>spiking_unet_T5</w:t>
+            </w:r>
+          </w:p>
+        </w:tc>
+        <w:tc>
+          <w:tcPr>
+            <w:tcW w:type="dxa" w:w="1080"/>
+          </w:tcPr>
+          <w:p>
+            <w:r>
+              <w:rPr>
+                <w:sz w:val="16"/>
+              </w:rPr>
+              <w:t>0.361±0.019 (n3)</w:t>
+            </w:r>
+          </w:p>
+        </w:tc>
+        <w:tc>
+          <w:tcPr>
+            <w:tcW w:type="dxa" w:w="1080"/>
+          </w:tcPr>
+          <w:p>
+            <w:r>
+              <w:rPr>
+                <w:sz w:val="16"/>
+              </w:rPr>
+              <w:t>0.261</w:t>
+            </w:r>
+          </w:p>
+        </w:tc>
+        <w:tc>
+          <w:tcPr>
+            <w:tcW w:type="dxa" w:w="1080"/>
+          </w:tcPr>
+          <w:p>
+            <w:r>
+              <w:rPr>
+                <w:sz w:val="16"/>
+              </w:rPr>
+              <w:t>0.530</w:t>
+            </w:r>
+          </w:p>
+        </w:tc>
+        <w:tc>
+          <w:tcPr>
+            <w:tcW w:type="dxa" w:w="1080"/>
+          </w:tcPr>
+          <w:p>
+            <w:r>
+              <w:rPr>
+                <w:sz w:val="16"/>
+              </w:rPr>
+              <w:t>0.495</w:t>
+            </w:r>
+          </w:p>
+        </w:tc>
+        <w:tc>
+          <w:tcPr>
+            <w:tcW w:type="dxa" w:w="1080"/>
+          </w:tcPr>
+          <w:p>
+            <w:r>
+              <w:rPr>
+                <w:sz w:val="16"/>
+              </w:rPr>
+              <w:t>7.76</w:t>
+            </w:r>
+          </w:p>
+        </w:tc>
+        <w:tc>
+          <w:tcPr>
+            <w:tcW w:type="dxa" w:w="1080"/>
+          </w:tcPr>
+          <w:p>
+            <w:r>
+              <w:rPr>
+                <w:sz w:val="16"/>
+              </w:rPr>
+              <w:t>79.4</w:t>
+            </w:r>
+          </w:p>
+        </w:tc>
+        <w:tc>
+          <w:tcPr>
+            <w:tcW w:type="dxa" w:w="1080"/>
+          </w:tcPr>
+          <w:p>
+            <w:r>
+              <w:rPr>
+                <w:sz w:val="16"/>
+              </w:rPr>
+              <w:t>19.3</w:t>
+            </w:r>
+          </w:p>
+        </w:tc>
+      </w:tr>
+      <w:tr>
+        <w:tc>
+          <w:tcPr>
+            <w:tcW w:type="dxa" w:w="1080"/>
+          </w:tcPr>
+          <w:p>
+            <w:r>
+              <w:rPr>
+                <w:sz w:val="16"/>
+              </w:rPr>
+              <w:t>spiking_unet_T8_lr2e4</w:t>
+            </w:r>
+          </w:p>
+        </w:tc>
+        <w:tc>
+          <w:tcPr>
+            <w:tcW w:type="dxa" w:w="1080"/>
+          </w:tcPr>
+          <w:p>
+            <w:r>
+              <w:rPr>
+                <w:sz w:val="16"/>
+              </w:rPr>
+              <w:t>0.355±0.018 (n3)</w:t>
+            </w:r>
+          </w:p>
+        </w:tc>
+        <w:tc>
+          <w:tcPr>
+            <w:tcW w:type="dxa" w:w="1080"/>
+          </w:tcPr>
+          <w:p>
+            <w:r>
+              <w:rPr>
+                <w:sz w:val="16"/>
+              </w:rPr>
+              <w:t>0.250</w:t>
+            </w:r>
+          </w:p>
+        </w:tc>
+        <w:tc>
+          <w:tcPr>
+            <w:tcW w:type="dxa" w:w="1080"/>
+          </w:tcPr>
+          <w:p>
+            <w:r>
+              <w:rPr>
+                <w:sz w:val="16"/>
+              </w:rPr>
+              <w:t>0.524</w:t>
+            </w:r>
+          </w:p>
+        </w:tc>
+        <w:tc>
+          <w:tcPr>
+            <w:tcW w:type="dxa" w:w="1080"/>
+          </w:tcPr>
+          <w:p>
+            <w:r>
+              <w:rPr>
+                <w:sz w:val="16"/>
+              </w:rPr>
+              <w:t>0.356</w:t>
+            </w:r>
+          </w:p>
+        </w:tc>
+        <w:tc>
+          <w:tcPr>
+            <w:tcW w:type="dxa" w:w="1080"/>
+          </w:tcPr>
+          <w:p>
+            <w:r>
+              <w:rPr>
+                <w:sz w:val="16"/>
+              </w:rPr>
+              <w:t>7.76</w:t>
+            </w:r>
+          </w:p>
+        </w:tc>
+        <w:tc>
+          <w:tcPr>
+            <w:tcW w:type="dxa" w:w="1080"/>
+          </w:tcPr>
+          <w:p>
+            <w:r>
+              <w:rPr>
+                <w:sz w:val="16"/>
+              </w:rPr>
+              <w:t>178.7</w:t>
+            </w:r>
+          </w:p>
+        </w:tc>
+        <w:tc>
+          <w:tcPr>
+            <w:tcW w:type="dxa" w:w="1080"/>
+          </w:tcPr>
+          <w:p>
+            <w:r>
+              <w:rPr>
+                <w:sz w:val="16"/>
+              </w:rPr>
+              <w:t>26.8</w:t>
+            </w:r>
+          </w:p>
+        </w:tc>
+      </w:tr>
+      <w:tr>
+        <w:tc>
+          <w:tcPr>
+            <w:tcW w:type="dxa" w:w="1080"/>
+          </w:tcPr>
+          <w:p>
+            <w:r>
+              <w:rPr>
+                <w:sz w:val="16"/>
+              </w:rPr>
+              <w:t>spiking_unet_T6</w:t>
+            </w:r>
+          </w:p>
+        </w:tc>
+        <w:tc>
+          <w:tcPr>
+            <w:tcW w:type="dxa" w:w="1080"/>
+          </w:tcPr>
+          <w:p>
+            <w:r>
+              <w:rPr>
+                <w:sz w:val="16"/>
+              </w:rPr>
+              <w:t>0.355±0.022 (n5)</w:t>
+            </w:r>
+          </w:p>
+        </w:tc>
+        <w:tc>
+          <w:tcPr>
+            <w:tcW w:type="dxa" w:w="1080"/>
+          </w:tcPr>
+          <w:p>
+            <w:r>
+              <w:rPr>
+                <w:sz w:val="16"/>
+              </w:rPr>
+              <w:t>0.246</w:t>
+            </w:r>
+          </w:p>
+        </w:tc>
+        <w:tc>
+          <w:tcPr>
+            <w:tcW w:type="dxa" w:w="1080"/>
+          </w:tcPr>
+          <w:p>
+            <w:r>
+              <w:rPr>
+                <w:sz w:val="16"/>
+              </w:rPr>
+              <w:t>0.523</w:t>
+            </w:r>
+          </w:p>
+        </w:tc>
+        <w:tc>
+          <w:tcPr>
+            <w:tcW w:type="dxa" w:w="1080"/>
+          </w:tcPr>
+          <w:p>
+            <w:r>
+              <w:rPr>
+                <w:sz w:val="16"/>
+              </w:rPr>
+              <w:t>0.518</w:t>
+            </w:r>
+          </w:p>
+        </w:tc>
+        <w:tc>
+          <w:tcPr>
+            <w:tcW w:type="dxa" w:w="1080"/>
+          </w:tcPr>
+          <w:p>
+            <w:r>
+              <w:rPr>
+                <w:sz w:val="16"/>
+              </w:rPr>
+              <w:t>7.76</w:t>
+            </w:r>
+          </w:p>
+        </w:tc>
+        <w:tc>
+          <w:tcPr>
+            <w:tcW w:type="dxa" w:w="1080"/>
+          </w:tcPr>
+          <w:p>
+            <w:r>
+              <w:rPr>
+                <w:sz w:val="16"/>
+              </w:rPr>
+              <w:t>93.6</w:t>
+            </w:r>
+          </w:p>
+        </w:tc>
+        <w:tc>
+          <w:tcPr>
+            <w:tcW w:type="dxa" w:w="1080"/>
+          </w:tcPr>
+          <w:p>
+            <w:r>
+              <w:rPr>
+                <w:sz w:val="16"/>
+              </w:rPr>
+              <w:t>16.5</w:t>
+            </w:r>
+          </w:p>
+        </w:tc>
+      </w:tr>
+      <w:tr>
+        <w:tc>
+          <w:tcPr>
+            <w:tcW w:type="dxa" w:w="1080"/>
+          </w:tcPr>
+          <w:p>
+            <w:r>
+              <w:rPr>
+                <w:sz w:val="16"/>
+              </w:rPr>
+              <w:t>spiking_unet_T4</w:t>
+            </w:r>
+          </w:p>
+        </w:tc>
+        <w:tc>
+          <w:tcPr>
+            <w:tcW w:type="dxa" w:w="1080"/>
+          </w:tcPr>
+          <w:p>
+            <w:r>
+              <w:rPr>
+                <w:sz w:val="16"/>
+              </w:rPr>
+              <w:t>0.339±0.023 (n3)</w:t>
+            </w:r>
+          </w:p>
+        </w:tc>
+        <w:tc>
+          <w:tcPr>
+            <w:tcW w:type="dxa" w:w="1080"/>
+          </w:tcPr>
+          <w:p>
+            <w:r>
+              <w:rPr>
+                <w:sz w:val="16"/>
+              </w:rPr>
+              <w:t>0.241</w:t>
+            </w:r>
+          </w:p>
+        </w:tc>
+        <w:tc>
+          <w:tcPr>
+            <w:tcW w:type="dxa" w:w="1080"/>
+          </w:tcPr>
+          <w:p>
+            <w:r>
+              <w:rPr>
+                <w:sz w:val="16"/>
+              </w:rPr>
+              <w:t>0.506</w:t>
+            </w:r>
+          </w:p>
+        </w:tc>
+        <w:tc>
+          <w:tcPr>
+            <w:tcW w:type="dxa" w:w="1080"/>
+          </w:tcPr>
+          <w:p>
+            <w:r>
+              <w:rPr>
+                <w:sz w:val="16"/>
+              </w:rPr>
+              <w:t>0.479</w:t>
+            </w:r>
+          </w:p>
+        </w:tc>
+        <w:tc>
+          <w:tcPr>
+            <w:tcW w:type="dxa" w:w="1080"/>
+          </w:tcPr>
+          <w:p>
+            <w:r>
+              <w:rPr>
+                <w:sz w:val="16"/>
+              </w:rPr>
+              <w:t>7.76</w:t>
+            </w:r>
+          </w:p>
+        </w:tc>
+        <w:tc>
+          <w:tcPr>
+            <w:tcW w:type="dxa" w:w="1080"/>
+          </w:tcPr>
+          <w:p>
+            <w:r>
+              <w:rPr>
+                <w:sz w:val="16"/>
+              </w:rPr>
+              <w:t>64.7</w:t>
+            </w:r>
+          </w:p>
+        </w:tc>
+        <w:tc>
+          <w:tcPr>
+            <w:tcW w:type="dxa" w:w="1080"/>
+          </w:tcPr>
+          <w:p>
+            <w:r>
+              <w:rPr>
+                <w:sz w:val="16"/>
+              </w:rPr>
+              <w:t>15.7</w:t>
+            </w:r>
+          </w:p>
+        </w:tc>
+      </w:tr>
+      <w:tr>
+        <w:tc>
+          <w:tcPr>
+            <w:tcW w:type="dxa" w:w="1080"/>
+          </w:tcPr>
+          <w:p>
+            <w:r>
+              <w:rPr>
+                <w:sz w:val="16"/>
+              </w:rPr>
+              <w:t>spiking_unet_T3</w:t>
+            </w:r>
+          </w:p>
+        </w:tc>
+        <w:tc>
+          <w:tcPr>
+            <w:tcW w:type="dxa" w:w="1080"/>
+          </w:tcPr>
+          <w:p>
+            <w:r>
+              <w:rPr>
+                <w:sz w:val="16"/>
+              </w:rPr>
+              <w:t>0.333±0.009 (n3)</w:t>
+            </w:r>
+          </w:p>
+        </w:tc>
+        <w:tc>
+          <w:tcPr>
+            <w:tcW w:type="dxa" w:w="1080"/>
+          </w:tcPr>
+          <w:p>
+            <w:r>
+              <w:rPr>
+                <w:sz w:val="16"/>
+              </w:rPr>
+              <w:t>0.229</w:t>
+            </w:r>
+          </w:p>
+        </w:tc>
+        <w:tc>
+          <w:tcPr>
+            <w:tcW w:type="dxa" w:w="1080"/>
+          </w:tcPr>
+          <w:p>
+            <w:r>
+              <w:rPr>
+                <w:sz w:val="16"/>
+              </w:rPr>
+              <w:t>0.500</w:t>
+            </w:r>
+          </w:p>
+        </w:tc>
+        <w:tc>
+          <w:tcPr>
+            <w:tcW w:type="dxa" w:w="1080"/>
+          </w:tcPr>
+          <w:p>
+            <w:r>
+              <w:rPr>
+                <w:sz w:val="16"/>
+              </w:rPr>
+              <w:t>0.352</w:t>
+            </w:r>
+          </w:p>
+        </w:tc>
+        <w:tc>
+          <w:tcPr>
+            <w:tcW w:type="dxa" w:w="1080"/>
+          </w:tcPr>
+          <w:p>
+            <w:r>
+              <w:rPr>
+                <w:sz w:val="16"/>
+              </w:rPr>
+              <w:t>7.76</w:t>
+            </w:r>
+          </w:p>
+        </w:tc>
+        <w:tc>
+          <w:tcPr>
+            <w:tcW w:type="dxa" w:w="1080"/>
+          </w:tcPr>
+          <w:p>
+            <w:r>
+              <w:rPr>
+                <w:sz w:val="16"/>
+              </w:rPr>
+              <w:t>45.2</w:t>
+            </w:r>
+          </w:p>
+        </w:tc>
+        <w:tc>
+          <w:tcPr>
+            <w:tcW w:type="dxa" w:w="1080"/>
+          </w:tcPr>
+          <w:p>
+            <w:r>
+              <w:rPr>
+                <w:sz w:val="16"/>
+              </w:rPr>
+              <w:t>17.8</w:t>
+            </w:r>
+          </w:p>
+        </w:tc>
+      </w:tr>
+      <w:tr>
+        <w:tc>
+          <w:tcPr>
+            <w:tcW w:type="dxa" w:w="1080"/>
+          </w:tcPr>
+          <w:p>
+            <w:r>
+              <w:rPr>
+                <w:sz w:val="16"/>
+              </w:rPr>
+              <w:t>spiking_unet_lr2e4</w:t>
+            </w:r>
+          </w:p>
+        </w:tc>
+        <w:tc>
+          <w:tcPr>
+            <w:tcW w:type="dxa" w:w="1080"/>
+          </w:tcPr>
+          <w:p>
+            <w:r>
+              <w:rPr>
+                <w:sz w:val="16"/>
+              </w:rPr>
+              <w:t>0.328±0.026 (n3)</w:t>
+            </w:r>
+          </w:p>
+        </w:tc>
+        <w:tc>
+          <w:tcPr>
+            <w:tcW w:type="dxa" w:w="1080"/>
+          </w:tcPr>
+          <w:p>
+            <w:r>
+              <w:rPr>
+                <w:sz w:val="16"/>
+              </w:rPr>
+              <w:t>0.225</w:t>
+            </w:r>
+          </w:p>
+        </w:tc>
+        <w:tc>
+          <w:tcPr>
+            <w:tcW w:type="dxa" w:w="1080"/>
+          </w:tcPr>
+          <w:p>
+            <w:r>
+              <w:rPr>
+                <w:sz w:val="16"/>
+              </w:rPr>
+              <w:t>0.494</w:t>
+            </w:r>
+          </w:p>
+        </w:tc>
+        <w:tc>
+          <w:tcPr>
+            <w:tcW w:type="dxa" w:w="1080"/>
+          </w:tcPr>
+          <w:p>
+            <w:r>
+              <w:rPr>
+                <w:sz w:val="16"/>
+              </w:rPr>
+              <w:t>0.325</w:t>
+            </w:r>
+          </w:p>
+        </w:tc>
+        <w:tc>
+          <w:tcPr>
+            <w:tcW w:type="dxa" w:w="1080"/>
+          </w:tcPr>
+          <w:p>
+            <w:r>
+              <w:rPr>
+                <w:sz w:val="16"/>
+              </w:rPr>
+              <w:t>7.76</w:t>
+            </w:r>
+          </w:p>
+        </w:tc>
+        <w:tc>
+          <w:tcPr>
+            <w:tcW w:type="dxa" w:w="1080"/>
+          </w:tcPr>
+          <w:p>
+            <w:r>
+              <w:rPr>
+                <w:sz w:val="16"/>
+              </w:rPr>
+              <w:t>62.9</w:t>
+            </w:r>
+          </w:p>
+        </w:tc>
+        <w:tc>
+          <w:tcPr>
+            <w:tcW w:type="dxa" w:w="1080"/>
+          </w:tcPr>
+          <w:p>
+            <w:r>
+              <w:rPr>
+                <w:sz w:val="16"/>
+              </w:rPr>
+              <w:t>18.5</w:t>
+            </w:r>
+          </w:p>
+        </w:tc>
+      </w:tr>
+      <w:tr>
+        <w:tc>
+          <w:tcPr>
+            <w:tcW w:type="dxa" w:w="1080"/>
+          </w:tcPr>
+          <w:p>
+            <w:r>
+              <w:rPr>
+                <w:sz w:val="16"/>
+              </w:rPr>
+              <w:t>ann2snn_T128</w:t>
+            </w:r>
+          </w:p>
+        </w:tc>
+        <w:tc>
+          <w:tcPr>
+            <w:tcW w:type="dxa" w:w="1080"/>
+          </w:tcPr>
+          <w:p>
+            <w:r>
+              <w:rPr>
+                <w:sz w:val="16"/>
+              </w:rPr>
+              <w:t>0.294±0.063 (n3)</w:t>
+            </w:r>
+          </w:p>
+        </w:tc>
+        <w:tc>
+          <w:tcPr>
+            <w:tcW w:type="dxa" w:w="1080"/>
+          </w:tcPr>
+          <w:p>
+            <w:r>
+              <w:rPr>
+                <w:sz w:val="16"/>
+              </w:rPr>
+              <w:t>0.196</w:t>
+            </w:r>
+          </w:p>
+        </w:tc>
+        <w:tc>
+          <w:tcPr>
+            <w:tcW w:type="dxa" w:w="1080"/>
+          </w:tcPr>
+          <w:p>
+            <w:r>
+              <w:rPr>
+                <w:sz w:val="16"/>
+              </w:rPr>
+              <w:t>0.450</w:t>
+            </w:r>
+          </w:p>
+        </w:tc>
+        <w:tc>
+          <w:tcPr>
+            <w:tcW w:type="dxa" w:w="1080"/>
+          </w:tcPr>
+          <w:p>
+            <w:r>
+              <w:rPr>
+                <w:sz w:val="16"/>
+              </w:rPr>
+              <w:t>0.447</w:t>
+            </w:r>
+          </w:p>
+        </w:tc>
+        <w:tc>
+          <w:tcPr>
+            <w:tcW w:type="dxa" w:w="1080"/>
+          </w:tcPr>
+          <w:p>
+            <w:r>
+              <w:rPr>
+                <w:sz w:val="16"/>
+              </w:rPr>
+              <w:t>24.41</w:t>
+            </w:r>
+          </w:p>
+        </w:tc>
+        <w:tc>
+          <w:tcPr>
+            <w:tcW w:type="dxa" w:w="1080"/>
+          </w:tcPr>
+          <w:p>
+            <w:r>
+              <w:rPr>
+                <w:sz w:val="16"/>
+              </w:rPr>
+              <w:t>440.4</w:t>
+            </w:r>
+          </w:p>
+        </w:tc>
+        <w:tc>
+          <w:tcPr>
+            <w:tcW w:type="dxa" w:w="1080"/>
+          </w:tcPr>
+          <w:p>
+            <w:r>
+              <w:rPr>
+                <w:sz w:val="16"/>
+              </w:rPr>
+              <w:t>10.6</w:t>
+            </w:r>
+          </w:p>
+        </w:tc>
+      </w:tr>
+      <w:tr>
+        <w:tc>
+          <w:tcPr>
+            <w:tcW w:type="dxa" w:w="1080"/>
+          </w:tcPr>
+          <w:p>
+            <w:r>
+              <w:rPr>
+                <w:sz w:val="16"/>
+              </w:rPr>
+              <w:t>spiking_unet_T10</w:t>
+            </w:r>
+          </w:p>
+        </w:tc>
+        <w:tc>
+          <w:tcPr>
+            <w:tcW w:type="dxa" w:w="1080"/>
+          </w:tcPr>
+          <w:p>
+            <w:r>
+              <w:rPr>
+                <w:sz w:val="16"/>
+              </w:rPr>
+              <w:t>0.289±0.152 (n3)</w:t>
+            </w:r>
+          </w:p>
+        </w:tc>
+        <w:tc>
+          <w:tcPr>
+            <w:tcW w:type="dxa" w:w="1080"/>
+          </w:tcPr>
+          <w:p>
+            <w:r>
+              <w:rPr>
+                <w:sz w:val="16"/>
+              </w:rPr>
+              <w:t>0.205</w:t>
+            </w:r>
+          </w:p>
+        </w:tc>
+        <w:tc>
+          <w:tcPr>
+            <w:tcW w:type="dxa" w:w="1080"/>
+          </w:tcPr>
+          <w:p>
+            <w:r>
+              <w:rPr>
+                <w:sz w:val="16"/>
+              </w:rPr>
+              <w:t>0.425</w:t>
+            </w:r>
+          </w:p>
+        </w:tc>
+        <w:tc>
+          <w:tcPr>
+            <w:tcW w:type="dxa" w:w="1080"/>
+          </w:tcPr>
+          <w:p>
+            <w:r>
+              <w:rPr>
+                <w:sz w:val="16"/>
+              </w:rPr>
+              <w:t>0.416</w:t>
+            </w:r>
+          </w:p>
+        </w:tc>
+        <w:tc>
+          <w:tcPr>
+            <w:tcW w:type="dxa" w:w="1080"/>
+          </w:tcPr>
+          <w:p>
+            <w:r>
+              <w:rPr>
+                <w:sz w:val="16"/>
+              </w:rPr>
+              <w:t>7.76</w:t>
+            </w:r>
+          </w:p>
+        </w:tc>
+        <w:tc>
+          <w:tcPr>
+            <w:tcW w:type="dxa" w:w="1080"/>
+          </w:tcPr>
+          <w:p>
+            <w:r>
+              <w:rPr>
+                <w:sz w:val="16"/>
+              </w:rPr>
+              <w:t>223.2</w:t>
+            </w:r>
+          </w:p>
+        </w:tc>
+        <w:tc>
+          <w:tcPr>
+            <w:tcW w:type="dxa" w:w="1080"/>
+          </w:tcPr>
+          <w:p>
+            <w:r>
+              <w:rPr>
+                <w:sz w:val="16"/>
+              </w:rPr>
+              <w:t>19.5</w:t>
+            </w:r>
+          </w:p>
+        </w:tc>
+      </w:tr>
+      <w:tr>
+        <w:tc>
+          <w:tcPr>
+            <w:tcW w:type="dxa" w:w="1080"/>
+          </w:tcPr>
+          <w:p>
+            <w:r>
+              <w:rPr>
+                <w:sz w:val="16"/>
+              </w:rPr>
+              <w:t>spiking_unet_T1</w:t>
+            </w:r>
+          </w:p>
+        </w:tc>
+        <w:tc>
+          <w:tcPr>
+            <w:tcW w:type="dxa" w:w="1080"/>
+          </w:tcPr>
+          <w:p>
+            <w:r>
+              <w:rPr>
+                <w:sz w:val="16"/>
+              </w:rPr>
+              <w:t>0.252±0.125 (n3)</w:t>
+            </w:r>
+          </w:p>
+        </w:tc>
+        <w:tc>
+          <w:tcPr>
+            <w:tcW w:type="dxa" w:w="1080"/>
+          </w:tcPr>
+          <w:p>
+            <w:r>
+              <w:rPr>
+                <w:sz w:val="16"/>
+              </w:rPr>
+              <w:t>0.139</w:t>
+            </w:r>
+          </w:p>
+        </w:tc>
+        <w:tc>
+          <w:tcPr>
+            <w:tcW w:type="dxa" w:w="1080"/>
+          </w:tcPr>
+          <w:p>
+            <w:r>
+              <w:rPr>
+                <w:sz w:val="16"/>
+              </w:rPr>
+              <w:t>0.385</w:t>
+            </w:r>
+          </w:p>
+        </w:tc>
+        <w:tc>
+          <w:tcPr>
+            <w:tcW w:type="dxa" w:w="1080"/>
+          </w:tcPr>
+          <w:p>
+            <w:r>
+              <w:rPr>
+                <w:sz w:val="16"/>
+              </w:rPr>
+              <w:t>0.389</w:t>
+            </w:r>
+          </w:p>
+        </w:tc>
+        <w:tc>
+          <w:tcPr>
+            <w:tcW w:type="dxa" w:w="1080"/>
+          </w:tcPr>
+          <w:p>
+            <w:r>
+              <w:rPr>
+                <w:sz w:val="16"/>
+              </w:rPr>
+              <w:t>7.76</w:t>
+            </w:r>
+          </w:p>
+        </w:tc>
+        <w:tc>
+          <w:tcPr>
+            <w:tcW w:type="dxa" w:w="1080"/>
+          </w:tcPr>
+          <w:p>
+            <w:r>
+              <w:rPr>
+                <w:sz w:val="16"/>
+              </w:rPr>
+              <w:t>22.3</w:t>
+            </w:r>
+          </w:p>
+        </w:tc>
+        <w:tc>
+          <w:tcPr>
+            <w:tcW w:type="dxa" w:w="1080"/>
+          </w:tcPr>
+          <w:p>
+            <w:r>
+              <w:rPr>
+                <w:sz w:val="16"/>
+              </w:rPr>
+              <w:t>17.8</w:t>
+            </w:r>
+          </w:p>
+        </w:tc>
+      </w:tr>
+      <w:tr>
+        <w:tc>
+          <w:tcPr>
+            <w:tcW w:type="dxa" w:w="1080"/>
+          </w:tcPr>
+          <w:p>
+            <w:r>
+              <w:rPr>
+                <w:sz w:val="16"/>
+              </w:rPr>
+              <w:t>spiking_unet_lr5e5</w:t>
+            </w:r>
+          </w:p>
+        </w:tc>
+        <w:tc>
+          <w:tcPr>
+            <w:tcW w:type="dxa" w:w="1080"/>
+          </w:tcPr>
+          <w:p>
+            <w:r>
+              <w:rPr>
+                <w:sz w:val="16"/>
+              </w:rPr>
+              <w:t>0.239±0.119 (n3)</w:t>
+            </w:r>
+          </w:p>
+        </w:tc>
+        <w:tc>
+          <w:tcPr>
+            <w:tcW w:type="dxa" w:w="1080"/>
+          </w:tcPr>
+          <w:p>
+            <w:r>
+              <w:rPr>
+                <w:sz w:val="16"/>
+              </w:rPr>
+              <w:t>0.184</w:t>
+            </w:r>
+          </w:p>
+        </w:tc>
+        <w:tc>
+          <w:tcPr>
+            <w:tcW w:type="dxa" w:w="1080"/>
+          </w:tcPr>
+          <w:p>
+            <w:r>
+              <w:rPr>
+                <w:sz w:val="16"/>
+              </w:rPr>
+              <w:t>0.370</w:t>
+            </w:r>
+          </w:p>
+        </w:tc>
+        <w:tc>
+          <w:tcPr>
+            <w:tcW w:type="dxa" w:w="1080"/>
+          </w:tcPr>
+          <w:p>
+            <w:r>
+              <w:rPr>
+                <w:sz w:val="16"/>
+              </w:rPr>
+              <w:t>0.331</w:t>
+            </w:r>
+          </w:p>
+        </w:tc>
+        <w:tc>
+          <w:tcPr>
+            <w:tcW w:type="dxa" w:w="1080"/>
+          </w:tcPr>
+          <w:p>
+            <w:r>
+              <w:rPr>
+                <w:sz w:val="16"/>
+              </w:rPr>
+              <w:t>7.76</w:t>
+            </w:r>
+          </w:p>
+        </w:tc>
+        <w:tc>
+          <w:tcPr>
+            <w:tcW w:type="dxa" w:w="1080"/>
+          </w:tcPr>
+          <w:p>
+            <w:r>
+              <w:rPr>
+                <w:sz w:val="16"/>
+              </w:rPr>
+              <w:t>62.6</w:t>
+            </w:r>
+          </w:p>
+        </w:tc>
+        <w:tc>
+          <w:tcPr>
+            <w:tcW w:type="dxa" w:w="1080"/>
+          </w:tcPr>
+          <w:p>
+            <w:r>
+              <w:rPr>
+                <w:sz w:val="16"/>
+              </w:rPr>
+              <w:t>15.1</w:t>
+            </w:r>
+          </w:p>
+        </w:tc>
+      </w:tr>
+      <w:tr>
+        <w:tc>
+          <w:tcPr>
+            <w:tcW w:type="dxa" w:w="1080"/>
+          </w:tcPr>
+          <w:p>
+            <w:r>
+              <w:rPr>
+                <w:sz w:val="16"/>
+              </w:rPr>
+              <w:t>ann2snn_T64</w:t>
+            </w:r>
+          </w:p>
+        </w:tc>
+        <w:tc>
+          <w:tcPr>
+            <w:tcW w:type="dxa" w:w="1080"/>
+          </w:tcPr>
+          <w:p>
+            <w:r>
+              <w:rPr>
+                <w:sz w:val="16"/>
+              </w:rPr>
+              <w:t>0.194±0.072 (n3)</w:t>
+            </w:r>
+          </w:p>
+        </w:tc>
+        <w:tc>
+          <w:tcPr>
+            <w:tcW w:type="dxa" w:w="1080"/>
+          </w:tcPr>
+          <w:p>
+            <w:r>
+              <w:rPr>
+                <w:sz w:val="16"/>
+              </w:rPr>
+              <w:t>0.133</w:t>
+            </w:r>
+          </w:p>
+        </w:tc>
+        <w:tc>
+          <w:tcPr>
+            <w:tcW w:type="dxa" w:w="1080"/>
+          </w:tcPr>
+          <w:p>
+            <w:r>
+              <w:rPr>
+                <w:sz w:val="16"/>
+              </w:rPr>
+              <w:t>0.319</w:t>
+            </w:r>
+          </w:p>
+        </w:tc>
+        <w:tc>
+          <w:tcPr>
+            <w:tcW w:type="dxa" w:w="1080"/>
+          </w:tcPr>
+          <w:p>
+            <w:r>
+              <w:rPr>
+                <w:sz w:val="16"/>
+              </w:rPr>
+              <w:t>0.507</w:t>
+            </w:r>
+          </w:p>
+        </w:tc>
+        <w:tc>
+          <w:tcPr>
+            <w:tcW w:type="dxa" w:w="1080"/>
+          </w:tcPr>
+          <w:p>
+            <w:r>
+              <w:rPr>
+                <w:sz w:val="16"/>
+              </w:rPr>
+              <w:t>24.41</w:t>
+            </w:r>
+          </w:p>
+        </w:tc>
+        <w:tc>
+          <w:tcPr>
+            <w:tcW w:type="dxa" w:w="1080"/>
+          </w:tcPr>
+          <w:p>
+            <w:r>
+              <w:rPr>
+                <w:sz w:val="16"/>
+              </w:rPr>
+              <w:t>212.1</w:t>
+            </w:r>
+          </w:p>
+        </w:tc>
+        <w:tc>
+          <w:tcPr>
+            <w:tcW w:type="dxa" w:w="1080"/>
+          </w:tcPr>
+          <w:p>
+            <w:r>
+              <w:rPr>
+                <w:sz w:val="16"/>
+              </w:rPr>
+              <w:t>10.0</w:t>
+            </w:r>
+          </w:p>
+        </w:tc>
+      </w:tr>
+      <w:tr>
+        <w:tc>
+          <w:tcPr>
+            <w:tcW w:type="dxa" w:w="1080"/>
+          </w:tcPr>
+          <w:p>
+            <w:r>
+              <w:rPr>
+                <w:sz w:val="16"/>
+              </w:rPr>
+              <w:t>ann2snn_T32</w:t>
+            </w:r>
+          </w:p>
+        </w:tc>
+        <w:tc>
+          <w:tcPr>
+            <w:tcW w:type="dxa" w:w="1080"/>
+          </w:tcPr>
+          <w:p>
+            <w:r>
+              <w:rPr>
+                <w:sz w:val="16"/>
+              </w:rPr>
+              <w:t>0.037±0.011 (n3)</w:t>
+            </w:r>
+          </w:p>
+        </w:tc>
+        <w:tc>
+          <w:tcPr>
+            <w:tcW w:type="dxa" w:w="1080"/>
+          </w:tcPr>
+          <w:p>
+            <w:r>
+              <w:rPr>
+                <w:sz w:val="16"/>
+              </w:rPr>
+              <w:t>0.028</w:t>
+            </w:r>
+          </w:p>
+        </w:tc>
+        <w:tc>
+          <w:tcPr>
+            <w:tcW w:type="dxa" w:w="1080"/>
+          </w:tcPr>
+          <w:p>
+            <w:r>
+              <w:rPr>
+                <w:sz w:val="16"/>
+              </w:rPr>
+              <w:t>0.071</w:t>
+            </w:r>
+          </w:p>
+        </w:tc>
+        <w:tc>
+          <w:tcPr>
+            <w:tcW w:type="dxa" w:w="1080"/>
+          </w:tcPr>
+          <w:p>
+            <w:r>
+              <w:rPr>
+                <w:sz w:val="16"/>
+              </w:rPr>
+              <w:t>0.526</w:t>
+            </w:r>
+          </w:p>
+        </w:tc>
+        <w:tc>
+          <w:tcPr>
+            <w:tcW w:type="dxa" w:w="1080"/>
+          </w:tcPr>
+          <w:p>
+            <w:r>
+              <w:rPr>
+                <w:sz w:val="16"/>
+              </w:rPr>
+              <w:t>24.41</w:t>
+            </w:r>
+          </w:p>
+        </w:tc>
+        <w:tc>
+          <w:tcPr>
+            <w:tcW w:type="dxa" w:w="1080"/>
+          </w:tcPr>
+          <w:p>
+            <w:r>
+              <w:rPr>
+                <w:sz w:val="16"/>
+              </w:rPr>
+              <w:t>97.9</w:t>
+            </w:r>
+          </w:p>
+        </w:tc>
+        <w:tc>
+          <w:tcPr>
+            <w:tcW w:type="dxa" w:w="1080"/>
+          </w:tcPr>
+          <w:p>
+            <w:r>
+              <w:rPr>
+                <w:sz w:val="16"/>
+              </w:rPr>
+              <w:t>8.8</w:t>
+            </w:r>
+          </w:p>
+        </w:tc>
+      </w:tr>
+    </w:tbl>
+    <w:p>
+      <w:r>
+        <w:rPr>
+          <w:i/>
+          <w:sz w:val="18"/>
+        </w:rPr>
+        <w:t>Table A1. All 25 configurations.</w:t>
+      </w:r>
+    </w:p>
+    <w:p>
+      <w:pPr>
+        <w:spacing w:before="200" w:after="80"/>
+      </w:pPr>
+      <w:r>
+        <w:rPr>
+          <w:b/>
+          <w:sz w:val="26"/>
+        </w:rPr>
+        <w:t>Appendix B. Reproducibility</w:t>
+      </w:r>
+    </w:p>
+    <w:p>
+      <w:pPr>
+        <w:spacing w:after="120"/>
+        <w:jc w:val="both"/>
+      </w:pPr>
+      <w:r>
+        <w:rPr>
+          <w:i/>
+        </w:rPr>
+        <w:t>Code, configs, region-stratified splits and fixed seeds are released at [GitHub repo link]. Results correspond to git tag paper-v1. Hardware: 1× NVIDIA H100 (training); energy is estimated analytically at 45 nm (not measured on-chip). Seeds: {0,1,2} (T=6 also {3,4}). [TODO: điền git SHA + repo URL].</w:t>
       </w:r>
     </w:p>
     <w:sectPr>

</xml_diff>

<commit_message>
Table 1: thêm cột Cluster (Wilcoxon A/B/C) theo plan thầy — INT8+SNN cùng Cluster B
</commit_message>
<xml_diff>
--- a/paper/SNN-Flood-Paper.docx
+++ b/paper/SNN-Flood-Paper.docx
@@ -359,18 +359,19 @@
         <w:tblLook w:firstColumn="1" w:firstRow="1" w:lastColumn="0" w:lastRow="0" w:noHBand="0" w:noVBand="1" w:val="04A0"/>
       </w:tblPr>
       <w:tblGrid>
-        <w:gridCol w:w="1234"/>
-        <w:gridCol w:w="1234"/>
-        <w:gridCol w:w="1234"/>
-        <w:gridCol w:w="1234"/>
-        <w:gridCol w:w="1234"/>
-        <w:gridCol w:w="1234"/>
-        <w:gridCol w:w="1234"/>
+        <w:gridCol w:w="1080"/>
+        <w:gridCol w:w="1080"/>
+        <w:gridCol w:w="1080"/>
+        <w:gridCol w:w="1080"/>
+        <w:gridCol w:w="1080"/>
+        <w:gridCol w:w="1080"/>
+        <w:gridCol w:w="1080"/>
+        <w:gridCol w:w="1080"/>
       </w:tblGrid>
       <w:tr>
         <w:tc>
           <w:tcPr>
-            <w:tcW w:type="dxa" w:w="1234"/>
+            <w:tcW w:type="dxa" w:w="1080"/>
           </w:tcPr>
           <w:p>
             <w:r>
@@ -384,7 +385,7 @@
         </w:tc>
         <w:tc>
           <w:tcPr>
-            <w:tcW w:type="dxa" w:w="1234"/>
+            <w:tcW w:type="dxa" w:w="1080"/>
           </w:tcPr>
           <w:p>
             <w:r>
@@ -398,7 +399,7 @@
         </w:tc>
         <w:tc>
           <w:tcPr>
-            <w:tcW w:type="dxa" w:w="1234"/>
+            <w:tcW w:type="dxa" w:w="1080"/>
           </w:tcPr>
           <w:p>
             <w:r>
@@ -412,7 +413,7 @@
         </w:tc>
         <w:tc>
           <w:tcPr>
-            <w:tcW w:type="dxa" w:w="1234"/>
+            <w:tcW w:type="dxa" w:w="1080"/>
           </w:tcPr>
           <w:p>
             <w:r>
@@ -426,7 +427,7 @@
         </w:tc>
         <w:tc>
           <w:tcPr>
-            <w:tcW w:type="dxa" w:w="1234"/>
+            <w:tcW w:type="dxa" w:w="1080"/>
           </w:tcPr>
           <w:p>
             <w:r>
@@ -440,7 +441,7 @@
         </w:tc>
         <w:tc>
           <w:tcPr>
-            <w:tcW w:type="dxa" w:w="1234"/>
+            <w:tcW w:type="dxa" w:w="1080"/>
           </w:tcPr>
           <w:p>
             <w:r>
@@ -454,7 +455,7 @@
         </w:tc>
         <w:tc>
           <w:tcPr>
-            <w:tcW w:type="dxa" w:w="1234"/>
+            <w:tcW w:type="dxa" w:w="1080"/>
           </w:tcPr>
           <w:p>
             <w:r>
@@ -466,11 +467,25 @@
             </w:r>
           </w:p>
         </w:tc>
+        <w:tc>
+          <w:tcPr>
+            <w:tcW w:type="dxa" w:w="1080"/>
+          </w:tcPr>
+          <w:p>
+            <w:r>
+              <w:rPr>
+                <w:b/>
+                <w:sz w:val="18"/>
+              </w:rPr>
+              <w:t>Cluster</w:t>
+            </w:r>
+          </w:p>
+        </w:tc>
       </w:tr>
       <w:tr>
         <w:tc>
           <w:tcPr>
-            <w:tcW w:type="dxa" w:w="1234"/>
+            <w:tcW w:type="dxa" w:w="1080"/>
           </w:tcPr>
           <w:p>
             <w:r>
@@ -483,7 +498,7 @@
         </w:tc>
         <w:tc>
           <w:tcPr>
-            <w:tcW w:type="dxa" w:w="1234"/>
+            <w:tcW w:type="dxa" w:w="1080"/>
           </w:tcPr>
           <w:p>
             <w:r>
@@ -496,7 +511,7 @@
         </w:tc>
         <w:tc>
           <w:tcPr>
-            <w:tcW w:type="dxa" w:w="1234"/>
+            <w:tcW w:type="dxa" w:w="1080"/>
           </w:tcPr>
           <w:p>
             <w:r>
@@ -509,7 +524,7 @@
         </w:tc>
         <w:tc>
           <w:tcPr>
-            <w:tcW w:type="dxa" w:w="1234"/>
+            <w:tcW w:type="dxa" w:w="1080"/>
           </w:tcPr>
           <w:p>
             <w:r>
@@ -522,7 +537,7 @@
         </w:tc>
         <w:tc>
           <w:tcPr>
-            <w:tcW w:type="dxa" w:w="1234"/>
+            <w:tcW w:type="dxa" w:w="1080"/>
           </w:tcPr>
           <w:p>
             <w:r>
@@ -535,7 +550,7 @@
         </w:tc>
         <w:tc>
           <w:tcPr>
-            <w:tcW w:type="dxa" w:w="1234"/>
+            <w:tcW w:type="dxa" w:w="1080"/>
           </w:tcPr>
           <w:p>
             <w:r>
@@ -548,7 +563,7 @@
         </w:tc>
         <w:tc>
           <w:tcPr>
-            <w:tcW w:type="dxa" w:w="1234"/>
+            <w:tcW w:type="dxa" w:w="1080"/>
           </w:tcPr>
           <w:p>
             <w:r>
@@ -556,6 +571,19 @@
                 <w:sz w:val="18"/>
               </w:rPr>
               <w:t>—</w:t>
+            </w:r>
+          </w:p>
+        </w:tc>
+        <w:tc>
+          <w:tcPr>
+            <w:tcW w:type="dxa" w:w="1080"/>
+          </w:tcPr>
+          <w:p>
+            <w:r>
+              <w:rPr>
+                <w:sz w:val="18"/>
+              </w:rPr>
+              <w:t>A</w:t>
             </w:r>
           </w:p>
         </w:tc>
@@ -563,7 +591,7 @@
       <w:tr>
         <w:tc>
           <w:tcPr>
-            <w:tcW w:type="dxa" w:w="1234"/>
+            <w:tcW w:type="dxa" w:w="1080"/>
           </w:tcPr>
           <w:p>
             <w:r>
@@ -576,7 +604,7 @@
         </w:tc>
         <w:tc>
           <w:tcPr>
-            <w:tcW w:type="dxa" w:w="1234"/>
+            <w:tcW w:type="dxa" w:w="1080"/>
           </w:tcPr>
           <w:p>
             <w:r>
@@ -589,7 +617,7 @@
         </w:tc>
         <w:tc>
           <w:tcPr>
-            <w:tcW w:type="dxa" w:w="1234"/>
+            <w:tcW w:type="dxa" w:w="1080"/>
           </w:tcPr>
           <w:p>
             <w:r>
@@ -602,7 +630,7 @@
         </w:tc>
         <w:tc>
           <w:tcPr>
-            <w:tcW w:type="dxa" w:w="1234"/>
+            <w:tcW w:type="dxa" w:w="1080"/>
           </w:tcPr>
           <w:p>
             <w:r>
@@ -615,7 +643,7 @@
         </w:tc>
         <w:tc>
           <w:tcPr>
-            <w:tcW w:type="dxa" w:w="1234"/>
+            <w:tcW w:type="dxa" w:w="1080"/>
           </w:tcPr>
           <w:p>
             <w:r>
@@ -628,7 +656,7 @@
         </w:tc>
         <w:tc>
           <w:tcPr>
-            <w:tcW w:type="dxa" w:w="1234"/>
+            <w:tcW w:type="dxa" w:w="1080"/>
           </w:tcPr>
           <w:p>
             <w:r>
@@ -641,7 +669,7 @@
         </w:tc>
         <w:tc>
           <w:tcPr>
-            <w:tcW w:type="dxa" w:w="1234"/>
+            <w:tcW w:type="dxa" w:w="1080"/>
           </w:tcPr>
           <w:p>
             <w:r>
@@ -649,6 +677,19 @@
                 <w:sz w:val="18"/>
               </w:rPr>
               <w:t>—</w:t>
+            </w:r>
+          </w:p>
+        </w:tc>
+        <w:tc>
+          <w:tcPr>
+            <w:tcW w:type="dxa" w:w="1080"/>
+          </w:tcPr>
+          <w:p>
+            <w:r>
+              <w:rPr>
+                <w:sz w:val="18"/>
+              </w:rPr>
+              <w:t>A</w:t>
             </w:r>
           </w:p>
         </w:tc>
@@ -656,7 +697,7 @@
       <w:tr>
         <w:tc>
           <w:tcPr>
-            <w:tcW w:type="dxa" w:w="1234"/>
+            <w:tcW w:type="dxa" w:w="1080"/>
           </w:tcPr>
           <w:p>
             <w:r>
@@ -669,7 +710,7 @@
         </w:tc>
         <w:tc>
           <w:tcPr>
-            <w:tcW w:type="dxa" w:w="1234"/>
+            <w:tcW w:type="dxa" w:w="1080"/>
           </w:tcPr>
           <w:p>
             <w:r>
@@ -682,7 +723,7 @@
         </w:tc>
         <w:tc>
           <w:tcPr>
-            <w:tcW w:type="dxa" w:w="1234"/>
+            <w:tcW w:type="dxa" w:w="1080"/>
           </w:tcPr>
           <w:p>
             <w:r>
@@ -695,7 +736,7 @@
         </w:tc>
         <w:tc>
           <w:tcPr>
-            <w:tcW w:type="dxa" w:w="1234"/>
+            <w:tcW w:type="dxa" w:w="1080"/>
           </w:tcPr>
           <w:p>
             <w:r>
@@ -708,7 +749,7 @@
         </w:tc>
         <w:tc>
           <w:tcPr>
-            <w:tcW w:type="dxa" w:w="1234"/>
+            <w:tcW w:type="dxa" w:w="1080"/>
           </w:tcPr>
           <w:p>
             <w:r>
@@ -721,7 +762,7 @@
         </w:tc>
         <w:tc>
           <w:tcPr>
-            <w:tcW w:type="dxa" w:w="1234"/>
+            <w:tcW w:type="dxa" w:w="1080"/>
           </w:tcPr>
           <w:p>
             <w:r>
@@ -734,7 +775,7 @@
         </w:tc>
         <w:tc>
           <w:tcPr>
-            <w:tcW w:type="dxa" w:w="1234"/>
+            <w:tcW w:type="dxa" w:w="1080"/>
           </w:tcPr>
           <w:p>
             <w:r>
@@ -742,6 +783,19 @@
                 <w:sz w:val="18"/>
               </w:rPr>
               <w:t>—</w:t>
+            </w:r>
+          </w:p>
+        </w:tc>
+        <w:tc>
+          <w:tcPr>
+            <w:tcW w:type="dxa" w:w="1080"/>
+          </w:tcPr>
+          <w:p>
+            <w:r>
+              <w:rPr>
+                <w:sz w:val="18"/>
+              </w:rPr>
+              <w:t>A</w:t>
             </w:r>
           </w:p>
         </w:tc>
@@ -749,7 +803,7 @@
       <w:tr>
         <w:tc>
           <w:tcPr>
-            <w:tcW w:type="dxa" w:w="1234"/>
+            <w:tcW w:type="dxa" w:w="1080"/>
           </w:tcPr>
           <w:p>
             <w:r>
@@ -762,7 +816,7 @@
         </w:tc>
         <w:tc>
           <w:tcPr>
-            <w:tcW w:type="dxa" w:w="1234"/>
+            <w:tcW w:type="dxa" w:w="1080"/>
           </w:tcPr>
           <w:p>
             <w:r>
@@ -775,7 +829,7 @@
         </w:tc>
         <w:tc>
           <w:tcPr>
-            <w:tcW w:type="dxa" w:w="1234"/>
+            <w:tcW w:type="dxa" w:w="1080"/>
           </w:tcPr>
           <w:p>
             <w:r>
@@ -788,7 +842,7 @@
         </w:tc>
         <w:tc>
           <w:tcPr>
-            <w:tcW w:type="dxa" w:w="1234"/>
+            <w:tcW w:type="dxa" w:w="1080"/>
           </w:tcPr>
           <w:p>
             <w:r>
@@ -801,7 +855,7 @@
         </w:tc>
         <w:tc>
           <w:tcPr>
-            <w:tcW w:type="dxa" w:w="1234"/>
+            <w:tcW w:type="dxa" w:w="1080"/>
           </w:tcPr>
           <w:p>
             <w:r>
@@ -814,7 +868,7 @@
         </w:tc>
         <w:tc>
           <w:tcPr>
-            <w:tcW w:type="dxa" w:w="1234"/>
+            <w:tcW w:type="dxa" w:w="1080"/>
           </w:tcPr>
           <w:p>
             <w:r>
@@ -827,7 +881,7 @@
         </w:tc>
         <w:tc>
           <w:tcPr>
-            <w:tcW w:type="dxa" w:w="1234"/>
+            <w:tcW w:type="dxa" w:w="1080"/>
           </w:tcPr>
           <w:p>
             <w:r>
@@ -835,6 +889,19 @@
                 <w:sz w:val="18"/>
               </w:rPr>
               <w:t>—</w:t>
+            </w:r>
+          </w:p>
+        </w:tc>
+        <w:tc>
+          <w:tcPr>
+            <w:tcW w:type="dxa" w:w="1080"/>
+          </w:tcPr>
+          <w:p>
+            <w:r>
+              <w:rPr>
+                <w:sz w:val="18"/>
+              </w:rPr>
+              <w:t>A</w:t>
             </w:r>
           </w:p>
         </w:tc>
@@ -842,7 +909,7 @@
       <w:tr>
         <w:tc>
           <w:tcPr>
-            <w:tcW w:type="dxa" w:w="1234"/>
+            <w:tcW w:type="dxa" w:w="1080"/>
           </w:tcPr>
           <w:p>
             <w:r>
@@ -855,7 +922,7 @@
         </w:tc>
         <w:tc>
           <w:tcPr>
-            <w:tcW w:type="dxa" w:w="1234"/>
+            <w:tcW w:type="dxa" w:w="1080"/>
           </w:tcPr>
           <w:p>
             <w:r>
@@ -868,7 +935,7 @@
         </w:tc>
         <w:tc>
           <w:tcPr>
-            <w:tcW w:type="dxa" w:w="1234"/>
+            <w:tcW w:type="dxa" w:w="1080"/>
           </w:tcPr>
           <w:p>
             <w:r>
@@ -881,7 +948,7 @@
         </w:tc>
         <w:tc>
           <w:tcPr>
-            <w:tcW w:type="dxa" w:w="1234"/>
+            <w:tcW w:type="dxa" w:w="1080"/>
           </w:tcPr>
           <w:p>
             <w:r>
@@ -894,7 +961,7 @@
         </w:tc>
         <w:tc>
           <w:tcPr>
-            <w:tcW w:type="dxa" w:w="1234"/>
+            <w:tcW w:type="dxa" w:w="1080"/>
           </w:tcPr>
           <w:p>
             <w:r>
@@ -907,7 +974,7 @@
         </w:tc>
         <w:tc>
           <w:tcPr>
-            <w:tcW w:type="dxa" w:w="1234"/>
+            <w:tcW w:type="dxa" w:w="1080"/>
           </w:tcPr>
           <w:p>
             <w:r>
@@ -920,7 +987,7 @@
         </w:tc>
         <w:tc>
           <w:tcPr>
-            <w:tcW w:type="dxa" w:w="1234"/>
+            <w:tcW w:type="dxa" w:w="1080"/>
           </w:tcPr>
           <w:p>
             <w:r>
@@ -928,6 +995,19 @@
                 <w:sz w:val="18"/>
               </w:rPr>
               <w:t>—</w:t>
+            </w:r>
+          </w:p>
+        </w:tc>
+        <w:tc>
+          <w:tcPr>
+            <w:tcW w:type="dxa" w:w="1080"/>
+          </w:tcPr>
+          <w:p>
+            <w:r>
+              <w:rPr>
+                <w:sz w:val="18"/>
+              </w:rPr>
+              <w:t>B</w:t>
             </w:r>
           </w:p>
         </w:tc>
@@ -935,7 +1015,7 @@
       <w:tr>
         <w:tc>
           <w:tcPr>
-            <w:tcW w:type="dxa" w:w="1234"/>
+            <w:tcW w:type="dxa" w:w="1080"/>
           </w:tcPr>
           <w:p>
             <w:r>
@@ -948,7 +1028,7 @@
         </w:tc>
         <w:tc>
           <w:tcPr>
-            <w:tcW w:type="dxa" w:w="1234"/>
+            <w:tcW w:type="dxa" w:w="1080"/>
           </w:tcPr>
           <w:p>
             <w:r>
@@ -961,7 +1041,7 @@
         </w:tc>
         <w:tc>
           <w:tcPr>
-            <w:tcW w:type="dxa" w:w="1234"/>
+            <w:tcW w:type="dxa" w:w="1080"/>
           </w:tcPr>
           <w:p>
             <w:r>
@@ -974,7 +1054,7 @@
         </w:tc>
         <w:tc>
           <w:tcPr>
-            <w:tcW w:type="dxa" w:w="1234"/>
+            <w:tcW w:type="dxa" w:w="1080"/>
           </w:tcPr>
           <w:p>
             <w:r>
@@ -987,7 +1067,7 @@
         </w:tc>
         <w:tc>
           <w:tcPr>
-            <w:tcW w:type="dxa" w:w="1234"/>
+            <w:tcW w:type="dxa" w:w="1080"/>
           </w:tcPr>
           <w:p>
             <w:r>
@@ -1000,7 +1080,7 @@
         </w:tc>
         <w:tc>
           <w:tcPr>
-            <w:tcW w:type="dxa" w:w="1234"/>
+            <w:tcW w:type="dxa" w:w="1080"/>
           </w:tcPr>
           <w:p>
             <w:r>
@@ -1013,7 +1093,7 @@
         </w:tc>
         <w:tc>
           <w:tcPr>
-            <w:tcW w:type="dxa" w:w="1234"/>
+            <w:tcW w:type="dxa" w:w="1080"/>
           </w:tcPr>
           <w:p>
             <w:r>
@@ -1021,6 +1101,19 @@
                 <w:sz w:val="18"/>
               </w:rPr>
               <w:t>—</w:t>
+            </w:r>
+          </w:p>
+        </w:tc>
+        <w:tc>
+          <w:tcPr>
+            <w:tcW w:type="dxa" w:w="1080"/>
+          </w:tcPr>
+          <w:p>
+            <w:r>
+              <w:rPr>
+                <w:sz w:val="18"/>
+              </w:rPr>
+              <w:t>A</w:t>
             </w:r>
           </w:p>
         </w:tc>
@@ -1028,7 +1121,7 @@
       <w:tr>
         <w:tc>
           <w:tcPr>
-            <w:tcW w:type="dxa" w:w="1234"/>
+            <w:tcW w:type="dxa" w:w="1080"/>
           </w:tcPr>
           <w:p>
             <w:r>
@@ -1041,7 +1134,7 @@
         </w:tc>
         <w:tc>
           <w:tcPr>
-            <w:tcW w:type="dxa" w:w="1234"/>
+            <w:tcW w:type="dxa" w:w="1080"/>
           </w:tcPr>
           <w:p>
             <w:r>
@@ -1054,7 +1147,7 @@
         </w:tc>
         <w:tc>
           <w:tcPr>
-            <w:tcW w:type="dxa" w:w="1234"/>
+            <w:tcW w:type="dxa" w:w="1080"/>
           </w:tcPr>
           <w:p>
             <w:r>
@@ -1067,7 +1160,7 @@
         </w:tc>
         <w:tc>
           <w:tcPr>
-            <w:tcW w:type="dxa" w:w="1234"/>
+            <w:tcW w:type="dxa" w:w="1080"/>
           </w:tcPr>
           <w:p>
             <w:r>
@@ -1080,7 +1173,7 @@
         </w:tc>
         <w:tc>
           <w:tcPr>
-            <w:tcW w:type="dxa" w:w="1234"/>
+            <w:tcW w:type="dxa" w:w="1080"/>
           </w:tcPr>
           <w:p>
             <w:r>
@@ -1093,7 +1186,7 @@
         </w:tc>
         <w:tc>
           <w:tcPr>
-            <w:tcW w:type="dxa" w:w="1234"/>
+            <w:tcW w:type="dxa" w:w="1080"/>
           </w:tcPr>
           <w:p>
             <w:r>
@@ -1106,7 +1199,7 @@
         </w:tc>
         <w:tc>
           <w:tcPr>
-            <w:tcW w:type="dxa" w:w="1234"/>
+            <w:tcW w:type="dxa" w:w="1080"/>
           </w:tcPr>
           <w:p>
             <w:r>
@@ -1114,6 +1207,19 @@
                 <w:sz w:val="18"/>
               </w:rPr>
               <w:t>13.6</w:t>
+            </w:r>
+          </w:p>
+        </w:tc>
+        <w:tc>
+          <w:tcPr>
+            <w:tcW w:type="dxa" w:w="1080"/>
+          </w:tcPr>
+          <w:p>
+            <w:r>
+              <w:rPr>
+                <w:sz w:val="18"/>
+              </w:rPr>
+              <w:t>B</w:t>
             </w:r>
           </w:p>
         </w:tc>
@@ -1121,7 +1227,7 @@
       <w:tr>
         <w:tc>
           <w:tcPr>
-            <w:tcW w:type="dxa" w:w="1234"/>
+            <w:tcW w:type="dxa" w:w="1080"/>
           </w:tcPr>
           <w:p>
             <w:r>
@@ -1134,7 +1240,7 @@
         </w:tc>
         <w:tc>
           <w:tcPr>
-            <w:tcW w:type="dxa" w:w="1234"/>
+            <w:tcW w:type="dxa" w:w="1080"/>
           </w:tcPr>
           <w:p>
             <w:r>
@@ -1147,7 +1253,7 @@
         </w:tc>
         <w:tc>
           <w:tcPr>
-            <w:tcW w:type="dxa" w:w="1234"/>
+            <w:tcW w:type="dxa" w:w="1080"/>
           </w:tcPr>
           <w:p>
             <w:r>
@@ -1160,7 +1266,7 @@
         </w:tc>
         <w:tc>
           <w:tcPr>
-            <w:tcW w:type="dxa" w:w="1234"/>
+            <w:tcW w:type="dxa" w:w="1080"/>
           </w:tcPr>
           <w:p>
             <w:r>
@@ -1173,7 +1279,7 @@
         </w:tc>
         <w:tc>
           <w:tcPr>
-            <w:tcW w:type="dxa" w:w="1234"/>
+            <w:tcW w:type="dxa" w:w="1080"/>
           </w:tcPr>
           <w:p>
             <w:r>
@@ -1186,7 +1292,7 @@
         </w:tc>
         <w:tc>
           <w:tcPr>
-            <w:tcW w:type="dxa" w:w="1234"/>
+            <w:tcW w:type="dxa" w:w="1080"/>
           </w:tcPr>
           <w:p>
             <w:r>
@@ -1199,7 +1305,7 @@
         </w:tc>
         <w:tc>
           <w:tcPr>
-            <w:tcW w:type="dxa" w:w="1234"/>
+            <w:tcW w:type="dxa" w:w="1080"/>
           </w:tcPr>
           <w:p>
             <w:r>
@@ -1207,6 +1313,19 @@
                 <w:sz w:val="18"/>
               </w:rPr>
               <w:t>23.8</w:t>
+            </w:r>
+          </w:p>
+        </w:tc>
+        <w:tc>
+          <w:tcPr>
+            <w:tcW w:type="dxa" w:w="1080"/>
+          </w:tcPr>
+          <w:p>
+            <w:r>
+              <w:rPr>
+                <w:sz w:val="18"/>
+              </w:rPr>
+              <w:t>B</w:t>
             </w:r>
           </w:p>
         </w:tc>
@@ -1214,7 +1333,7 @@
       <w:tr>
         <w:tc>
           <w:tcPr>
-            <w:tcW w:type="dxa" w:w="1234"/>
+            <w:tcW w:type="dxa" w:w="1080"/>
           </w:tcPr>
           <w:p>
             <w:r>
@@ -1227,7 +1346,7 @@
         </w:tc>
         <w:tc>
           <w:tcPr>
-            <w:tcW w:type="dxa" w:w="1234"/>
+            <w:tcW w:type="dxa" w:w="1080"/>
           </w:tcPr>
           <w:p>
             <w:r>
@@ -1240,7 +1359,7 @@
         </w:tc>
         <w:tc>
           <w:tcPr>
-            <w:tcW w:type="dxa" w:w="1234"/>
+            <w:tcW w:type="dxa" w:w="1080"/>
           </w:tcPr>
           <w:p>
             <w:r>
@@ -1253,7 +1372,7 @@
         </w:tc>
         <w:tc>
           <w:tcPr>
-            <w:tcW w:type="dxa" w:w="1234"/>
+            <w:tcW w:type="dxa" w:w="1080"/>
           </w:tcPr>
           <w:p>
             <w:r>
@@ -1266,7 +1385,7 @@
         </w:tc>
         <w:tc>
           <w:tcPr>
-            <w:tcW w:type="dxa" w:w="1234"/>
+            <w:tcW w:type="dxa" w:w="1080"/>
           </w:tcPr>
           <w:p>
             <w:r>
@@ -1279,7 +1398,7 @@
         </w:tc>
         <w:tc>
           <w:tcPr>
-            <w:tcW w:type="dxa" w:w="1234"/>
+            <w:tcW w:type="dxa" w:w="1080"/>
           </w:tcPr>
           <w:p>
             <w:r>
@@ -1292,7 +1411,7 @@
         </w:tc>
         <w:tc>
           <w:tcPr>
-            <w:tcW w:type="dxa" w:w="1234"/>
+            <w:tcW w:type="dxa" w:w="1080"/>
           </w:tcPr>
           <w:p>
             <w:r>
@@ -1300,6 +1419,19 @@
                 <w:sz w:val="18"/>
               </w:rPr>
               <w:t>10.6</w:t>
+            </w:r>
+          </w:p>
+        </w:tc>
+        <w:tc>
+          <w:tcPr>
+            <w:tcW w:type="dxa" w:w="1080"/>
+          </w:tcPr>
+          <w:p>
+            <w:r>
+              <w:rPr>
+                <w:sz w:val="18"/>
+              </w:rPr>
+              <w:t>C</w:t>
             </w:r>
           </w:p>
         </w:tc>
@@ -1307,7 +1439,7 @@
       <w:tr>
         <w:tc>
           <w:tcPr>
-            <w:tcW w:type="dxa" w:w="1234"/>
+            <w:tcW w:type="dxa" w:w="1080"/>
           </w:tcPr>
           <w:p>
             <w:r>
@@ -1320,7 +1452,7 @@
         </w:tc>
         <w:tc>
           <w:tcPr>
-            <w:tcW w:type="dxa" w:w="1234"/>
+            <w:tcW w:type="dxa" w:w="1080"/>
           </w:tcPr>
           <w:p>
             <w:r>
@@ -1333,7 +1465,7 @@
         </w:tc>
         <w:tc>
           <w:tcPr>
-            <w:tcW w:type="dxa" w:w="1234"/>
+            <w:tcW w:type="dxa" w:w="1080"/>
           </w:tcPr>
           <w:p>
             <w:r>
@@ -1346,7 +1478,7 @@
         </w:tc>
         <w:tc>
           <w:tcPr>
-            <w:tcW w:type="dxa" w:w="1234"/>
+            <w:tcW w:type="dxa" w:w="1080"/>
           </w:tcPr>
           <w:p>
             <w:r>
@@ -1359,7 +1491,7 @@
         </w:tc>
         <w:tc>
           <w:tcPr>
-            <w:tcW w:type="dxa" w:w="1234"/>
+            <w:tcW w:type="dxa" w:w="1080"/>
           </w:tcPr>
           <w:p>
             <w:r>
@@ -1372,7 +1504,7 @@
         </w:tc>
         <w:tc>
           <w:tcPr>
-            <w:tcW w:type="dxa" w:w="1234"/>
+            <w:tcW w:type="dxa" w:w="1080"/>
           </w:tcPr>
           <w:p>
             <w:r>
@@ -1385,7 +1517,7 @@
         </w:tc>
         <w:tc>
           <w:tcPr>
-            <w:tcW w:type="dxa" w:w="1234"/>
+            <w:tcW w:type="dxa" w:w="1080"/>
           </w:tcPr>
           <w:p>
             <w:r>
@@ -1393,6 +1525,19 @@
                 <w:sz w:val="18"/>
               </w:rPr>
               <w:t>—</w:t>
+            </w:r>
+          </w:p>
+        </w:tc>
+        <w:tc>
+          <w:tcPr>
+            <w:tcW w:type="dxa" w:w="1080"/>
+          </w:tcPr>
+          <w:p>
+            <w:r>
+              <w:rPr>
+                <w:sz w:val="18"/>
+              </w:rPr>
+              <w:t>weak</w:t>
             </w:r>
           </w:p>
         </w:tc>
@@ -1407,7 +1552,7 @@
           <w:i/>
           <w:sz w:val="18"/>
         </w:rPr>
-        <w:t>Table 1. Selected models (full table in supplementary). Energy per 512×512 chip.</w:t>
+        <w:t>Table 1. Selected models (full 25-config table in Appendix A). Energy per 512×512 chip. Cluster = statistical grouping by Wilcoxon signed-rank on per-chip flood-IoU: A = top ANNs; B = INT8 CNN and best SNNs (mutually indistinguishable, p &gt; 0.05); C = ANN2SNN; weak = low per-chip IoU.</w:t>
       </w:r>
     </w:p>
     <w:p>

</xml_diff>

<commit_message>
Table 1 + A1: set độ rộng cột cố định (Model rộng 1.55") để tên model không vỡ dòng; font 8.5, padding gọn
</commit_message>
<xml_diff>
--- a/paper/SNN-Flood-Paper.docx
+++ b/paper/SNN-Flood-Paper.docx
@@ -356,6 +356,7 @@
       <w:tblPr>
         <w:tblStyle w:val="LightGrid-Accent1"/>
         <w:tblW w:type="auto" w:w="0"/>
+        <w:tblLayout w:type="fixed"/>
         <w:tblLook w:firstColumn="1" w:firstRow="1" w:lastColumn="0" w:lastRow="0" w:noHBand="0" w:noVBand="1" w:val="04A0"/>
       </w:tblPr>
       <w:tblGrid>
@@ -371,13 +372,16 @@
       <w:tr>
         <w:tc>
           <w:tcPr>
-            <w:tcW w:type="dxa" w:w="1080"/>
-          </w:tcPr>
-          <w:p>
+            <w:tcW w:type="dxa" w:w="2232"/>
+          </w:tcPr>
+          <w:p>
+            <w:pPr>
+              <w:spacing w:after="20" w:before="20"/>
+            </w:pPr>
             <w:r>
               <w:rPr>
                 <w:b/>
-                <w:sz w:val="18"/>
+                <w:sz w:val="17"/>
               </w:rPr>
               <w:t>Model</w:t>
             </w:r>
@@ -385,13 +389,16 @@
         </w:tc>
         <w:tc>
           <w:tcPr>
-            <w:tcW w:type="dxa" w:w="1080"/>
-          </w:tcPr>
-          <w:p>
+            <w:tcW w:type="dxa" w:w="1368"/>
+          </w:tcPr>
+          <w:p>
+            <w:pPr>
+              <w:spacing w:after="20" w:before="20"/>
+            </w:pPr>
             <w:r>
               <w:rPr>
                 <w:b/>
-                <w:sz w:val="18"/>
+                <w:sz w:val="17"/>
               </w:rPr>
               <w:t>Group</w:t>
             </w:r>
@@ -399,13 +406,16 @@
         </w:tc>
         <w:tc>
           <w:tcPr>
-            <w:tcW w:type="dxa" w:w="1080"/>
-          </w:tcPr>
-          <w:p>
+            <w:tcW w:type="dxa" w:w="893"/>
+          </w:tcPr>
+          <w:p>
+            <w:pPr>
+              <w:spacing w:after="20" w:before="20"/>
+            </w:pPr>
             <w:r>
               <w:rPr>
                 <w:b/>
-                <w:sz w:val="18"/>
+                <w:sz w:val="17"/>
               </w:rPr>
               <w:t>Params</w:t>
             </w:r>
@@ -413,13 +423,16 @@
         </w:tc>
         <w:tc>
           <w:tcPr>
-            <w:tcW w:type="dxa" w:w="1080"/>
-          </w:tcPr>
-          <w:p>
+            <w:tcW w:type="dxa" w:w="1037"/>
+          </w:tcPr>
+          <w:p>
+            <w:pPr>
+              <w:spacing w:after="20" w:before="20"/>
+            </w:pPr>
             <w:r>
               <w:rPr>
                 <w:b/>
-                <w:sz w:val="18"/>
+                <w:sz w:val="17"/>
               </w:rPr>
               <w:t>Energy(mJ)</w:t>
             </w:r>
@@ -427,13 +440,16 @@
         </w:tc>
         <w:tc>
           <w:tcPr>
-            <w:tcW w:type="dxa" w:w="1080"/>
-          </w:tcPr>
-          <w:p>
+            <w:tcW w:type="dxa" w:w="1325"/>
+          </w:tcPr>
+          <w:p>
+            <w:pPr>
+              <w:spacing w:after="20" w:before="20"/>
+            </w:pPr>
             <w:r>
               <w:rPr>
                 <w:b/>
-                <w:sz w:val="18"/>
+                <w:sz w:val="17"/>
               </w:rPr>
               <w:t>Pooled IoU</w:t>
             </w:r>
@@ -441,13 +457,16 @@
         </w:tc>
         <w:tc>
           <w:tcPr>
-            <w:tcW w:type="dxa" w:w="1080"/>
-          </w:tcPr>
-          <w:p>
+            <w:tcW w:type="dxa" w:w="893"/>
+          </w:tcPr>
+          <w:p>
+            <w:pPr>
+              <w:spacing w:after="20" w:before="20"/>
+            </w:pPr>
             <w:r>
               <w:rPr>
                 <w:b/>
-                <w:sz w:val="18"/>
+                <w:sz w:val="17"/>
               </w:rPr>
               <w:t>Per-chip</w:t>
             </w:r>
@@ -455,13 +474,16 @@
         </w:tc>
         <w:tc>
           <w:tcPr>
-            <w:tcW w:type="dxa" w:w="1080"/>
-          </w:tcPr>
-          <w:p>
+            <w:tcW w:type="dxa" w:w="792"/>
+          </w:tcPr>
+          <w:p>
+            <w:pPr>
+              <w:spacing w:after="20" w:before="20"/>
+            </w:pPr>
             <w:r>
               <w:rPr>
                 <w:b/>
-                <w:sz w:val="18"/>
+                <w:sz w:val="17"/>
               </w:rPr>
               <w:t>Spike%</w:t>
             </w:r>
@@ -469,13 +491,16 @@
         </w:tc>
         <w:tc>
           <w:tcPr>
-            <w:tcW w:type="dxa" w:w="1080"/>
-          </w:tcPr>
-          <w:p>
+            <w:tcW w:type="dxa" w:w="792"/>
+          </w:tcPr>
+          <w:p>
+            <w:pPr>
+              <w:spacing w:after="20" w:before="20"/>
+            </w:pPr>
             <w:r>
               <w:rPr>
                 <w:b/>
-                <w:sz w:val="18"/>
+                <w:sz w:val="17"/>
               </w:rPr>
               <w:t>Cluster</w:t>
             </w:r>
@@ -485,12 +510,15 @@
       <w:tr>
         <w:tc>
           <w:tcPr>
-            <w:tcW w:type="dxa" w:w="1080"/>
-          </w:tcPr>
-          <w:p>
-            <w:r>
-              <w:rPr>
-                <w:sz w:val="18"/>
+            <w:tcW w:type="dxa" w:w="2232"/>
+          </w:tcPr>
+          <w:p>
+            <w:pPr>
+              <w:spacing w:after="20" w:before="20"/>
+            </w:pPr>
+            <w:r>
+              <w:rPr>
+                <w:sz w:val="17"/>
               </w:rPr>
               <w:t>SegFormer-b2</w:t>
             </w:r>
@@ -498,12 +526,15 @@
         </w:tc>
         <w:tc>
           <w:tcPr>
-            <w:tcW w:type="dxa" w:w="1080"/>
-          </w:tcPr>
-          <w:p>
-            <w:r>
-              <w:rPr>
-                <w:sz w:val="18"/>
+            <w:tcW w:type="dxa" w:w="1368"/>
+          </w:tcPr>
+          <w:p>
+            <w:pPr>
+              <w:spacing w:after="20" w:before="20"/>
+            </w:pPr>
+            <w:r>
+              <w:rPr>
+                <w:sz w:val="17"/>
               </w:rPr>
               <w:t>Transformer</w:t>
             </w:r>
@@ -511,12 +542,15 @@
         </w:tc>
         <w:tc>
           <w:tcPr>
-            <w:tcW w:type="dxa" w:w="1080"/>
-          </w:tcPr>
-          <w:p>
-            <w:r>
-              <w:rPr>
-                <w:sz w:val="18"/>
+            <w:tcW w:type="dxa" w:w="893"/>
+          </w:tcPr>
+          <w:p>
+            <w:pPr>
+              <w:spacing w:after="20" w:before="20"/>
+            </w:pPr>
+            <w:r>
+              <w:rPr>
+                <w:sz w:val="17"/>
               </w:rPr>
               <w:t>24.7M</w:t>
             </w:r>
@@ -524,12 +558,15 @@
         </w:tc>
         <w:tc>
           <w:tcPr>
-            <w:tcW w:type="dxa" w:w="1080"/>
-          </w:tcPr>
-          <w:p>
-            <w:r>
-              <w:rPr>
-                <w:sz w:val="18"/>
+            <w:tcW w:type="dxa" w:w="1037"/>
+          </w:tcPr>
+          <w:p>
+            <w:pPr>
+              <w:spacing w:after="20" w:before="20"/>
+            </w:pPr>
+            <w:r>
+              <w:rPr>
+                <w:sz w:val="17"/>
               </w:rPr>
               <w:t>98.0</w:t>
             </w:r>
@@ -537,12 +574,15 @@
         </w:tc>
         <w:tc>
           <w:tcPr>
-            <w:tcW w:type="dxa" w:w="1080"/>
-          </w:tcPr>
-          <w:p>
-            <w:r>
-              <w:rPr>
-                <w:sz w:val="18"/>
+            <w:tcW w:type="dxa" w:w="1325"/>
+          </w:tcPr>
+          <w:p>
+            <w:pPr>
+              <w:spacing w:after="20" w:before="20"/>
+            </w:pPr>
+            <w:r>
+              <w:rPr>
+                <w:sz w:val="17"/>
               </w:rPr>
               <w:t>0.525±0.018</w:t>
             </w:r>
@@ -550,12 +590,15 @@
         </w:tc>
         <w:tc>
           <w:tcPr>
-            <w:tcW w:type="dxa" w:w="1080"/>
-          </w:tcPr>
-          <w:p>
-            <w:r>
-              <w:rPr>
-                <w:sz w:val="18"/>
+            <w:tcW w:type="dxa" w:w="893"/>
+          </w:tcPr>
+          <w:p>
+            <w:pPr>
+              <w:spacing w:after="20" w:before="20"/>
+            </w:pPr>
+            <w:r>
+              <w:rPr>
+                <w:sz w:val="17"/>
               </w:rPr>
               <w:t>0.251</w:t>
             </w:r>
@@ -563,12 +606,15 @@
         </w:tc>
         <w:tc>
           <w:tcPr>
-            <w:tcW w:type="dxa" w:w="1080"/>
-          </w:tcPr>
-          <w:p>
-            <w:r>
-              <w:rPr>
-                <w:sz w:val="18"/>
+            <w:tcW w:type="dxa" w:w="792"/>
+          </w:tcPr>
+          <w:p>
+            <w:pPr>
+              <w:spacing w:after="20" w:before="20"/>
+            </w:pPr>
+            <w:r>
+              <w:rPr>
+                <w:sz w:val="17"/>
               </w:rPr>
               <w:t>—</w:t>
             </w:r>
@@ -576,12 +622,15 @@
         </w:tc>
         <w:tc>
           <w:tcPr>
-            <w:tcW w:type="dxa" w:w="1080"/>
-          </w:tcPr>
-          <w:p>
-            <w:r>
-              <w:rPr>
-                <w:sz w:val="18"/>
+            <w:tcW w:type="dxa" w:w="792"/>
+          </w:tcPr>
+          <w:p>
+            <w:pPr>
+              <w:spacing w:after="20" w:before="20"/>
+            </w:pPr>
+            <w:r>
+              <w:rPr>
+                <w:sz w:val="17"/>
               </w:rPr>
               <w:t>A</w:t>
             </w:r>
@@ -591,12 +640,15 @@
       <w:tr>
         <w:tc>
           <w:tcPr>
-            <w:tcW w:type="dxa" w:w="1080"/>
-          </w:tcPr>
-          <w:p>
-            <w:r>
-              <w:rPr>
-                <w:sz w:val="18"/>
+            <w:tcW w:type="dxa" w:w="2232"/>
+          </w:tcPr>
+          <w:p>
+            <w:pPr>
+              <w:spacing w:after="20" w:before="20"/>
+            </w:pPr>
+            <w:r>
+              <w:rPr>
+                <w:sz w:val="17"/>
               </w:rPr>
               <w:t>U-Net (SMP)</w:t>
             </w:r>
@@ -604,12 +656,15 @@
         </w:tc>
         <w:tc>
           <w:tcPr>
-            <w:tcW w:type="dxa" w:w="1080"/>
-          </w:tcPr>
-          <w:p>
-            <w:r>
-              <w:rPr>
-                <w:sz w:val="18"/>
+            <w:tcW w:type="dxa" w:w="1368"/>
+          </w:tcPr>
+          <w:p>
+            <w:pPr>
+              <w:spacing w:after="20" w:before="20"/>
+            </w:pPr>
+            <w:r>
+              <w:rPr>
+                <w:sz w:val="17"/>
               </w:rPr>
               <w:t>CNN</w:t>
             </w:r>
@@ -617,12 +672,15 @@
         </w:tc>
         <w:tc>
           <w:tcPr>
-            <w:tcW w:type="dxa" w:w="1080"/>
-          </w:tcPr>
-          <w:p>
-            <w:r>
-              <w:rPr>
-                <w:sz w:val="18"/>
+            <w:tcW w:type="dxa" w:w="893"/>
+          </w:tcPr>
+          <w:p>
+            <w:pPr>
+              <w:spacing w:after="20" w:before="20"/>
+            </w:pPr>
+            <w:r>
+              <w:rPr>
+                <w:sz w:val="17"/>
               </w:rPr>
               <w:t>24.4M</w:t>
             </w:r>
@@ -630,12 +688,15 @@
         </w:tc>
         <w:tc>
           <w:tcPr>
-            <w:tcW w:type="dxa" w:w="1080"/>
-          </w:tcPr>
-          <w:p>
-            <w:r>
-              <w:rPr>
-                <w:sz w:val="18"/>
+            <w:tcW w:type="dxa" w:w="1037"/>
+          </w:tcPr>
+          <w:p>
+            <w:pPr>
+              <w:spacing w:after="20" w:before="20"/>
+            </w:pPr>
+            <w:r>
+              <w:rPr>
+                <w:sz w:val="17"/>
               </w:rPr>
               <w:t>143.9</w:t>
             </w:r>
@@ -643,12 +704,15 @@
         </w:tc>
         <w:tc>
           <w:tcPr>
-            <w:tcW w:type="dxa" w:w="1080"/>
-          </w:tcPr>
-          <w:p>
-            <w:r>
-              <w:rPr>
-                <w:sz w:val="18"/>
+            <w:tcW w:type="dxa" w:w="1325"/>
+          </w:tcPr>
+          <w:p>
+            <w:pPr>
+              <w:spacing w:after="20" w:before="20"/>
+            </w:pPr>
+            <w:r>
+              <w:rPr>
+                <w:sz w:val="17"/>
               </w:rPr>
               <w:t>0.509±0.028</w:t>
             </w:r>
@@ -656,12 +720,15 @@
         </w:tc>
         <w:tc>
           <w:tcPr>
-            <w:tcW w:type="dxa" w:w="1080"/>
-          </w:tcPr>
-          <w:p>
-            <w:r>
-              <w:rPr>
-                <w:sz w:val="18"/>
+            <w:tcW w:type="dxa" w:w="893"/>
+          </w:tcPr>
+          <w:p>
+            <w:pPr>
+              <w:spacing w:after="20" w:before="20"/>
+            </w:pPr>
+            <w:r>
+              <w:rPr>
+                <w:sz w:val="17"/>
               </w:rPr>
               <w:t>0.291</w:t>
             </w:r>
@@ -669,12 +736,15 @@
         </w:tc>
         <w:tc>
           <w:tcPr>
-            <w:tcW w:type="dxa" w:w="1080"/>
-          </w:tcPr>
-          <w:p>
-            <w:r>
-              <w:rPr>
-                <w:sz w:val="18"/>
+            <w:tcW w:type="dxa" w:w="792"/>
+          </w:tcPr>
+          <w:p>
+            <w:pPr>
+              <w:spacing w:after="20" w:before="20"/>
+            </w:pPr>
+            <w:r>
+              <w:rPr>
+                <w:sz w:val="17"/>
               </w:rPr>
               <w:t>—</w:t>
             </w:r>
@@ -682,12 +752,15 @@
         </w:tc>
         <w:tc>
           <w:tcPr>
-            <w:tcW w:type="dxa" w:w="1080"/>
-          </w:tcPr>
-          <w:p>
-            <w:r>
-              <w:rPr>
-                <w:sz w:val="18"/>
+            <w:tcW w:type="dxa" w:w="792"/>
+          </w:tcPr>
+          <w:p>
+            <w:pPr>
+              <w:spacing w:after="20" w:before="20"/>
+            </w:pPr>
+            <w:r>
+              <w:rPr>
+                <w:sz w:val="17"/>
               </w:rPr>
               <w:t>A</w:t>
             </w:r>
@@ -697,12 +770,15 @@
       <w:tr>
         <w:tc>
           <w:tcPr>
-            <w:tcW w:type="dxa" w:w="1080"/>
-          </w:tcPr>
-          <w:p>
-            <w:r>
-              <w:rPr>
-                <w:sz w:val="18"/>
+            <w:tcW w:type="dxa" w:w="2232"/>
+          </w:tcPr>
+          <w:p>
+            <w:pPr>
+              <w:spacing w:after="20" w:before="20"/>
+            </w:pPr>
+            <w:r>
+              <w:rPr>
+                <w:sz w:val="17"/>
               </w:rPr>
               <w:t>U-Net++</w:t>
             </w:r>
@@ -710,12 +786,15 @@
         </w:tc>
         <w:tc>
           <w:tcPr>
-            <w:tcW w:type="dxa" w:w="1080"/>
-          </w:tcPr>
-          <w:p>
-            <w:r>
-              <w:rPr>
-                <w:sz w:val="18"/>
+            <w:tcW w:type="dxa" w:w="1368"/>
+          </w:tcPr>
+          <w:p>
+            <w:pPr>
+              <w:spacing w:after="20" w:before="20"/>
+            </w:pPr>
+            <w:r>
+              <w:rPr>
+                <w:sz w:val="17"/>
               </w:rPr>
               <w:t>CNN</w:t>
             </w:r>
@@ -723,12 +802,15 @@
         </w:tc>
         <w:tc>
           <w:tcPr>
-            <w:tcW w:type="dxa" w:w="1080"/>
-          </w:tcPr>
-          <w:p>
-            <w:r>
-              <w:rPr>
-                <w:sz w:val="18"/>
+            <w:tcW w:type="dxa" w:w="893"/>
+          </w:tcPr>
+          <w:p>
+            <w:pPr>
+              <w:spacing w:after="20" w:before="20"/>
+            </w:pPr>
+            <w:r>
+              <w:rPr>
+                <w:sz w:val="17"/>
               </w:rPr>
               <w:t>26.1M</w:t>
             </w:r>
@@ -736,12 +818,15 @@
         </w:tc>
         <w:tc>
           <w:tcPr>
-            <w:tcW w:type="dxa" w:w="1080"/>
-          </w:tcPr>
-          <w:p>
-            <w:r>
-              <w:rPr>
-                <w:sz w:val="18"/>
+            <w:tcW w:type="dxa" w:w="1037"/>
+          </w:tcPr>
+          <w:p>
+            <w:pPr>
+              <w:spacing w:after="20" w:before="20"/>
+            </w:pPr>
+            <w:r>
+              <w:rPr>
+                <w:sz w:val="17"/>
               </w:rPr>
               <w:t>339.1</w:t>
             </w:r>
@@ -749,12 +834,15 @@
         </w:tc>
         <w:tc>
           <w:tcPr>
-            <w:tcW w:type="dxa" w:w="1080"/>
-          </w:tcPr>
-          <w:p>
-            <w:r>
-              <w:rPr>
-                <w:sz w:val="18"/>
+            <w:tcW w:type="dxa" w:w="1325"/>
+          </w:tcPr>
+          <w:p>
+            <w:pPr>
+              <w:spacing w:after="20" w:before="20"/>
+            </w:pPr>
+            <w:r>
+              <w:rPr>
+                <w:sz w:val="17"/>
               </w:rPr>
               <w:t>0.500±0.026</w:t>
             </w:r>
@@ -762,12 +850,15 @@
         </w:tc>
         <w:tc>
           <w:tcPr>
-            <w:tcW w:type="dxa" w:w="1080"/>
-          </w:tcPr>
-          <w:p>
-            <w:r>
-              <w:rPr>
-                <w:sz w:val="18"/>
+            <w:tcW w:type="dxa" w:w="893"/>
+          </w:tcPr>
+          <w:p>
+            <w:pPr>
+              <w:spacing w:after="20" w:before="20"/>
+            </w:pPr>
+            <w:r>
+              <w:rPr>
+                <w:sz w:val="17"/>
               </w:rPr>
               <w:t>0.264</w:t>
             </w:r>
@@ -775,12 +866,15 @@
         </w:tc>
         <w:tc>
           <w:tcPr>
-            <w:tcW w:type="dxa" w:w="1080"/>
-          </w:tcPr>
-          <w:p>
-            <w:r>
-              <w:rPr>
-                <w:sz w:val="18"/>
+            <w:tcW w:type="dxa" w:w="792"/>
+          </w:tcPr>
+          <w:p>
+            <w:pPr>
+              <w:spacing w:after="20" w:before="20"/>
+            </w:pPr>
+            <w:r>
+              <w:rPr>
+                <w:sz w:val="17"/>
               </w:rPr>
               <w:t>—</w:t>
             </w:r>
@@ -788,12 +882,15 @@
         </w:tc>
         <w:tc>
           <w:tcPr>
-            <w:tcW w:type="dxa" w:w="1080"/>
-          </w:tcPr>
-          <w:p>
-            <w:r>
-              <w:rPr>
-                <w:sz w:val="18"/>
+            <w:tcW w:type="dxa" w:w="792"/>
+          </w:tcPr>
+          <w:p>
+            <w:pPr>
+              <w:spacing w:after="20" w:before="20"/>
+            </w:pPr>
+            <w:r>
+              <w:rPr>
+                <w:sz w:val="17"/>
               </w:rPr>
               <w:t>A</w:t>
             </w:r>
@@ -803,12 +900,15 @@
       <w:tr>
         <w:tc>
           <w:tcPr>
-            <w:tcW w:type="dxa" w:w="1080"/>
-          </w:tcPr>
-          <w:p>
-            <w:r>
-              <w:rPr>
-                <w:sz w:val="18"/>
+            <w:tcW w:type="dxa" w:w="2232"/>
+          </w:tcPr>
+          <w:p>
+            <w:pPr>
+              <w:spacing w:after="20" w:before="20"/>
+            </w:pPr>
+            <w:r>
+              <w:rPr>
+                <w:sz w:val="17"/>
               </w:rPr>
               <w:t>MobileNet-UNet</w:t>
             </w:r>
@@ -816,12 +916,15 @@
         </w:tc>
         <w:tc>
           <w:tcPr>
-            <w:tcW w:type="dxa" w:w="1080"/>
-          </w:tcPr>
-          <w:p>
-            <w:r>
-              <w:rPr>
-                <w:sz w:val="18"/>
+            <w:tcW w:type="dxa" w:w="1368"/>
+          </w:tcPr>
+          <w:p>
+            <w:pPr>
+              <w:spacing w:after="20" w:before="20"/>
+            </w:pPr>
+            <w:r>
+              <w:rPr>
+                <w:sz w:val="17"/>
               </w:rPr>
               <w:t>CNN</w:t>
             </w:r>
@@ -829,12 +932,15 @@
         </w:tc>
         <w:tc>
           <w:tcPr>
-            <w:tcW w:type="dxa" w:w="1080"/>
-          </w:tcPr>
-          <w:p>
-            <w:r>
-              <w:rPr>
-                <w:sz w:val="18"/>
+            <w:tcW w:type="dxa" w:w="893"/>
+          </w:tcPr>
+          <w:p>
+            <w:pPr>
+              <w:spacing w:after="20" w:before="20"/>
+            </w:pPr>
+            <w:r>
+              <w:rPr>
+                <w:sz w:val="17"/>
               </w:rPr>
               <w:t>6.6M</w:t>
             </w:r>
@@ -842,12 +948,15 @@
         </w:tc>
         <w:tc>
           <w:tcPr>
-            <w:tcW w:type="dxa" w:w="1080"/>
-          </w:tcPr>
-          <w:p>
-            <w:r>
-              <w:rPr>
-                <w:sz w:val="18"/>
+            <w:tcW w:type="dxa" w:w="1037"/>
+          </w:tcPr>
+          <w:p>
+            <w:pPr>
+              <w:spacing w:after="20" w:before="20"/>
+            </w:pPr>
+            <w:r>
+              <w:rPr>
+                <w:sz w:val="17"/>
               </w:rPr>
               <w:t>62.7</w:t>
             </w:r>
@@ -855,12 +964,15 @@
         </w:tc>
         <w:tc>
           <w:tcPr>
-            <w:tcW w:type="dxa" w:w="1080"/>
-          </w:tcPr>
-          <w:p>
-            <w:r>
-              <w:rPr>
-                <w:sz w:val="18"/>
+            <w:tcW w:type="dxa" w:w="1325"/>
+          </w:tcPr>
+          <w:p>
+            <w:pPr>
+              <w:spacing w:after="20" w:before="20"/>
+            </w:pPr>
+            <w:r>
+              <w:rPr>
+                <w:sz w:val="17"/>
               </w:rPr>
               <w:t>0.498±0.007</w:t>
             </w:r>
@@ -868,12 +980,15 @@
         </w:tc>
         <w:tc>
           <w:tcPr>
-            <w:tcW w:type="dxa" w:w="1080"/>
-          </w:tcPr>
-          <w:p>
-            <w:r>
-              <w:rPr>
-                <w:sz w:val="18"/>
+            <w:tcW w:type="dxa" w:w="893"/>
+          </w:tcPr>
+          <w:p>
+            <w:pPr>
+              <w:spacing w:after="20" w:before="20"/>
+            </w:pPr>
+            <w:r>
+              <w:rPr>
+                <w:sz w:val="17"/>
               </w:rPr>
               <w:t>0.272</w:t>
             </w:r>
@@ -881,12 +996,15 @@
         </w:tc>
         <w:tc>
           <w:tcPr>
-            <w:tcW w:type="dxa" w:w="1080"/>
-          </w:tcPr>
-          <w:p>
-            <w:r>
-              <w:rPr>
-                <w:sz w:val="18"/>
+            <w:tcW w:type="dxa" w:w="792"/>
+          </w:tcPr>
+          <w:p>
+            <w:pPr>
+              <w:spacing w:after="20" w:before="20"/>
+            </w:pPr>
+            <w:r>
+              <w:rPr>
+                <w:sz w:val="17"/>
               </w:rPr>
               <w:t>—</w:t>
             </w:r>
@@ -894,12 +1012,15 @@
         </w:tc>
         <w:tc>
           <w:tcPr>
-            <w:tcW w:type="dxa" w:w="1080"/>
-          </w:tcPr>
-          <w:p>
-            <w:r>
-              <w:rPr>
-                <w:sz w:val="18"/>
+            <w:tcW w:type="dxa" w:w="792"/>
+          </w:tcPr>
+          <w:p>
+            <w:pPr>
+              <w:spacing w:after="20" w:before="20"/>
+            </w:pPr>
+            <w:r>
+              <w:rPr>
+                <w:sz w:val="17"/>
               </w:rPr>
               <w:t>A</w:t>
             </w:r>
@@ -909,12 +1030,15 @@
       <w:tr>
         <w:tc>
           <w:tcPr>
-            <w:tcW w:type="dxa" w:w="1080"/>
-          </w:tcPr>
-          <w:p>
-            <w:r>
-              <w:rPr>
-                <w:sz w:val="18"/>
+            <w:tcW w:type="dxa" w:w="2232"/>
+          </w:tcPr>
+          <w:p>
+            <w:pPr>
+              <w:spacing w:after="20" w:before="20"/>
+            </w:pPr>
+            <w:r>
+              <w:rPr>
+                <w:sz w:val="17"/>
               </w:rPr>
               <w:t>MobileNet-UNet INT8</w:t>
             </w:r>
@@ -922,12 +1046,15 @@
         </w:tc>
         <w:tc>
           <w:tcPr>
-            <w:tcW w:type="dxa" w:w="1080"/>
-          </w:tcPr>
-          <w:p>
-            <w:r>
-              <w:rPr>
-                <w:sz w:val="18"/>
+            <w:tcW w:type="dxa" w:w="1368"/>
+          </w:tcPr>
+          <w:p>
+            <w:pPr>
+              <w:spacing w:after="20" w:before="20"/>
+            </w:pPr>
+            <w:r>
+              <w:rPr>
+                <w:sz w:val="17"/>
               </w:rPr>
               <w:t>Quantized</w:t>
             </w:r>
@@ -935,12 +1062,15 @@
         </w:tc>
         <w:tc>
           <w:tcPr>
-            <w:tcW w:type="dxa" w:w="1080"/>
-          </w:tcPr>
-          <w:p>
-            <w:r>
-              <w:rPr>
-                <w:sz w:val="18"/>
+            <w:tcW w:type="dxa" w:w="893"/>
+          </w:tcPr>
+          <w:p>
+            <w:pPr>
+              <w:spacing w:after="20" w:before="20"/>
+            </w:pPr>
+            <w:r>
+              <w:rPr>
+                <w:sz w:val="17"/>
               </w:rPr>
               <w:t>6.6M</w:t>
             </w:r>
@@ -948,12 +1078,15 @@
         </w:tc>
         <w:tc>
           <w:tcPr>
-            <w:tcW w:type="dxa" w:w="1080"/>
-          </w:tcPr>
-          <w:p>
-            <w:r>
-              <w:rPr>
-                <w:sz w:val="18"/>
+            <w:tcW w:type="dxa" w:w="1037"/>
+          </w:tcPr>
+          <w:p>
+            <w:pPr>
+              <w:spacing w:after="20" w:before="20"/>
+            </w:pPr>
+            <w:r>
+              <w:rPr>
+                <w:sz w:val="17"/>
               </w:rPr>
               <w:t>3.1</w:t>
             </w:r>
@@ -961,12 +1094,15 @@
         </w:tc>
         <w:tc>
           <w:tcPr>
-            <w:tcW w:type="dxa" w:w="1080"/>
-          </w:tcPr>
-          <w:p>
-            <w:r>
-              <w:rPr>
-                <w:sz w:val="18"/>
+            <w:tcW w:type="dxa" w:w="1325"/>
+          </w:tcPr>
+          <w:p>
+            <w:pPr>
+              <w:spacing w:after="20" w:before="20"/>
+            </w:pPr>
+            <w:r>
+              <w:rPr>
+                <w:sz w:val="17"/>
               </w:rPr>
               <w:t>0.490±0.003</w:t>
             </w:r>
@@ -974,12 +1110,15 @@
         </w:tc>
         <w:tc>
           <w:tcPr>
-            <w:tcW w:type="dxa" w:w="1080"/>
-          </w:tcPr>
-          <w:p>
-            <w:r>
-              <w:rPr>
-                <w:sz w:val="18"/>
+            <w:tcW w:type="dxa" w:w="893"/>
+          </w:tcPr>
+          <w:p>
+            <w:pPr>
+              <w:spacing w:after="20" w:before="20"/>
+            </w:pPr>
+            <w:r>
+              <w:rPr>
+                <w:sz w:val="17"/>
               </w:rPr>
               <w:t>0.258</w:t>
             </w:r>
@@ -987,12 +1126,15 @@
         </w:tc>
         <w:tc>
           <w:tcPr>
-            <w:tcW w:type="dxa" w:w="1080"/>
-          </w:tcPr>
-          <w:p>
-            <w:r>
-              <w:rPr>
-                <w:sz w:val="18"/>
+            <w:tcW w:type="dxa" w:w="792"/>
+          </w:tcPr>
+          <w:p>
+            <w:pPr>
+              <w:spacing w:after="20" w:before="20"/>
+            </w:pPr>
+            <w:r>
+              <w:rPr>
+                <w:sz w:val="17"/>
               </w:rPr>
               <w:t>—</w:t>
             </w:r>
@@ -1000,12 +1142,15 @@
         </w:tc>
         <w:tc>
           <w:tcPr>
-            <w:tcW w:type="dxa" w:w="1080"/>
-          </w:tcPr>
-          <w:p>
-            <w:r>
-              <w:rPr>
-                <w:sz w:val="18"/>
+            <w:tcW w:type="dxa" w:w="792"/>
+          </w:tcPr>
+          <w:p>
+            <w:pPr>
+              <w:spacing w:after="20" w:before="20"/>
+            </w:pPr>
+            <w:r>
+              <w:rPr>
+                <w:sz w:val="17"/>
               </w:rPr>
               <w:t>B</w:t>
             </w:r>
@@ -1015,12 +1160,15 @@
       <w:tr>
         <w:tc>
           <w:tcPr>
-            <w:tcW w:type="dxa" w:w="1080"/>
-          </w:tcPr>
-          <w:p>
-            <w:r>
-              <w:rPr>
-                <w:sz w:val="18"/>
+            <w:tcW w:type="dxa" w:w="2232"/>
+          </w:tcPr>
+          <w:p>
+            <w:pPr>
+              <w:spacing w:after="20" w:before="20"/>
+            </w:pPr>
+            <w:r>
+              <w:rPr>
+                <w:sz w:val="17"/>
               </w:rPr>
               <w:t>U-Net (vanilla)</w:t>
             </w:r>
@@ -1028,12 +1176,15 @@
         </w:tc>
         <w:tc>
           <w:tcPr>
-            <w:tcW w:type="dxa" w:w="1080"/>
-          </w:tcPr>
-          <w:p>
-            <w:r>
-              <w:rPr>
-                <w:sz w:val="18"/>
+            <w:tcW w:type="dxa" w:w="1368"/>
+          </w:tcPr>
+          <w:p>
+            <w:pPr>
+              <w:spacing w:after="20" w:before="20"/>
+            </w:pPr>
+            <w:r>
+              <w:rPr>
+                <w:sz w:val="17"/>
               </w:rPr>
               <w:t>CNN</w:t>
             </w:r>
@@ -1041,12 +1192,15 @@
         </w:tc>
         <w:tc>
           <w:tcPr>
-            <w:tcW w:type="dxa" w:w="1080"/>
-          </w:tcPr>
-          <w:p>
-            <w:r>
-              <w:rPr>
-                <w:sz w:val="18"/>
+            <w:tcW w:type="dxa" w:w="893"/>
+          </w:tcPr>
+          <w:p>
+            <w:pPr>
+              <w:spacing w:after="20" w:before="20"/>
+            </w:pPr>
+            <w:r>
+              <w:rPr>
+                <w:sz w:val="17"/>
               </w:rPr>
               <w:t>7.8M</w:t>
             </w:r>
@@ -1054,12 +1208,15 @@
         </w:tc>
         <w:tc>
           <w:tcPr>
-            <w:tcW w:type="dxa" w:w="1080"/>
-          </w:tcPr>
-          <w:p>
-            <w:r>
-              <w:rPr>
-                <w:sz w:val="18"/>
+            <w:tcW w:type="dxa" w:w="1037"/>
+          </w:tcPr>
+          <w:p>
+            <w:pPr>
+              <w:spacing w:after="20" w:before="20"/>
+            </w:pPr>
+            <w:r>
+              <w:rPr>
+                <w:sz w:val="17"/>
               </w:rPr>
               <w:t>223.2</w:t>
             </w:r>
@@ -1067,12 +1224,15 @@
         </w:tc>
         <w:tc>
           <w:tcPr>
-            <w:tcW w:type="dxa" w:w="1080"/>
-          </w:tcPr>
-          <w:p>
-            <w:r>
-              <w:rPr>
-                <w:sz w:val="18"/>
+            <w:tcW w:type="dxa" w:w="1325"/>
+          </w:tcPr>
+          <w:p>
+            <w:pPr>
+              <w:spacing w:after="20" w:before="20"/>
+            </w:pPr>
+            <w:r>
+              <w:rPr>
+                <w:sz w:val="17"/>
               </w:rPr>
               <w:t>0.482±0.019</w:t>
             </w:r>
@@ -1080,12 +1240,15 @@
         </w:tc>
         <w:tc>
           <w:tcPr>
-            <w:tcW w:type="dxa" w:w="1080"/>
-          </w:tcPr>
-          <w:p>
-            <w:r>
-              <w:rPr>
-                <w:sz w:val="18"/>
+            <w:tcW w:type="dxa" w:w="893"/>
+          </w:tcPr>
+          <w:p>
+            <w:pPr>
+              <w:spacing w:after="20" w:before="20"/>
+            </w:pPr>
+            <w:r>
+              <w:rPr>
+                <w:sz w:val="17"/>
               </w:rPr>
               <w:t>0.306</w:t>
             </w:r>
@@ -1093,12 +1256,15 @@
         </w:tc>
         <w:tc>
           <w:tcPr>
-            <w:tcW w:type="dxa" w:w="1080"/>
-          </w:tcPr>
-          <w:p>
-            <w:r>
-              <w:rPr>
-                <w:sz w:val="18"/>
+            <w:tcW w:type="dxa" w:w="792"/>
+          </w:tcPr>
+          <w:p>
+            <w:pPr>
+              <w:spacing w:after="20" w:before="20"/>
+            </w:pPr>
+            <w:r>
+              <w:rPr>
+                <w:sz w:val="17"/>
               </w:rPr>
               <w:t>—</w:t>
             </w:r>
@@ -1106,12 +1272,15 @@
         </w:tc>
         <w:tc>
           <w:tcPr>
-            <w:tcW w:type="dxa" w:w="1080"/>
-          </w:tcPr>
-          <w:p>
-            <w:r>
-              <w:rPr>
-                <w:sz w:val="18"/>
+            <w:tcW w:type="dxa" w:w="792"/>
+          </w:tcPr>
+          <w:p>
+            <w:pPr>
+              <w:spacing w:after="20" w:before="20"/>
+            </w:pPr>
+            <w:r>
+              <w:rPr>
+                <w:sz w:val="17"/>
               </w:rPr>
               <w:t>A</w:t>
             </w:r>
@@ -1121,12 +1290,15 @@
       <w:tr>
         <w:tc>
           <w:tcPr>
-            <w:tcW w:type="dxa" w:w="1080"/>
-          </w:tcPr>
-          <w:p>
-            <w:r>
-              <w:rPr>
-                <w:sz w:val="18"/>
+            <w:tcW w:type="dxa" w:w="2232"/>
+          </w:tcPr>
+          <w:p>
+            <w:pPr>
+              <w:spacing w:after="20" w:before="20"/>
+            </w:pPr>
+            <w:r>
+              <w:rPr>
+                <w:sz w:val="17"/>
               </w:rPr>
               <w:t>SNN-Flood T2</w:t>
             </w:r>
@@ -1134,12 +1306,15 @@
         </w:tc>
         <w:tc>
           <w:tcPr>
-            <w:tcW w:type="dxa" w:w="1080"/>
-          </w:tcPr>
-          <w:p>
-            <w:r>
-              <w:rPr>
-                <w:sz w:val="18"/>
+            <w:tcW w:type="dxa" w:w="1368"/>
+          </w:tcPr>
+          <w:p>
+            <w:pPr>
+              <w:spacing w:after="20" w:before="20"/>
+            </w:pPr>
+            <w:r>
+              <w:rPr>
+                <w:sz w:val="17"/>
               </w:rPr>
               <w:t>SNN</w:t>
             </w:r>
@@ -1147,12 +1322,15 @@
         </w:tc>
         <w:tc>
           <w:tcPr>
-            <w:tcW w:type="dxa" w:w="1080"/>
-          </w:tcPr>
-          <w:p>
-            <w:r>
-              <w:rPr>
-                <w:sz w:val="18"/>
+            <w:tcW w:type="dxa" w:w="893"/>
+          </w:tcPr>
+          <w:p>
+            <w:pPr>
+              <w:spacing w:after="20" w:before="20"/>
+            </w:pPr>
+            <w:r>
+              <w:rPr>
+                <w:sz w:val="17"/>
               </w:rPr>
               <w:t>7.8M</w:t>
             </w:r>
@@ -1160,12 +1338,15 @@
         </w:tc>
         <w:tc>
           <w:tcPr>
-            <w:tcW w:type="dxa" w:w="1080"/>
-          </w:tcPr>
-          <w:p>
-            <w:r>
-              <w:rPr>
-                <w:sz w:val="18"/>
+            <w:tcW w:type="dxa" w:w="1037"/>
+          </w:tcPr>
+          <w:p>
+            <w:pPr>
+              <w:spacing w:after="20" w:before="20"/>
+            </w:pPr>
+            <w:r>
+              <w:rPr>
+                <w:sz w:val="17"/>
               </w:rPr>
               <w:t>31.4</w:t>
             </w:r>
@@ -1173,12 +1354,15 @@
         </w:tc>
         <w:tc>
           <w:tcPr>
-            <w:tcW w:type="dxa" w:w="1080"/>
-          </w:tcPr>
-          <w:p>
-            <w:r>
-              <w:rPr>
-                <w:sz w:val="18"/>
+            <w:tcW w:type="dxa" w:w="1325"/>
+          </w:tcPr>
+          <w:p>
+            <w:pPr>
+              <w:spacing w:after="20" w:before="20"/>
+            </w:pPr>
+            <w:r>
+              <w:rPr>
+                <w:sz w:val="17"/>
               </w:rPr>
               <w:t>0.391±0.045</w:t>
             </w:r>
@@ -1186,12 +1370,15 @@
         </w:tc>
         <w:tc>
           <w:tcPr>
-            <w:tcW w:type="dxa" w:w="1080"/>
-          </w:tcPr>
-          <w:p>
-            <w:r>
-              <w:rPr>
-                <w:sz w:val="18"/>
+            <w:tcW w:type="dxa" w:w="893"/>
+          </w:tcPr>
+          <w:p>
+            <w:pPr>
+              <w:spacing w:after="20" w:before="20"/>
+            </w:pPr>
+            <w:r>
+              <w:rPr>
+                <w:sz w:val="17"/>
               </w:rPr>
               <w:t>0.240</w:t>
             </w:r>
@@ -1199,12 +1386,15 @@
         </w:tc>
         <w:tc>
           <w:tcPr>
-            <w:tcW w:type="dxa" w:w="1080"/>
-          </w:tcPr>
-          <w:p>
-            <w:r>
-              <w:rPr>
-                <w:sz w:val="18"/>
+            <w:tcW w:type="dxa" w:w="792"/>
+          </w:tcPr>
+          <w:p>
+            <w:pPr>
+              <w:spacing w:after="20" w:before="20"/>
+            </w:pPr>
+            <w:r>
+              <w:rPr>
+                <w:sz w:val="17"/>
               </w:rPr>
               <w:t>13.6</w:t>
             </w:r>
@@ -1212,12 +1402,15 @@
         </w:tc>
         <w:tc>
           <w:tcPr>
-            <w:tcW w:type="dxa" w:w="1080"/>
-          </w:tcPr>
-          <w:p>
-            <w:r>
-              <w:rPr>
-                <w:sz w:val="18"/>
+            <w:tcW w:type="dxa" w:w="792"/>
+          </w:tcPr>
+          <w:p>
+            <w:pPr>
+              <w:spacing w:after="20" w:before="20"/>
+            </w:pPr>
+            <w:r>
+              <w:rPr>
+                <w:sz w:val="17"/>
               </w:rPr>
               <w:t>B</w:t>
             </w:r>
@@ -1227,12 +1420,15 @@
       <w:tr>
         <w:tc>
           <w:tcPr>
-            <w:tcW w:type="dxa" w:w="1080"/>
-          </w:tcPr>
-          <w:p>
-            <w:r>
-              <w:rPr>
-                <w:sz w:val="18"/>
+            <w:tcW w:type="dxa" w:w="2232"/>
+          </w:tcPr>
+          <w:p>
+            <w:pPr>
+              <w:spacing w:after="20" w:before="20"/>
+            </w:pPr>
+            <w:r>
+              <w:rPr>
+                <w:sz w:val="17"/>
               </w:rPr>
               <w:t>SNN-Flood T8</w:t>
             </w:r>
@@ -1240,12 +1436,15 @@
         </w:tc>
         <w:tc>
           <w:tcPr>
-            <w:tcW w:type="dxa" w:w="1080"/>
-          </w:tcPr>
-          <w:p>
-            <w:r>
-              <w:rPr>
-                <w:sz w:val="18"/>
+            <w:tcW w:type="dxa" w:w="1368"/>
+          </w:tcPr>
+          <w:p>
+            <w:pPr>
+              <w:spacing w:after="20" w:before="20"/>
+            </w:pPr>
+            <w:r>
+              <w:rPr>
+                <w:sz w:val="17"/>
               </w:rPr>
               <w:t>SNN</w:t>
             </w:r>
@@ -1253,12 +1452,15 @@
         </w:tc>
         <w:tc>
           <w:tcPr>
-            <w:tcW w:type="dxa" w:w="1080"/>
-          </w:tcPr>
-          <w:p>
-            <w:r>
-              <w:rPr>
-                <w:sz w:val="18"/>
+            <w:tcW w:type="dxa" w:w="893"/>
+          </w:tcPr>
+          <w:p>
+            <w:pPr>
+              <w:spacing w:after="20" w:before="20"/>
+            </w:pPr>
+            <w:r>
+              <w:rPr>
+                <w:sz w:val="17"/>
               </w:rPr>
               <w:t>7.8M</w:t>
             </w:r>
@@ -1266,12 +1468,15 @@
         </w:tc>
         <w:tc>
           <w:tcPr>
-            <w:tcW w:type="dxa" w:w="1080"/>
-          </w:tcPr>
-          <w:p>
-            <w:r>
-              <w:rPr>
-                <w:sz w:val="18"/>
+            <w:tcW w:type="dxa" w:w="1037"/>
+          </w:tcPr>
+          <w:p>
+            <w:pPr>
+              <w:spacing w:after="20" w:before="20"/>
+            </w:pPr>
+            <w:r>
+              <w:rPr>
+                <w:sz w:val="17"/>
               </w:rPr>
               <w:t>166.8</w:t>
             </w:r>
@@ -1279,12 +1484,15 @@
         </w:tc>
         <w:tc>
           <w:tcPr>
-            <w:tcW w:type="dxa" w:w="1080"/>
-          </w:tcPr>
-          <w:p>
-            <w:r>
-              <w:rPr>
-                <w:sz w:val="18"/>
+            <w:tcW w:type="dxa" w:w="1325"/>
+          </w:tcPr>
+          <w:p>
+            <w:pPr>
+              <w:spacing w:after="20" w:before="20"/>
+            </w:pPr>
+            <w:r>
+              <w:rPr>
+                <w:sz w:val="17"/>
               </w:rPr>
               <w:t>0.388±0.030</w:t>
             </w:r>
@@ -1292,12 +1500,15 @@
         </w:tc>
         <w:tc>
           <w:tcPr>
-            <w:tcW w:type="dxa" w:w="1080"/>
-          </w:tcPr>
-          <w:p>
-            <w:r>
-              <w:rPr>
-                <w:sz w:val="18"/>
+            <w:tcW w:type="dxa" w:w="893"/>
+          </w:tcPr>
+          <w:p>
+            <w:pPr>
+              <w:spacing w:after="20" w:before="20"/>
+            </w:pPr>
+            <w:r>
+              <w:rPr>
+                <w:sz w:val="17"/>
               </w:rPr>
               <w:t>0.246</w:t>
             </w:r>
@@ -1305,12 +1516,15 @@
         </w:tc>
         <w:tc>
           <w:tcPr>
-            <w:tcW w:type="dxa" w:w="1080"/>
-          </w:tcPr>
-          <w:p>
-            <w:r>
-              <w:rPr>
-                <w:sz w:val="18"/>
+            <w:tcW w:type="dxa" w:w="792"/>
+          </w:tcPr>
+          <w:p>
+            <w:pPr>
+              <w:spacing w:after="20" w:before="20"/>
+            </w:pPr>
+            <w:r>
+              <w:rPr>
+                <w:sz w:val="17"/>
               </w:rPr>
               <w:t>23.8</w:t>
             </w:r>
@@ -1318,12 +1532,15 @@
         </w:tc>
         <w:tc>
           <w:tcPr>
-            <w:tcW w:type="dxa" w:w="1080"/>
-          </w:tcPr>
-          <w:p>
-            <w:r>
-              <w:rPr>
-                <w:sz w:val="18"/>
+            <w:tcW w:type="dxa" w:w="792"/>
+          </w:tcPr>
+          <w:p>
+            <w:pPr>
+              <w:spacing w:after="20" w:before="20"/>
+            </w:pPr>
+            <w:r>
+              <w:rPr>
+                <w:sz w:val="17"/>
               </w:rPr>
               <w:t>B</w:t>
             </w:r>
@@ -1333,12 +1550,15 @@
       <w:tr>
         <w:tc>
           <w:tcPr>
-            <w:tcW w:type="dxa" w:w="1080"/>
-          </w:tcPr>
-          <w:p>
-            <w:r>
-              <w:rPr>
-                <w:sz w:val="18"/>
+            <w:tcW w:type="dxa" w:w="2232"/>
+          </w:tcPr>
+          <w:p>
+            <w:pPr>
+              <w:spacing w:after="20" w:before="20"/>
+            </w:pPr>
+            <w:r>
+              <w:rPr>
+                <w:sz w:val="17"/>
               </w:rPr>
               <w:t>ANN2SNN (T=128)</w:t>
             </w:r>
@@ -1346,12 +1566,15 @@
         </w:tc>
         <w:tc>
           <w:tcPr>
-            <w:tcW w:type="dxa" w:w="1080"/>
-          </w:tcPr>
-          <w:p>
-            <w:r>
-              <w:rPr>
-                <w:sz w:val="18"/>
+            <w:tcW w:type="dxa" w:w="1368"/>
+          </w:tcPr>
+          <w:p>
+            <w:pPr>
+              <w:spacing w:after="20" w:before="20"/>
+            </w:pPr>
+            <w:r>
+              <w:rPr>
+                <w:sz w:val="17"/>
               </w:rPr>
               <w:t>SNN</w:t>
             </w:r>
@@ -1359,12 +1582,15 @@
         </w:tc>
         <w:tc>
           <w:tcPr>
-            <w:tcW w:type="dxa" w:w="1080"/>
-          </w:tcPr>
-          <w:p>
-            <w:r>
-              <w:rPr>
-                <w:sz w:val="18"/>
+            <w:tcW w:type="dxa" w:w="893"/>
+          </w:tcPr>
+          <w:p>
+            <w:pPr>
+              <w:spacing w:after="20" w:before="20"/>
+            </w:pPr>
+            <w:r>
+              <w:rPr>
+                <w:sz w:val="17"/>
               </w:rPr>
               <w:t>24.4M</w:t>
             </w:r>
@@ -1372,12 +1598,15 @@
         </w:tc>
         <w:tc>
           <w:tcPr>
-            <w:tcW w:type="dxa" w:w="1080"/>
-          </w:tcPr>
-          <w:p>
-            <w:r>
-              <w:rPr>
-                <w:sz w:val="18"/>
+            <w:tcW w:type="dxa" w:w="1037"/>
+          </w:tcPr>
+          <w:p>
+            <w:pPr>
+              <w:spacing w:after="20" w:before="20"/>
+            </w:pPr>
+            <w:r>
+              <w:rPr>
+                <w:sz w:val="17"/>
               </w:rPr>
               <w:t>440.4</w:t>
             </w:r>
@@ -1385,12 +1614,15 @@
         </w:tc>
         <w:tc>
           <w:tcPr>
-            <w:tcW w:type="dxa" w:w="1080"/>
-          </w:tcPr>
-          <w:p>
-            <w:r>
-              <w:rPr>
-                <w:sz w:val="18"/>
+            <w:tcW w:type="dxa" w:w="1325"/>
+          </w:tcPr>
+          <w:p>
+            <w:pPr>
+              <w:spacing w:after="20" w:before="20"/>
+            </w:pPr>
+            <w:r>
+              <w:rPr>
+                <w:sz w:val="17"/>
               </w:rPr>
               <w:t>0.290±0.062</w:t>
             </w:r>
@@ -1398,12 +1630,15 @@
         </w:tc>
         <w:tc>
           <w:tcPr>
-            <w:tcW w:type="dxa" w:w="1080"/>
-          </w:tcPr>
-          <w:p>
-            <w:r>
-              <w:rPr>
-                <w:sz w:val="18"/>
+            <w:tcW w:type="dxa" w:w="893"/>
+          </w:tcPr>
+          <w:p>
+            <w:pPr>
+              <w:spacing w:after="20" w:before="20"/>
+            </w:pPr>
+            <w:r>
+              <w:rPr>
+                <w:sz w:val="17"/>
               </w:rPr>
               <w:t>0.196</w:t>
             </w:r>
@@ -1411,12 +1646,15 @@
         </w:tc>
         <w:tc>
           <w:tcPr>
-            <w:tcW w:type="dxa" w:w="1080"/>
-          </w:tcPr>
-          <w:p>
-            <w:r>
-              <w:rPr>
-                <w:sz w:val="18"/>
+            <w:tcW w:type="dxa" w:w="792"/>
+          </w:tcPr>
+          <w:p>
+            <w:pPr>
+              <w:spacing w:after="20" w:before="20"/>
+            </w:pPr>
+            <w:r>
+              <w:rPr>
+                <w:sz w:val="17"/>
               </w:rPr>
               <w:t>10.6</w:t>
             </w:r>
@@ -1424,12 +1662,15 @@
         </w:tc>
         <w:tc>
           <w:tcPr>
-            <w:tcW w:type="dxa" w:w="1080"/>
-          </w:tcPr>
-          <w:p>
-            <w:r>
-              <w:rPr>
-                <w:sz w:val="18"/>
+            <w:tcW w:type="dxa" w:w="792"/>
+          </w:tcPr>
+          <w:p>
+            <w:pPr>
+              <w:spacing w:after="20" w:before="20"/>
+            </w:pPr>
+            <w:r>
+              <w:rPr>
+                <w:sz w:val="17"/>
               </w:rPr>
               <w:t>C</w:t>
             </w:r>
@@ -1439,12 +1680,15 @@
       <w:tr>
         <w:tc>
           <w:tcPr>
-            <w:tcW w:type="dxa" w:w="1080"/>
-          </w:tcPr>
-          <w:p>
-            <w:r>
-              <w:rPr>
-                <w:sz w:val="18"/>
+            <w:tcW w:type="dxa" w:w="2232"/>
+          </w:tcPr>
+          <w:p>
+            <w:pPr>
+              <w:spacing w:after="20" w:before="20"/>
+            </w:pPr>
+            <w:r>
+              <w:rPr>
+                <w:sz w:val="17"/>
               </w:rPr>
               <w:t>DeepLabV3</w:t>
             </w:r>
@@ -1452,12 +1696,15 @@
         </w:tc>
         <w:tc>
           <w:tcPr>
-            <w:tcW w:type="dxa" w:w="1080"/>
-          </w:tcPr>
-          <w:p>
-            <w:r>
-              <w:rPr>
-                <w:sz w:val="18"/>
+            <w:tcW w:type="dxa" w:w="1368"/>
+          </w:tcPr>
+          <w:p>
+            <w:pPr>
+              <w:spacing w:after="20" w:before="20"/>
+            </w:pPr>
+            <w:r>
+              <w:rPr>
+                <w:sz w:val="17"/>
               </w:rPr>
               <w:t>CNN</w:t>
             </w:r>
@@ -1465,12 +1712,15 @@
         </w:tc>
         <w:tc>
           <w:tcPr>
-            <w:tcW w:type="dxa" w:w="1080"/>
-          </w:tcPr>
-          <w:p>
-            <w:r>
-              <w:rPr>
-                <w:sz w:val="18"/>
+            <w:tcW w:type="dxa" w:w="893"/>
+          </w:tcPr>
+          <w:p>
+            <w:pPr>
+              <w:spacing w:after="20" w:before="20"/>
+            </w:pPr>
+            <w:r>
+              <w:rPr>
+                <w:sz w:val="17"/>
               </w:rPr>
               <w:t>26.0M</w:t>
             </w:r>
@@ -1478,12 +1728,15 @@
         </w:tc>
         <w:tc>
           <w:tcPr>
-            <w:tcW w:type="dxa" w:w="1080"/>
-          </w:tcPr>
-          <w:p>
-            <w:r>
-              <w:rPr>
-                <w:sz w:val="18"/>
+            <w:tcW w:type="dxa" w:w="1037"/>
+          </w:tcPr>
+          <w:p>
+            <w:pPr>
+              <w:spacing w:after="20" w:before="20"/>
+            </w:pPr>
+            <w:r>
+              <w:rPr>
+                <w:sz w:val="17"/>
               </w:rPr>
               <w:t>502.3</w:t>
             </w:r>
@@ -1491,12 +1744,15 @@
         </w:tc>
         <w:tc>
           <w:tcPr>
-            <w:tcW w:type="dxa" w:w="1080"/>
-          </w:tcPr>
-          <w:p>
-            <w:r>
-              <w:rPr>
-                <w:sz w:val="18"/>
+            <w:tcW w:type="dxa" w:w="1325"/>
+          </w:tcPr>
+          <w:p>
+            <w:pPr>
+              <w:spacing w:after="20" w:before="20"/>
+            </w:pPr>
+            <w:r>
+              <w:rPr>
+                <w:sz w:val="17"/>
               </w:rPr>
               <w:t>0.419±0.014</w:t>
             </w:r>
@@ -1504,12 +1760,15 @@
         </w:tc>
         <w:tc>
           <w:tcPr>
-            <w:tcW w:type="dxa" w:w="1080"/>
-          </w:tcPr>
-          <w:p>
-            <w:r>
-              <w:rPr>
-                <w:sz w:val="18"/>
+            <w:tcW w:type="dxa" w:w="893"/>
+          </w:tcPr>
+          <w:p>
+            <w:pPr>
+              <w:spacing w:after="20" w:before="20"/>
+            </w:pPr>
+            <w:r>
+              <w:rPr>
+                <w:sz w:val="17"/>
               </w:rPr>
               <w:t>0.127</w:t>
             </w:r>
@@ -1517,12 +1776,15 @@
         </w:tc>
         <w:tc>
           <w:tcPr>
-            <w:tcW w:type="dxa" w:w="1080"/>
-          </w:tcPr>
-          <w:p>
-            <w:r>
-              <w:rPr>
-                <w:sz w:val="18"/>
+            <w:tcW w:type="dxa" w:w="792"/>
+          </w:tcPr>
+          <w:p>
+            <w:pPr>
+              <w:spacing w:after="20" w:before="20"/>
+            </w:pPr>
+            <w:r>
+              <w:rPr>
+                <w:sz w:val="17"/>
               </w:rPr>
               <w:t>—</w:t>
             </w:r>
@@ -1530,12 +1792,15 @@
         </w:tc>
         <w:tc>
           <w:tcPr>
-            <w:tcW w:type="dxa" w:w="1080"/>
-          </w:tcPr>
-          <w:p>
-            <w:r>
-              <w:rPr>
-                <w:sz w:val="18"/>
+            <w:tcW w:type="dxa" w:w="792"/>
+          </w:tcPr>
+          <w:p>
+            <w:pPr>
+              <w:spacing w:after="20" w:before="20"/>
+            </w:pPr>
+            <w:r>
+              <w:rPr>
+                <w:sz w:val="17"/>
               </w:rPr>
               <w:t>weak</w:t>
             </w:r>
@@ -2056,6 +2321,7 @@
       <w:tblPr>
         <w:tblStyle w:val="LightGrid-Accent1"/>
         <w:tblW w:type="auto" w:w="0"/>
+        <w:tblLayout w:type="fixed"/>
         <w:tblLook w:firstColumn="1" w:firstRow="1" w:lastColumn="0" w:lastRow="0" w:noHBand="0" w:noVBand="1" w:val="04A0"/>
       </w:tblPr>
       <w:tblGrid>
@@ -2071,7 +2337,7 @@
       <w:tr>
         <w:tc>
           <w:tcPr>
-            <w:tcW w:type="dxa" w:w="1080"/>
+            <w:tcW w:type="dxa" w:w="2304"/>
           </w:tcPr>
           <w:p>
             <w:r>
@@ -2085,7 +2351,7 @@
         </w:tc>
         <w:tc>
           <w:tcPr>
-            <w:tcW w:type="dxa" w:w="1080"/>
+            <w:tcW w:type="dxa" w:w="2088"/>
           </w:tcPr>
           <w:p>
             <w:r>
@@ -2099,7 +2365,7 @@
         </w:tc>
         <w:tc>
           <w:tcPr>
-            <w:tcW w:type="dxa" w:w="1080"/>
+            <w:tcW w:type="dxa" w:w="864"/>
           </w:tcPr>
           <w:p>
             <w:r>
@@ -2113,7 +2379,7 @@
         </w:tc>
         <w:tc>
           <w:tcPr>
-            <w:tcW w:type="dxa" w:w="1080"/>
+            <w:tcW w:type="dxa" w:w="720"/>
           </w:tcPr>
           <w:p>
             <w:r>
@@ -2127,7 +2393,7 @@
         </w:tc>
         <w:tc>
           <w:tcPr>
-            <w:tcW w:type="dxa" w:w="1080"/>
+            <w:tcW w:type="dxa" w:w="792"/>
           </w:tcPr>
           <w:p>
             <w:r>
@@ -2141,7 +2407,7 @@
         </w:tc>
         <w:tc>
           <w:tcPr>
-            <w:tcW w:type="dxa" w:w="1080"/>
+            <w:tcW w:type="dxa" w:w="864"/>
           </w:tcPr>
           <w:p>
             <w:r>
@@ -2155,7 +2421,7 @@
         </w:tc>
         <w:tc>
           <w:tcPr>
-            <w:tcW w:type="dxa" w:w="1080"/>
+            <w:tcW w:type="dxa" w:w="1037"/>
           </w:tcPr>
           <w:p>
             <w:r>
@@ -2169,7 +2435,7 @@
         </w:tc>
         <w:tc>
           <w:tcPr>
-            <w:tcW w:type="dxa" w:w="1080"/>
+            <w:tcW w:type="dxa" w:w="763"/>
           </w:tcPr>
           <w:p>
             <w:r>
@@ -2185,7 +2451,7 @@
       <w:tr>
         <w:tc>
           <w:tcPr>
-            <w:tcW w:type="dxa" w:w="1080"/>
+            <w:tcW w:type="dxa" w:w="2304"/>
           </w:tcPr>
           <w:p>
             <w:r>
@@ -2198,7 +2464,7 @@
         </w:tc>
         <w:tc>
           <w:tcPr>
-            <w:tcW w:type="dxa" w:w="1080"/>
+            <w:tcW w:type="dxa" w:w="2088"/>
           </w:tcPr>
           <w:p>
             <w:r>
@@ -2211,7 +2477,7 @@
         </w:tc>
         <w:tc>
           <w:tcPr>
-            <w:tcW w:type="dxa" w:w="1080"/>
+            <w:tcW w:type="dxa" w:w="864"/>
           </w:tcPr>
           <w:p>
             <w:r>
@@ -2224,7 +2490,7 @@
         </w:tc>
         <w:tc>
           <w:tcPr>
-            <w:tcW w:type="dxa" w:w="1080"/>
+            <w:tcW w:type="dxa" w:w="720"/>
           </w:tcPr>
           <w:p>
             <w:r>
@@ -2237,7 +2503,7 @@
         </w:tc>
         <w:tc>
           <w:tcPr>
-            <w:tcW w:type="dxa" w:w="1080"/>
+            <w:tcW w:type="dxa" w:w="792"/>
           </w:tcPr>
           <w:p>
             <w:r>
@@ -2250,7 +2516,7 @@
         </w:tc>
         <w:tc>
           <w:tcPr>
-            <w:tcW w:type="dxa" w:w="1080"/>
+            <w:tcW w:type="dxa" w:w="864"/>
           </w:tcPr>
           <w:p>
             <w:r>
@@ -2263,7 +2529,7 @@
         </w:tc>
         <w:tc>
           <w:tcPr>
-            <w:tcW w:type="dxa" w:w="1080"/>
+            <w:tcW w:type="dxa" w:w="1037"/>
           </w:tcPr>
           <w:p>
             <w:r>
@@ -2276,7 +2542,7 @@
         </w:tc>
         <w:tc>
           <w:tcPr>
-            <w:tcW w:type="dxa" w:w="1080"/>
+            <w:tcW w:type="dxa" w:w="763"/>
           </w:tcPr>
           <w:p>
             <w:r>
@@ -2291,7 +2557,7 @@
       <w:tr>
         <w:tc>
           <w:tcPr>
-            <w:tcW w:type="dxa" w:w="1080"/>
+            <w:tcW w:type="dxa" w:w="2304"/>
           </w:tcPr>
           <w:p>
             <w:r>
@@ -2304,7 +2570,7 @@
         </w:tc>
         <w:tc>
           <w:tcPr>
-            <w:tcW w:type="dxa" w:w="1080"/>
+            <w:tcW w:type="dxa" w:w="2088"/>
           </w:tcPr>
           <w:p>
             <w:r>
@@ -2317,7 +2583,7 @@
         </w:tc>
         <w:tc>
           <w:tcPr>
-            <w:tcW w:type="dxa" w:w="1080"/>
+            <w:tcW w:type="dxa" w:w="864"/>
           </w:tcPr>
           <w:p>
             <w:r>
@@ -2330,7 +2596,7 @@
         </w:tc>
         <w:tc>
           <w:tcPr>
-            <w:tcW w:type="dxa" w:w="1080"/>
+            <w:tcW w:type="dxa" w:w="720"/>
           </w:tcPr>
           <w:p>
             <w:r>
@@ -2343,7 +2609,7 @@
         </w:tc>
         <w:tc>
           <w:tcPr>
-            <w:tcW w:type="dxa" w:w="1080"/>
+            <w:tcW w:type="dxa" w:w="792"/>
           </w:tcPr>
           <w:p>
             <w:r>
@@ -2356,7 +2622,7 @@
         </w:tc>
         <w:tc>
           <w:tcPr>
-            <w:tcW w:type="dxa" w:w="1080"/>
+            <w:tcW w:type="dxa" w:w="864"/>
           </w:tcPr>
           <w:p>
             <w:r>
@@ -2369,7 +2635,7 @@
         </w:tc>
         <w:tc>
           <w:tcPr>
-            <w:tcW w:type="dxa" w:w="1080"/>
+            <w:tcW w:type="dxa" w:w="1037"/>
           </w:tcPr>
           <w:p>
             <w:r>
@@ -2382,7 +2648,7 @@
         </w:tc>
         <w:tc>
           <w:tcPr>
-            <w:tcW w:type="dxa" w:w="1080"/>
+            <w:tcW w:type="dxa" w:w="763"/>
           </w:tcPr>
           <w:p>
             <w:r>
@@ -2397,7 +2663,7 @@
       <w:tr>
         <w:tc>
           <w:tcPr>
-            <w:tcW w:type="dxa" w:w="1080"/>
+            <w:tcW w:type="dxa" w:w="2304"/>
           </w:tcPr>
           <w:p>
             <w:r>
@@ -2410,7 +2676,7 @@
         </w:tc>
         <w:tc>
           <w:tcPr>
-            <w:tcW w:type="dxa" w:w="1080"/>
+            <w:tcW w:type="dxa" w:w="2088"/>
           </w:tcPr>
           <w:p>
             <w:r>
@@ -2423,7 +2689,7 @@
         </w:tc>
         <w:tc>
           <w:tcPr>
-            <w:tcW w:type="dxa" w:w="1080"/>
+            <w:tcW w:type="dxa" w:w="864"/>
           </w:tcPr>
           <w:p>
             <w:r>
@@ -2436,7 +2702,7 @@
         </w:tc>
         <w:tc>
           <w:tcPr>
-            <w:tcW w:type="dxa" w:w="1080"/>
+            <w:tcW w:type="dxa" w:w="720"/>
           </w:tcPr>
           <w:p>
             <w:r>
@@ -2449,7 +2715,7 @@
         </w:tc>
         <w:tc>
           <w:tcPr>
-            <w:tcW w:type="dxa" w:w="1080"/>
+            <w:tcW w:type="dxa" w:w="792"/>
           </w:tcPr>
           <w:p>
             <w:r>
@@ -2462,7 +2728,7 @@
         </w:tc>
         <w:tc>
           <w:tcPr>
-            <w:tcW w:type="dxa" w:w="1080"/>
+            <w:tcW w:type="dxa" w:w="864"/>
           </w:tcPr>
           <w:p>
             <w:r>
@@ -2475,7 +2741,7 @@
         </w:tc>
         <w:tc>
           <w:tcPr>
-            <w:tcW w:type="dxa" w:w="1080"/>
+            <w:tcW w:type="dxa" w:w="1037"/>
           </w:tcPr>
           <w:p>
             <w:r>
@@ -2488,7 +2754,7 @@
         </w:tc>
         <w:tc>
           <w:tcPr>
-            <w:tcW w:type="dxa" w:w="1080"/>
+            <w:tcW w:type="dxa" w:w="763"/>
           </w:tcPr>
           <w:p>
             <w:r>
@@ -2503,7 +2769,7 @@
       <w:tr>
         <w:tc>
           <w:tcPr>
-            <w:tcW w:type="dxa" w:w="1080"/>
+            <w:tcW w:type="dxa" w:w="2304"/>
           </w:tcPr>
           <w:p>
             <w:r>
@@ -2516,7 +2782,7 @@
         </w:tc>
         <w:tc>
           <w:tcPr>
-            <w:tcW w:type="dxa" w:w="1080"/>
+            <w:tcW w:type="dxa" w:w="2088"/>
           </w:tcPr>
           <w:p>
             <w:r>
@@ -2529,7 +2795,7 @@
         </w:tc>
         <w:tc>
           <w:tcPr>
-            <w:tcW w:type="dxa" w:w="1080"/>
+            <w:tcW w:type="dxa" w:w="864"/>
           </w:tcPr>
           <w:p>
             <w:r>
@@ -2542,7 +2808,7 @@
         </w:tc>
         <w:tc>
           <w:tcPr>
-            <w:tcW w:type="dxa" w:w="1080"/>
+            <w:tcW w:type="dxa" w:w="720"/>
           </w:tcPr>
           <w:p>
             <w:r>
@@ -2555,7 +2821,7 @@
         </w:tc>
         <w:tc>
           <w:tcPr>
-            <w:tcW w:type="dxa" w:w="1080"/>
+            <w:tcW w:type="dxa" w:w="792"/>
           </w:tcPr>
           <w:p>
             <w:r>
@@ -2568,7 +2834,7 @@
         </w:tc>
         <w:tc>
           <w:tcPr>
-            <w:tcW w:type="dxa" w:w="1080"/>
+            <w:tcW w:type="dxa" w:w="864"/>
           </w:tcPr>
           <w:p>
             <w:r>
@@ -2581,7 +2847,7 @@
         </w:tc>
         <w:tc>
           <w:tcPr>
-            <w:tcW w:type="dxa" w:w="1080"/>
+            <w:tcW w:type="dxa" w:w="1037"/>
           </w:tcPr>
           <w:p>
             <w:r>
@@ -2594,7 +2860,7 @@
         </w:tc>
         <w:tc>
           <w:tcPr>
-            <w:tcW w:type="dxa" w:w="1080"/>
+            <w:tcW w:type="dxa" w:w="763"/>
           </w:tcPr>
           <w:p>
             <w:r>
@@ -2609,7 +2875,7 @@
       <w:tr>
         <w:tc>
           <w:tcPr>
-            <w:tcW w:type="dxa" w:w="1080"/>
+            <w:tcW w:type="dxa" w:w="2304"/>
           </w:tcPr>
           <w:p>
             <w:r>
@@ -2622,7 +2888,7 @@
         </w:tc>
         <w:tc>
           <w:tcPr>
-            <w:tcW w:type="dxa" w:w="1080"/>
+            <w:tcW w:type="dxa" w:w="2088"/>
           </w:tcPr>
           <w:p>
             <w:r>
@@ -2635,7 +2901,7 @@
         </w:tc>
         <w:tc>
           <w:tcPr>
-            <w:tcW w:type="dxa" w:w="1080"/>
+            <w:tcW w:type="dxa" w:w="864"/>
           </w:tcPr>
           <w:p>
             <w:r>
@@ -2648,7 +2914,7 @@
         </w:tc>
         <w:tc>
           <w:tcPr>
-            <w:tcW w:type="dxa" w:w="1080"/>
+            <w:tcW w:type="dxa" w:w="720"/>
           </w:tcPr>
           <w:p>
             <w:r>
@@ -2661,7 +2927,7 @@
         </w:tc>
         <w:tc>
           <w:tcPr>
-            <w:tcW w:type="dxa" w:w="1080"/>
+            <w:tcW w:type="dxa" w:w="792"/>
           </w:tcPr>
           <w:p>
             <w:r>
@@ -2674,7 +2940,7 @@
         </w:tc>
         <w:tc>
           <w:tcPr>
-            <w:tcW w:type="dxa" w:w="1080"/>
+            <w:tcW w:type="dxa" w:w="864"/>
           </w:tcPr>
           <w:p>
             <w:r>
@@ -2687,7 +2953,7 @@
         </w:tc>
         <w:tc>
           <w:tcPr>
-            <w:tcW w:type="dxa" w:w="1080"/>
+            <w:tcW w:type="dxa" w:w="1037"/>
           </w:tcPr>
           <w:p>
             <w:r>
@@ -2700,7 +2966,7 @@
         </w:tc>
         <w:tc>
           <w:tcPr>
-            <w:tcW w:type="dxa" w:w="1080"/>
+            <w:tcW w:type="dxa" w:w="763"/>
           </w:tcPr>
           <w:p>
             <w:r>
@@ -2715,7 +2981,7 @@
       <w:tr>
         <w:tc>
           <w:tcPr>
-            <w:tcW w:type="dxa" w:w="1080"/>
+            <w:tcW w:type="dxa" w:w="2304"/>
           </w:tcPr>
           <w:p>
             <w:r>
@@ -2728,7 +2994,7 @@
         </w:tc>
         <w:tc>
           <w:tcPr>
-            <w:tcW w:type="dxa" w:w="1080"/>
+            <w:tcW w:type="dxa" w:w="2088"/>
           </w:tcPr>
           <w:p>
             <w:r>
@@ -2741,7 +3007,7 @@
         </w:tc>
         <w:tc>
           <w:tcPr>
-            <w:tcW w:type="dxa" w:w="1080"/>
+            <w:tcW w:type="dxa" w:w="864"/>
           </w:tcPr>
           <w:p>
             <w:r>
@@ -2754,7 +3020,7 @@
         </w:tc>
         <w:tc>
           <w:tcPr>
-            <w:tcW w:type="dxa" w:w="1080"/>
+            <w:tcW w:type="dxa" w:w="720"/>
           </w:tcPr>
           <w:p>
             <w:r>
@@ -2767,7 +3033,7 @@
         </w:tc>
         <w:tc>
           <w:tcPr>
-            <w:tcW w:type="dxa" w:w="1080"/>
+            <w:tcW w:type="dxa" w:w="792"/>
           </w:tcPr>
           <w:p>
             <w:r>
@@ -2780,7 +3046,7 @@
         </w:tc>
         <w:tc>
           <w:tcPr>
-            <w:tcW w:type="dxa" w:w="1080"/>
+            <w:tcW w:type="dxa" w:w="864"/>
           </w:tcPr>
           <w:p>
             <w:r>
@@ -2793,7 +3059,7 @@
         </w:tc>
         <w:tc>
           <w:tcPr>
-            <w:tcW w:type="dxa" w:w="1080"/>
+            <w:tcW w:type="dxa" w:w="1037"/>
           </w:tcPr>
           <w:p>
             <w:r>
@@ -2806,7 +3072,7 @@
         </w:tc>
         <w:tc>
           <w:tcPr>
-            <w:tcW w:type="dxa" w:w="1080"/>
+            <w:tcW w:type="dxa" w:w="763"/>
           </w:tcPr>
           <w:p>
             <w:r>
@@ -2821,7 +3087,7 @@
       <w:tr>
         <w:tc>
           <w:tcPr>
-            <w:tcW w:type="dxa" w:w="1080"/>
+            <w:tcW w:type="dxa" w:w="2304"/>
           </w:tcPr>
           <w:p>
             <w:r>
@@ -2834,7 +3100,7 @@
         </w:tc>
         <w:tc>
           <w:tcPr>
-            <w:tcW w:type="dxa" w:w="1080"/>
+            <w:tcW w:type="dxa" w:w="2088"/>
           </w:tcPr>
           <w:p>
             <w:r>
@@ -2847,7 +3113,7 @@
         </w:tc>
         <w:tc>
           <w:tcPr>
-            <w:tcW w:type="dxa" w:w="1080"/>
+            <w:tcW w:type="dxa" w:w="864"/>
           </w:tcPr>
           <w:p>
             <w:r>
@@ -2860,7 +3126,7 @@
         </w:tc>
         <w:tc>
           <w:tcPr>
-            <w:tcW w:type="dxa" w:w="1080"/>
+            <w:tcW w:type="dxa" w:w="720"/>
           </w:tcPr>
           <w:p>
             <w:r>
@@ -2873,7 +3139,7 @@
         </w:tc>
         <w:tc>
           <w:tcPr>
-            <w:tcW w:type="dxa" w:w="1080"/>
+            <w:tcW w:type="dxa" w:w="792"/>
           </w:tcPr>
           <w:p>
             <w:r>
@@ -2886,7 +3152,7 @@
         </w:tc>
         <w:tc>
           <w:tcPr>
-            <w:tcW w:type="dxa" w:w="1080"/>
+            <w:tcW w:type="dxa" w:w="864"/>
           </w:tcPr>
           <w:p>
             <w:r>
@@ -2899,7 +3165,7 @@
         </w:tc>
         <w:tc>
           <w:tcPr>
-            <w:tcW w:type="dxa" w:w="1080"/>
+            <w:tcW w:type="dxa" w:w="1037"/>
           </w:tcPr>
           <w:p>
             <w:r>
@@ -2912,7 +3178,7 @@
         </w:tc>
         <w:tc>
           <w:tcPr>
-            <w:tcW w:type="dxa" w:w="1080"/>
+            <w:tcW w:type="dxa" w:w="763"/>
           </w:tcPr>
           <w:p>
             <w:r>
@@ -2927,7 +3193,7 @@
       <w:tr>
         <w:tc>
           <w:tcPr>
-            <w:tcW w:type="dxa" w:w="1080"/>
+            <w:tcW w:type="dxa" w:w="2304"/>
           </w:tcPr>
           <w:p>
             <w:r>
@@ -2940,7 +3206,7 @@
         </w:tc>
         <w:tc>
           <w:tcPr>
-            <w:tcW w:type="dxa" w:w="1080"/>
+            <w:tcW w:type="dxa" w:w="2088"/>
           </w:tcPr>
           <w:p>
             <w:r>
@@ -2953,7 +3219,7 @@
         </w:tc>
         <w:tc>
           <w:tcPr>
-            <w:tcW w:type="dxa" w:w="1080"/>
+            <w:tcW w:type="dxa" w:w="864"/>
           </w:tcPr>
           <w:p>
             <w:r>
@@ -2966,7 +3232,7 @@
         </w:tc>
         <w:tc>
           <w:tcPr>
-            <w:tcW w:type="dxa" w:w="1080"/>
+            <w:tcW w:type="dxa" w:w="720"/>
           </w:tcPr>
           <w:p>
             <w:r>
@@ -2979,7 +3245,7 @@
         </w:tc>
         <w:tc>
           <w:tcPr>
-            <w:tcW w:type="dxa" w:w="1080"/>
+            <w:tcW w:type="dxa" w:w="792"/>
           </w:tcPr>
           <w:p>
             <w:r>
@@ -2992,7 +3258,7 @@
         </w:tc>
         <w:tc>
           <w:tcPr>
-            <w:tcW w:type="dxa" w:w="1080"/>
+            <w:tcW w:type="dxa" w:w="864"/>
           </w:tcPr>
           <w:p>
             <w:r>
@@ -3005,7 +3271,7 @@
         </w:tc>
         <w:tc>
           <w:tcPr>
-            <w:tcW w:type="dxa" w:w="1080"/>
+            <w:tcW w:type="dxa" w:w="1037"/>
           </w:tcPr>
           <w:p>
             <w:r>
@@ -3018,7 +3284,7 @@
         </w:tc>
         <w:tc>
           <w:tcPr>
-            <w:tcW w:type="dxa" w:w="1080"/>
+            <w:tcW w:type="dxa" w:w="763"/>
           </w:tcPr>
           <w:p>
             <w:r>
@@ -3033,7 +3299,7 @@
       <w:tr>
         <w:tc>
           <w:tcPr>
-            <w:tcW w:type="dxa" w:w="1080"/>
+            <w:tcW w:type="dxa" w:w="2304"/>
           </w:tcPr>
           <w:p>
             <w:r>
@@ -3046,7 +3312,7 @@
         </w:tc>
         <w:tc>
           <w:tcPr>
-            <w:tcW w:type="dxa" w:w="1080"/>
+            <w:tcW w:type="dxa" w:w="2088"/>
           </w:tcPr>
           <w:p>
             <w:r>
@@ -3059,7 +3325,7 @@
         </w:tc>
         <w:tc>
           <w:tcPr>
-            <w:tcW w:type="dxa" w:w="1080"/>
+            <w:tcW w:type="dxa" w:w="864"/>
           </w:tcPr>
           <w:p>
             <w:r>
@@ -3072,7 +3338,7 @@
         </w:tc>
         <w:tc>
           <w:tcPr>
-            <w:tcW w:type="dxa" w:w="1080"/>
+            <w:tcW w:type="dxa" w:w="720"/>
           </w:tcPr>
           <w:p>
             <w:r>
@@ -3085,7 +3351,7 @@
         </w:tc>
         <w:tc>
           <w:tcPr>
-            <w:tcW w:type="dxa" w:w="1080"/>
+            <w:tcW w:type="dxa" w:w="792"/>
           </w:tcPr>
           <w:p>
             <w:r>
@@ -3098,7 +3364,7 @@
         </w:tc>
         <w:tc>
           <w:tcPr>
-            <w:tcW w:type="dxa" w:w="1080"/>
+            <w:tcW w:type="dxa" w:w="864"/>
           </w:tcPr>
           <w:p>
             <w:r>
@@ -3111,7 +3377,7 @@
         </w:tc>
         <w:tc>
           <w:tcPr>
-            <w:tcW w:type="dxa" w:w="1080"/>
+            <w:tcW w:type="dxa" w:w="1037"/>
           </w:tcPr>
           <w:p>
             <w:r>
@@ -3124,7 +3390,7 @@
         </w:tc>
         <w:tc>
           <w:tcPr>
-            <w:tcW w:type="dxa" w:w="1080"/>
+            <w:tcW w:type="dxa" w:w="763"/>
           </w:tcPr>
           <w:p>
             <w:r>
@@ -3139,7 +3405,7 @@
       <w:tr>
         <w:tc>
           <w:tcPr>
-            <w:tcW w:type="dxa" w:w="1080"/>
+            <w:tcW w:type="dxa" w:w="2304"/>
           </w:tcPr>
           <w:p>
             <w:r>
@@ -3152,7 +3418,7 @@
         </w:tc>
         <w:tc>
           <w:tcPr>
-            <w:tcW w:type="dxa" w:w="1080"/>
+            <w:tcW w:type="dxa" w:w="2088"/>
           </w:tcPr>
           <w:p>
             <w:r>
@@ -3165,7 +3431,7 @@
         </w:tc>
         <w:tc>
           <w:tcPr>
-            <w:tcW w:type="dxa" w:w="1080"/>
+            <w:tcW w:type="dxa" w:w="864"/>
           </w:tcPr>
           <w:p>
             <w:r>
@@ -3178,7 +3444,7 @@
         </w:tc>
         <w:tc>
           <w:tcPr>
-            <w:tcW w:type="dxa" w:w="1080"/>
+            <w:tcW w:type="dxa" w:w="720"/>
           </w:tcPr>
           <w:p>
             <w:r>
@@ -3191,7 +3457,7 @@
         </w:tc>
         <w:tc>
           <w:tcPr>
-            <w:tcW w:type="dxa" w:w="1080"/>
+            <w:tcW w:type="dxa" w:w="792"/>
           </w:tcPr>
           <w:p>
             <w:r>
@@ -3204,7 +3470,7 @@
         </w:tc>
         <w:tc>
           <w:tcPr>
-            <w:tcW w:type="dxa" w:w="1080"/>
+            <w:tcW w:type="dxa" w:w="864"/>
           </w:tcPr>
           <w:p>
             <w:r>
@@ -3217,7 +3483,7 @@
         </w:tc>
         <w:tc>
           <w:tcPr>
-            <w:tcW w:type="dxa" w:w="1080"/>
+            <w:tcW w:type="dxa" w:w="1037"/>
           </w:tcPr>
           <w:p>
             <w:r>
@@ -3230,7 +3496,7 @@
         </w:tc>
         <w:tc>
           <w:tcPr>
-            <w:tcW w:type="dxa" w:w="1080"/>
+            <w:tcW w:type="dxa" w:w="763"/>
           </w:tcPr>
           <w:p>
             <w:r>
@@ -3245,7 +3511,7 @@
       <w:tr>
         <w:tc>
           <w:tcPr>
-            <w:tcW w:type="dxa" w:w="1080"/>
+            <w:tcW w:type="dxa" w:w="2304"/>
           </w:tcPr>
           <w:p>
             <w:r>
@@ -3258,7 +3524,7 @@
         </w:tc>
         <w:tc>
           <w:tcPr>
-            <w:tcW w:type="dxa" w:w="1080"/>
+            <w:tcW w:type="dxa" w:w="2088"/>
           </w:tcPr>
           <w:p>
             <w:r>
@@ -3271,7 +3537,7 @@
         </w:tc>
         <w:tc>
           <w:tcPr>
-            <w:tcW w:type="dxa" w:w="1080"/>
+            <w:tcW w:type="dxa" w:w="864"/>
           </w:tcPr>
           <w:p>
             <w:r>
@@ -3284,7 +3550,7 @@
         </w:tc>
         <w:tc>
           <w:tcPr>
-            <w:tcW w:type="dxa" w:w="1080"/>
+            <w:tcW w:type="dxa" w:w="720"/>
           </w:tcPr>
           <w:p>
             <w:r>
@@ -3297,7 +3563,7 @@
         </w:tc>
         <w:tc>
           <w:tcPr>
-            <w:tcW w:type="dxa" w:w="1080"/>
+            <w:tcW w:type="dxa" w:w="792"/>
           </w:tcPr>
           <w:p>
             <w:r>
@@ -3310,7 +3576,7 @@
         </w:tc>
         <w:tc>
           <w:tcPr>
-            <w:tcW w:type="dxa" w:w="1080"/>
+            <w:tcW w:type="dxa" w:w="864"/>
           </w:tcPr>
           <w:p>
             <w:r>
@@ -3323,7 +3589,7 @@
         </w:tc>
         <w:tc>
           <w:tcPr>
-            <w:tcW w:type="dxa" w:w="1080"/>
+            <w:tcW w:type="dxa" w:w="1037"/>
           </w:tcPr>
           <w:p>
             <w:r>
@@ -3336,7 +3602,7 @@
         </w:tc>
         <w:tc>
           <w:tcPr>
-            <w:tcW w:type="dxa" w:w="1080"/>
+            <w:tcW w:type="dxa" w:w="763"/>
           </w:tcPr>
           <w:p>
             <w:r>
@@ -3351,7 +3617,7 @@
       <w:tr>
         <w:tc>
           <w:tcPr>
-            <w:tcW w:type="dxa" w:w="1080"/>
+            <w:tcW w:type="dxa" w:w="2304"/>
           </w:tcPr>
           <w:p>
             <w:r>
@@ -3364,7 +3630,7 @@
         </w:tc>
         <w:tc>
           <w:tcPr>
-            <w:tcW w:type="dxa" w:w="1080"/>
+            <w:tcW w:type="dxa" w:w="2088"/>
           </w:tcPr>
           <w:p>
             <w:r>
@@ -3377,7 +3643,7 @@
         </w:tc>
         <w:tc>
           <w:tcPr>
-            <w:tcW w:type="dxa" w:w="1080"/>
+            <w:tcW w:type="dxa" w:w="864"/>
           </w:tcPr>
           <w:p>
             <w:r>
@@ -3390,7 +3656,7 @@
         </w:tc>
         <w:tc>
           <w:tcPr>
-            <w:tcW w:type="dxa" w:w="1080"/>
+            <w:tcW w:type="dxa" w:w="720"/>
           </w:tcPr>
           <w:p>
             <w:r>
@@ -3403,7 +3669,7 @@
         </w:tc>
         <w:tc>
           <w:tcPr>
-            <w:tcW w:type="dxa" w:w="1080"/>
+            <w:tcW w:type="dxa" w:w="792"/>
           </w:tcPr>
           <w:p>
             <w:r>
@@ -3416,7 +3682,7 @@
         </w:tc>
         <w:tc>
           <w:tcPr>
-            <w:tcW w:type="dxa" w:w="1080"/>
+            <w:tcW w:type="dxa" w:w="864"/>
           </w:tcPr>
           <w:p>
             <w:r>
@@ -3429,7 +3695,7 @@
         </w:tc>
         <w:tc>
           <w:tcPr>
-            <w:tcW w:type="dxa" w:w="1080"/>
+            <w:tcW w:type="dxa" w:w="1037"/>
           </w:tcPr>
           <w:p>
             <w:r>
@@ -3442,7 +3708,7 @@
         </w:tc>
         <w:tc>
           <w:tcPr>
-            <w:tcW w:type="dxa" w:w="1080"/>
+            <w:tcW w:type="dxa" w:w="763"/>
           </w:tcPr>
           <w:p>
             <w:r>
@@ -3457,7 +3723,7 @@
       <w:tr>
         <w:tc>
           <w:tcPr>
-            <w:tcW w:type="dxa" w:w="1080"/>
+            <w:tcW w:type="dxa" w:w="2304"/>
           </w:tcPr>
           <w:p>
             <w:r>
@@ -3470,7 +3736,7 @@
         </w:tc>
         <w:tc>
           <w:tcPr>
-            <w:tcW w:type="dxa" w:w="1080"/>
+            <w:tcW w:type="dxa" w:w="2088"/>
           </w:tcPr>
           <w:p>
             <w:r>
@@ -3483,7 +3749,7 @@
         </w:tc>
         <w:tc>
           <w:tcPr>
-            <w:tcW w:type="dxa" w:w="1080"/>
+            <w:tcW w:type="dxa" w:w="864"/>
           </w:tcPr>
           <w:p>
             <w:r>
@@ -3496,7 +3762,7 @@
         </w:tc>
         <w:tc>
           <w:tcPr>
-            <w:tcW w:type="dxa" w:w="1080"/>
+            <w:tcW w:type="dxa" w:w="720"/>
           </w:tcPr>
           <w:p>
             <w:r>
@@ -3509,7 +3775,7 @@
         </w:tc>
         <w:tc>
           <w:tcPr>
-            <w:tcW w:type="dxa" w:w="1080"/>
+            <w:tcW w:type="dxa" w:w="792"/>
           </w:tcPr>
           <w:p>
             <w:r>
@@ -3522,7 +3788,7 @@
         </w:tc>
         <w:tc>
           <w:tcPr>
-            <w:tcW w:type="dxa" w:w="1080"/>
+            <w:tcW w:type="dxa" w:w="864"/>
           </w:tcPr>
           <w:p>
             <w:r>
@@ -3535,7 +3801,7 @@
         </w:tc>
         <w:tc>
           <w:tcPr>
-            <w:tcW w:type="dxa" w:w="1080"/>
+            <w:tcW w:type="dxa" w:w="1037"/>
           </w:tcPr>
           <w:p>
             <w:r>
@@ -3548,7 +3814,7 @@
         </w:tc>
         <w:tc>
           <w:tcPr>
-            <w:tcW w:type="dxa" w:w="1080"/>
+            <w:tcW w:type="dxa" w:w="763"/>
           </w:tcPr>
           <w:p>
             <w:r>
@@ -3563,7 +3829,7 @@
       <w:tr>
         <w:tc>
           <w:tcPr>
-            <w:tcW w:type="dxa" w:w="1080"/>
+            <w:tcW w:type="dxa" w:w="2304"/>
           </w:tcPr>
           <w:p>
             <w:r>
@@ -3576,7 +3842,7 @@
         </w:tc>
         <w:tc>
           <w:tcPr>
-            <w:tcW w:type="dxa" w:w="1080"/>
+            <w:tcW w:type="dxa" w:w="2088"/>
           </w:tcPr>
           <w:p>
             <w:r>
@@ -3589,7 +3855,7 @@
         </w:tc>
         <w:tc>
           <w:tcPr>
-            <w:tcW w:type="dxa" w:w="1080"/>
+            <w:tcW w:type="dxa" w:w="864"/>
           </w:tcPr>
           <w:p>
             <w:r>
@@ -3602,7 +3868,7 @@
         </w:tc>
         <w:tc>
           <w:tcPr>
-            <w:tcW w:type="dxa" w:w="1080"/>
+            <w:tcW w:type="dxa" w:w="720"/>
           </w:tcPr>
           <w:p>
             <w:r>
@@ -3615,7 +3881,7 @@
         </w:tc>
         <w:tc>
           <w:tcPr>
-            <w:tcW w:type="dxa" w:w="1080"/>
+            <w:tcW w:type="dxa" w:w="792"/>
           </w:tcPr>
           <w:p>
             <w:r>
@@ -3628,7 +3894,7 @@
         </w:tc>
         <w:tc>
           <w:tcPr>
-            <w:tcW w:type="dxa" w:w="1080"/>
+            <w:tcW w:type="dxa" w:w="864"/>
           </w:tcPr>
           <w:p>
             <w:r>
@@ -3641,7 +3907,7 @@
         </w:tc>
         <w:tc>
           <w:tcPr>
-            <w:tcW w:type="dxa" w:w="1080"/>
+            <w:tcW w:type="dxa" w:w="1037"/>
           </w:tcPr>
           <w:p>
             <w:r>
@@ -3654,7 +3920,7 @@
         </w:tc>
         <w:tc>
           <w:tcPr>
-            <w:tcW w:type="dxa" w:w="1080"/>
+            <w:tcW w:type="dxa" w:w="763"/>
           </w:tcPr>
           <w:p>
             <w:r>
@@ -3669,7 +3935,7 @@
       <w:tr>
         <w:tc>
           <w:tcPr>
-            <w:tcW w:type="dxa" w:w="1080"/>
+            <w:tcW w:type="dxa" w:w="2304"/>
           </w:tcPr>
           <w:p>
             <w:r>
@@ -3682,7 +3948,7 @@
         </w:tc>
         <w:tc>
           <w:tcPr>
-            <w:tcW w:type="dxa" w:w="1080"/>
+            <w:tcW w:type="dxa" w:w="2088"/>
           </w:tcPr>
           <w:p>
             <w:r>
@@ -3695,7 +3961,7 @@
         </w:tc>
         <w:tc>
           <w:tcPr>
-            <w:tcW w:type="dxa" w:w="1080"/>
+            <w:tcW w:type="dxa" w:w="864"/>
           </w:tcPr>
           <w:p>
             <w:r>
@@ -3708,7 +3974,7 @@
         </w:tc>
         <w:tc>
           <w:tcPr>
-            <w:tcW w:type="dxa" w:w="1080"/>
+            <w:tcW w:type="dxa" w:w="720"/>
           </w:tcPr>
           <w:p>
             <w:r>
@@ -3721,7 +3987,7 @@
         </w:tc>
         <w:tc>
           <w:tcPr>
-            <w:tcW w:type="dxa" w:w="1080"/>
+            <w:tcW w:type="dxa" w:w="792"/>
           </w:tcPr>
           <w:p>
             <w:r>
@@ -3734,7 +4000,7 @@
         </w:tc>
         <w:tc>
           <w:tcPr>
-            <w:tcW w:type="dxa" w:w="1080"/>
+            <w:tcW w:type="dxa" w:w="864"/>
           </w:tcPr>
           <w:p>
             <w:r>
@@ -3747,7 +4013,7 @@
         </w:tc>
         <w:tc>
           <w:tcPr>
-            <w:tcW w:type="dxa" w:w="1080"/>
+            <w:tcW w:type="dxa" w:w="1037"/>
           </w:tcPr>
           <w:p>
             <w:r>
@@ -3760,7 +4026,7 @@
         </w:tc>
         <w:tc>
           <w:tcPr>
-            <w:tcW w:type="dxa" w:w="1080"/>
+            <w:tcW w:type="dxa" w:w="763"/>
           </w:tcPr>
           <w:p>
             <w:r>
@@ -3775,7 +4041,7 @@
       <w:tr>
         <w:tc>
           <w:tcPr>
-            <w:tcW w:type="dxa" w:w="1080"/>
+            <w:tcW w:type="dxa" w:w="2304"/>
           </w:tcPr>
           <w:p>
             <w:r>
@@ -3788,7 +4054,7 @@
         </w:tc>
         <w:tc>
           <w:tcPr>
-            <w:tcW w:type="dxa" w:w="1080"/>
+            <w:tcW w:type="dxa" w:w="2088"/>
           </w:tcPr>
           <w:p>
             <w:r>
@@ -3801,7 +4067,7 @@
         </w:tc>
         <w:tc>
           <w:tcPr>
-            <w:tcW w:type="dxa" w:w="1080"/>
+            <w:tcW w:type="dxa" w:w="864"/>
           </w:tcPr>
           <w:p>
             <w:r>
@@ -3814,7 +4080,7 @@
         </w:tc>
         <w:tc>
           <w:tcPr>
-            <w:tcW w:type="dxa" w:w="1080"/>
+            <w:tcW w:type="dxa" w:w="720"/>
           </w:tcPr>
           <w:p>
             <w:r>
@@ -3827,7 +4093,7 @@
         </w:tc>
         <w:tc>
           <w:tcPr>
-            <w:tcW w:type="dxa" w:w="1080"/>
+            <w:tcW w:type="dxa" w:w="792"/>
           </w:tcPr>
           <w:p>
             <w:r>
@@ -3840,7 +4106,7 @@
         </w:tc>
         <w:tc>
           <w:tcPr>
-            <w:tcW w:type="dxa" w:w="1080"/>
+            <w:tcW w:type="dxa" w:w="864"/>
           </w:tcPr>
           <w:p>
             <w:r>
@@ -3853,7 +4119,7 @@
         </w:tc>
         <w:tc>
           <w:tcPr>
-            <w:tcW w:type="dxa" w:w="1080"/>
+            <w:tcW w:type="dxa" w:w="1037"/>
           </w:tcPr>
           <w:p>
             <w:r>
@@ -3866,7 +4132,7 @@
         </w:tc>
         <w:tc>
           <w:tcPr>
-            <w:tcW w:type="dxa" w:w="1080"/>
+            <w:tcW w:type="dxa" w:w="763"/>
           </w:tcPr>
           <w:p>
             <w:r>
@@ -3881,7 +4147,7 @@
       <w:tr>
         <w:tc>
           <w:tcPr>
-            <w:tcW w:type="dxa" w:w="1080"/>
+            <w:tcW w:type="dxa" w:w="2304"/>
           </w:tcPr>
           <w:p>
             <w:r>
@@ -3894,7 +4160,7 @@
         </w:tc>
         <w:tc>
           <w:tcPr>
-            <w:tcW w:type="dxa" w:w="1080"/>
+            <w:tcW w:type="dxa" w:w="2088"/>
           </w:tcPr>
           <w:p>
             <w:r>
@@ -3907,7 +4173,7 @@
         </w:tc>
         <w:tc>
           <w:tcPr>
-            <w:tcW w:type="dxa" w:w="1080"/>
+            <w:tcW w:type="dxa" w:w="864"/>
           </w:tcPr>
           <w:p>
             <w:r>
@@ -3920,7 +4186,7 @@
         </w:tc>
         <w:tc>
           <w:tcPr>
-            <w:tcW w:type="dxa" w:w="1080"/>
+            <w:tcW w:type="dxa" w:w="720"/>
           </w:tcPr>
           <w:p>
             <w:r>
@@ -3933,7 +4199,7 @@
         </w:tc>
         <w:tc>
           <w:tcPr>
-            <w:tcW w:type="dxa" w:w="1080"/>
+            <w:tcW w:type="dxa" w:w="792"/>
           </w:tcPr>
           <w:p>
             <w:r>
@@ -3946,7 +4212,7 @@
         </w:tc>
         <w:tc>
           <w:tcPr>
-            <w:tcW w:type="dxa" w:w="1080"/>
+            <w:tcW w:type="dxa" w:w="864"/>
           </w:tcPr>
           <w:p>
             <w:r>
@@ -3959,7 +4225,7 @@
         </w:tc>
         <w:tc>
           <w:tcPr>
-            <w:tcW w:type="dxa" w:w="1080"/>
+            <w:tcW w:type="dxa" w:w="1037"/>
           </w:tcPr>
           <w:p>
             <w:r>
@@ -3972,7 +4238,7 @@
         </w:tc>
         <w:tc>
           <w:tcPr>
-            <w:tcW w:type="dxa" w:w="1080"/>
+            <w:tcW w:type="dxa" w:w="763"/>
           </w:tcPr>
           <w:p>
             <w:r>
@@ -3987,7 +4253,7 @@
       <w:tr>
         <w:tc>
           <w:tcPr>
-            <w:tcW w:type="dxa" w:w="1080"/>
+            <w:tcW w:type="dxa" w:w="2304"/>
           </w:tcPr>
           <w:p>
             <w:r>
@@ -4000,7 +4266,7 @@
         </w:tc>
         <w:tc>
           <w:tcPr>
-            <w:tcW w:type="dxa" w:w="1080"/>
+            <w:tcW w:type="dxa" w:w="2088"/>
           </w:tcPr>
           <w:p>
             <w:r>
@@ -4013,7 +4279,7 @@
         </w:tc>
         <w:tc>
           <w:tcPr>
-            <w:tcW w:type="dxa" w:w="1080"/>
+            <w:tcW w:type="dxa" w:w="864"/>
           </w:tcPr>
           <w:p>
             <w:r>
@@ -4026,7 +4292,7 @@
         </w:tc>
         <w:tc>
           <w:tcPr>
-            <w:tcW w:type="dxa" w:w="1080"/>
+            <w:tcW w:type="dxa" w:w="720"/>
           </w:tcPr>
           <w:p>
             <w:r>
@@ -4039,7 +4305,7 @@
         </w:tc>
         <w:tc>
           <w:tcPr>
-            <w:tcW w:type="dxa" w:w="1080"/>
+            <w:tcW w:type="dxa" w:w="792"/>
           </w:tcPr>
           <w:p>
             <w:r>
@@ -4052,7 +4318,7 @@
         </w:tc>
         <w:tc>
           <w:tcPr>
-            <w:tcW w:type="dxa" w:w="1080"/>
+            <w:tcW w:type="dxa" w:w="864"/>
           </w:tcPr>
           <w:p>
             <w:r>
@@ -4065,7 +4331,7 @@
         </w:tc>
         <w:tc>
           <w:tcPr>
-            <w:tcW w:type="dxa" w:w="1080"/>
+            <w:tcW w:type="dxa" w:w="1037"/>
           </w:tcPr>
           <w:p>
             <w:r>
@@ -4078,7 +4344,7 @@
         </w:tc>
         <w:tc>
           <w:tcPr>
-            <w:tcW w:type="dxa" w:w="1080"/>
+            <w:tcW w:type="dxa" w:w="763"/>
           </w:tcPr>
           <w:p>
             <w:r>
@@ -4093,7 +4359,7 @@
       <w:tr>
         <w:tc>
           <w:tcPr>
-            <w:tcW w:type="dxa" w:w="1080"/>
+            <w:tcW w:type="dxa" w:w="2304"/>
           </w:tcPr>
           <w:p>
             <w:r>
@@ -4106,7 +4372,7 @@
         </w:tc>
         <w:tc>
           <w:tcPr>
-            <w:tcW w:type="dxa" w:w="1080"/>
+            <w:tcW w:type="dxa" w:w="2088"/>
           </w:tcPr>
           <w:p>
             <w:r>
@@ -4119,7 +4385,7 @@
         </w:tc>
         <w:tc>
           <w:tcPr>
-            <w:tcW w:type="dxa" w:w="1080"/>
+            <w:tcW w:type="dxa" w:w="864"/>
           </w:tcPr>
           <w:p>
             <w:r>
@@ -4132,7 +4398,7 @@
         </w:tc>
         <w:tc>
           <w:tcPr>
-            <w:tcW w:type="dxa" w:w="1080"/>
+            <w:tcW w:type="dxa" w:w="720"/>
           </w:tcPr>
           <w:p>
             <w:r>
@@ -4145,7 +4411,7 @@
         </w:tc>
         <w:tc>
           <w:tcPr>
-            <w:tcW w:type="dxa" w:w="1080"/>
+            <w:tcW w:type="dxa" w:w="792"/>
           </w:tcPr>
           <w:p>
             <w:r>
@@ -4158,7 +4424,7 @@
         </w:tc>
         <w:tc>
           <w:tcPr>
-            <w:tcW w:type="dxa" w:w="1080"/>
+            <w:tcW w:type="dxa" w:w="864"/>
           </w:tcPr>
           <w:p>
             <w:r>
@@ -4171,7 +4437,7 @@
         </w:tc>
         <w:tc>
           <w:tcPr>
-            <w:tcW w:type="dxa" w:w="1080"/>
+            <w:tcW w:type="dxa" w:w="1037"/>
           </w:tcPr>
           <w:p>
             <w:r>
@@ -4184,7 +4450,7 @@
         </w:tc>
         <w:tc>
           <w:tcPr>
-            <w:tcW w:type="dxa" w:w="1080"/>
+            <w:tcW w:type="dxa" w:w="763"/>
           </w:tcPr>
           <w:p>
             <w:r>
@@ -4199,7 +4465,7 @@
       <w:tr>
         <w:tc>
           <w:tcPr>
-            <w:tcW w:type="dxa" w:w="1080"/>
+            <w:tcW w:type="dxa" w:w="2304"/>
           </w:tcPr>
           <w:p>
             <w:r>
@@ -4212,7 +4478,7 @@
         </w:tc>
         <w:tc>
           <w:tcPr>
-            <w:tcW w:type="dxa" w:w="1080"/>
+            <w:tcW w:type="dxa" w:w="2088"/>
           </w:tcPr>
           <w:p>
             <w:r>
@@ -4225,7 +4491,7 @@
         </w:tc>
         <w:tc>
           <w:tcPr>
-            <w:tcW w:type="dxa" w:w="1080"/>
+            <w:tcW w:type="dxa" w:w="864"/>
           </w:tcPr>
           <w:p>
             <w:r>
@@ -4238,7 +4504,7 @@
         </w:tc>
         <w:tc>
           <w:tcPr>
-            <w:tcW w:type="dxa" w:w="1080"/>
+            <w:tcW w:type="dxa" w:w="720"/>
           </w:tcPr>
           <w:p>
             <w:r>
@@ -4251,7 +4517,7 @@
         </w:tc>
         <w:tc>
           <w:tcPr>
-            <w:tcW w:type="dxa" w:w="1080"/>
+            <w:tcW w:type="dxa" w:w="792"/>
           </w:tcPr>
           <w:p>
             <w:r>
@@ -4264,7 +4530,7 @@
         </w:tc>
         <w:tc>
           <w:tcPr>
-            <w:tcW w:type="dxa" w:w="1080"/>
+            <w:tcW w:type="dxa" w:w="864"/>
           </w:tcPr>
           <w:p>
             <w:r>
@@ -4277,7 +4543,7 @@
         </w:tc>
         <w:tc>
           <w:tcPr>
-            <w:tcW w:type="dxa" w:w="1080"/>
+            <w:tcW w:type="dxa" w:w="1037"/>
           </w:tcPr>
           <w:p>
             <w:r>
@@ -4290,7 +4556,7 @@
         </w:tc>
         <w:tc>
           <w:tcPr>
-            <w:tcW w:type="dxa" w:w="1080"/>
+            <w:tcW w:type="dxa" w:w="763"/>
           </w:tcPr>
           <w:p>
             <w:r>
@@ -4305,7 +4571,7 @@
       <w:tr>
         <w:tc>
           <w:tcPr>
-            <w:tcW w:type="dxa" w:w="1080"/>
+            <w:tcW w:type="dxa" w:w="2304"/>
           </w:tcPr>
           <w:p>
             <w:r>
@@ -4318,7 +4584,7 @@
         </w:tc>
         <w:tc>
           <w:tcPr>
-            <w:tcW w:type="dxa" w:w="1080"/>
+            <w:tcW w:type="dxa" w:w="2088"/>
           </w:tcPr>
           <w:p>
             <w:r>
@@ -4331,7 +4597,7 @@
         </w:tc>
         <w:tc>
           <w:tcPr>
-            <w:tcW w:type="dxa" w:w="1080"/>
+            <w:tcW w:type="dxa" w:w="864"/>
           </w:tcPr>
           <w:p>
             <w:r>
@@ -4344,7 +4610,7 @@
         </w:tc>
         <w:tc>
           <w:tcPr>
-            <w:tcW w:type="dxa" w:w="1080"/>
+            <w:tcW w:type="dxa" w:w="720"/>
           </w:tcPr>
           <w:p>
             <w:r>
@@ -4357,7 +4623,7 @@
         </w:tc>
         <w:tc>
           <w:tcPr>
-            <w:tcW w:type="dxa" w:w="1080"/>
+            <w:tcW w:type="dxa" w:w="792"/>
           </w:tcPr>
           <w:p>
             <w:r>
@@ -4370,7 +4636,7 @@
         </w:tc>
         <w:tc>
           <w:tcPr>
-            <w:tcW w:type="dxa" w:w="1080"/>
+            <w:tcW w:type="dxa" w:w="864"/>
           </w:tcPr>
           <w:p>
             <w:r>
@@ -4383,7 +4649,7 @@
         </w:tc>
         <w:tc>
           <w:tcPr>
-            <w:tcW w:type="dxa" w:w="1080"/>
+            <w:tcW w:type="dxa" w:w="1037"/>
           </w:tcPr>
           <w:p>
             <w:r>
@@ -4396,7 +4662,7 @@
         </w:tc>
         <w:tc>
           <w:tcPr>
-            <w:tcW w:type="dxa" w:w="1080"/>
+            <w:tcW w:type="dxa" w:w="763"/>
           </w:tcPr>
           <w:p>
             <w:r>
@@ -4411,7 +4677,7 @@
       <w:tr>
         <w:tc>
           <w:tcPr>
-            <w:tcW w:type="dxa" w:w="1080"/>
+            <w:tcW w:type="dxa" w:w="2304"/>
           </w:tcPr>
           <w:p>
             <w:r>
@@ -4424,7 +4690,7 @@
         </w:tc>
         <w:tc>
           <w:tcPr>
-            <w:tcW w:type="dxa" w:w="1080"/>
+            <w:tcW w:type="dxa" w:w="2088"/>
           </w:tcPr>
           <w:p>
             <w:r>
@@ -4437,7 +4703,7 @@
         </w:tc>
         <w:tc>
           <w:tcPr>
-            <w:tcW w:type="dxa" w:w="1080"/>
+            <w:tcW w:type="dxa" w:w="864"/>
           </w:tcPr>
           <w:p>
             <w:r>
@@ -4450,7 +4716,7 @@
         </w:tc>
         <w:tc>
           <w:tcPr>
-            <w:tcW w:type="dxa" w:w="1080"/>
+            <w:tcW w:type="dxa" w:w="720"/>
           </w:tcPr>
           <w:p>
             <w:r>
@@ -4463,7 +4729,7 @@
         </w:tc>
         <w:tc>
           <w:tcPr>
-            <w:tcW w:type="dxa" w:w="1080"/>
+            <w:tcW w:type="dxa" w:w="792"/>
           </w:tcPr>
           <w:p>
             <w:r>
@@ -4476,7 +4742,7 @@
         </w:tc>
         <w:tc>
           <w:tcPr>
-            <w:tcW w:type="dxa" w:w="1080"/>
+            <w:tcW w:type="dxa" w:w="864"/>
           </w:tcPr>
           <w:p>
             <w:r>
@@ -4489,7 +4755,7 @@
         </w:tc>
         <w:tc>
           <w:tcPr>
-            <w:tcW w:type="dxa" w:w="1080"/>
+            <w:tcW w:type="dxa" w:w="1037"/>
           </w:tcPr>
           <w:p>
             <w:r>
@@ -4502,7 +4768,7 @@
         </w:tc>
         <w:tc>
           <w:tcPr>
-            <w:tcW w:type="dxa" w:w="1080"/>
+            <w:tcW w:type="dxa" w:w="763"/>
           </w:tcPr>
           <w:p>
             <w:r>
@@ -4517,7 +4783,7 @@
       <w:tr>
         <w:tc>
           <w:tcPr>
-            <w:tcW w:type="dxa" w:w="1080"/>
+            <w:tcW w:type="dxa" w:w="2304"/>
           </w:tcPr>
           <w:p>
             <w:r>
@@ -4530,7 +4796,7 @@
         </w:tc>
         <w:tc>
           <w:tcPr>
-            <w:tcW w:type="dxa" w:w="1080"/>
+            <w:tcW w:type="dxa" w:w="2088"/>
           </w:tcPr>
           <w:p>
             <w:r>
@@ -4543,7 +4809,7 @@
         </w:tc>
         <w:tc>
           <w:tcPr>
-            <w:tcW w:type="dxa" w:w="1080"/>
+            <w:tcW w:type="dxa" w:w="864"/>
           </w:tcPr>
           <w:p>
             <w:r>
@@ -4556,7 +4822,7 @@
         </w:tc>
         <w:tc>
           <w:tcPr>
-            <w:tcW w:type="dxa" w:w="1080"/>
+            <w:tcW w:type="dxa" w:w="720"/>
           </w:tcPr>
           <w:p>
             <w:r>
@@ -4569,7 +4835,7 @@
         </w:tc>
         <w:tc>
           <w:tcPr>
-            <w:tcW w:type="dxa" w:w="1080"/>
+            <w:tcW w:type="dxa" w:w="792"/>
           </w:tcPr>
           <w:p>
             <w:r>
@@ -4582,7 +4848,7 @@
         </w:tc>
         <w:tc>
           <w:tcPr>
-            <w:tcW w:type="dxa" w:w="1080"/>
+            <w:tcW w:type="dxa" w:w="864"/>
           </w:tcPr>
           <w:p>
             <w:r>
@@ -4595,7 +4861,7 @@
         </w:tc>
         <w:tc>
           <w:tcPr>
-            <w:tcW w:type="dxa" w:w="1080"/>
+            <w:tcW w:type="dxa" w:w="1037"/>
           </w:tcPr>
           <w:p>
             <w:r>
@@ -4608,7 +4874,7 @@
         </w:tc>
         <w:tc>
           <w:tcPr>
-            <w:tcW w:type="dxa" w:w="1080"/>
+            <w:tcW w:type="dxa" w:w="763"/>
           </w:tcPr>
           <w:p>
             <w:r>
@@ -4623,7 +4889,7 @@
       <w:tr>
         <w:tc>
           <w:tcPr>
-            <w:tcW w:type="dxa" w:w="1080"/>
+            <w:tcW w:type="dxa" w:w="2304"/>
           </w:tcPr>
           <w:p>
             <w:r>
@@ -4636,7 +4902,7 @@
         </w:tc>
         <w:tc>
           <w:tcPr>
-            <w:tcW w:type="dxa" w:w="1080"/>
+            <w:tcW w:type="dxa" w:w="2088"/>
           </w:tcPr>
           <w:p>
             <w:r>
@@ -4649,7 +4915,7 @@
         </w:tc>
         <w:tc>
           <w:tcPr>
-            <w:tcW w:type="dxa" w:w="1080"/>
+            <w:tcW w:type="dxa" w:w="864"/>
           </w:tcPr>
           <w:p>
             <w:r>
@@ -4662,7 +4928,7 @@
         </w:tc>
         <w:tc>
           <w:tcPr>
-            <w:tcW w:type="dxa" w:w="1080"/>
+            <w:tcW w:type="dxa" w:w="720"/>
           </w:tcPr>
           <w:p>
             <w:r>
@@ -4675,7 +4941,7 @@
         </w:tc>
         <w:tc>
           <w:tcPr>
-            <w:tcW w:type="dxa" w:w="1080"/>
+            <w:tcW w:type="dxa" w:w="792"/>
           </w:tcPr>
           <w:p>
             <w:r>
@@ -4688,7 +4954,7 @@
         </w:tc>
         <w:tc>
           <w:tcPr>
-            <w:tcW w:type="dxa" w:w="1080"/>
+            <w:tcW w:type="dxa" w:w="864"/>
           </w:tcPr>
           <w:p>
             <w:r>
@@ -4701,7 +4967,7 @@
         </w:tc>
         <w:tc>
           <w:tcPr>
-            <w:tcW w:type="dxa" w:w="1080"/>
+            <w:tcW w:type="dxa" w:w="1037"/>
           </w:tcPr>
           <w:p>
             <w:r>
@@ -4714,7 +4980,7 @@
         </w:tc>
         <w:tc>
           <w:tcPr>
-            <w:tcW w:type="dxa" w:w="1080"/>
+            <w:tcW w:type="dxa" w:w="763"/>
           </w:tcPr>
           <w:p>
             <w:r>
@@ -4729,7 +4995,7 @@
       <w:tr>
         <w:tc>
           <w:tcPr>
-            <w:tcW w:type="dxa" w:w="1080"/>
+            <w:tcW w:type="dxa" w:w="2304"/>
           </w:tcPr>
           <w:p>
             <w:r>
@@ -4742,7 +5008,7 @@
         </w:tc>
         <w:tc>
           <w:tcPr>
-            <w:tcW w:type="dxa" w:w="1080"/>
+            <w:tcW w:type="dxa" w:w="2088"/>
           </w:tcPr>
           <w:p>
             <w:r>
@@ -4755,7 +5021,7 @@
         </w:tc>
         <w:tc>
           <w:tcPr>
-            <w:tcW w:type="dxa" w:w="1080"/>
+            <w:tcW w:type="dxa" w:w="864"/>
           </w:tcPr>
           <w:p>
             <w:r>
@@ -4768,7 +5034,7 @@
         </w:tc>
         <w:tc>
           <w:tcPr>
-            <w:tcW w:type="dxa" w:w="1080"/>
+            <w:tcW w:type="dxa" w:w="720"/>
           </w:tcPr>
           <w:p>
             <w:r>
@@ -4781,7 +5047,7 @@
         </w:tc>
         <w:tc>
           <w:tcPr>
-            <w:tcW w:type="dxa" w:w="1080"/>
+            <w:tcW w:type="dxa" w:w="792"/>
           </w:tcPr>
           <w:p>
             <w:r>
@@ -4794,7 +5060,7 @@
         </w:tc>
         <w:tc>
           <w:tcPr>
-            <w:tcW w:type="dxa" w:w="1080"/>
+            <w:tcW w:type="dxa" w:w="864"/>
           </w:tcPr>
           <w:p>
             <w:r>
@@ -4807,7 +5073,7 @@
         </w:tc>
         <w:tc>
           <w:tcPr>
-            <w:tcW w:type="dxa" w:w="1080"/>
+            <w:tcW w:type="dxa" w:w="1037"/>
           </w:tcPr>
           <w:p>
             <w:r>
@@ -4820,7 +5086,7 @@
         </w:tc>
         <w:tc>
           <w:tcPr>
-            <w:tcW w:type="dxa" w:w="1080"/>
+            <w:tcW w:type="dxa" w:w="763"/>
           </w:tcPr>
           <w:p>
             <w:r>

</xml_diff>

<commit_message>
Table 1 = bảng đầy đủ 25 configs (bỏ bảng chọn lọc + bỏ Table 2); còn 1 bảng duy nhất trong Results
</commit_message>
<xml_diff>
--- a/paper/SNN-Flood-Paper.docx
+++ b/paper/SNN-Flood-Paper.docx
@@ -350,1497 +350,6 @@
           <w:sz w:val="22"/>
         </w:rPr>
         <w:t>5.1 Main comparison (Table 1)</w:t>
-      </w:r>
-    </w:p>
-    <w:tbl>
-      <w:tblPr>
-        <w:tblStyle w:val="LightGrid-Accent1"/>
-        <w:tblW w:type="auto" w:w="0"/>
-        <w:tblLayout w:type="fixed"/>
-        <w:tblLook w:firstColumn="1" w:firstRow="1" w:lastColumn="0" w:lastRow="0" w:noHBand="0" w:noVBand="1" w:val="04A0"/>
-      </w:tblPr>
-      <w:tblGrid>
-        <w:gridCol w:w="1080"/>
-        <w:gridCol w:w="1080"/>
-        <w:gridCol w:w="1080"/>
-        <w:gridCol w:w="1080"/>
-        <w:gridCol w:w="1080"/>
-        <w:gridCol w:w="1080"/>
-        <w:gridCol w:w="1080"/>
-        <w:gridCol w:w="1080"/>
-      </w:tblGrid>
-      <w:tr>
-        <w:tc>
-          <w:tcPr>
-            <w:tcW w:type="dxa" w:w="2232"/>
-          </w:tcPr>
-          <w:p>
-            <w:pPr>
-              <w:spacing w:after="20" w:before="20"/>
-            </w:pPr>
-            <w:r>
-              <w:rPr>
-                <w:b/>
-                <w:sz w:val="17"/>
-              </w:rPr>
-              <w:t>Model</w:t>
-            </w:r>
-          </w:p>
-        </w:tc>
-        <w:tc>
-          <w:tcPr>
-            <w:tcW w:type="dxa" w:w="1368"/>
-          </w:tcPr>
-          <w:p>
-            <w:pPr>
-              <w:spacing w:after="20" w:before="20"/>
-            </w:pPr>
-            <w:r>
-              <w:rPr>
-                <w:b/>
-                <w:sz w:val="17"/>
-              </w:rPr>
-              <w:t>Group</w:t>
-            </w:r>
-          </w:p>
-        </w:tc>
-        <w:tc>
-          <w:tcPr>
-            <w:tcW w:type="dxa" w:w="893"/>
-          </w:tcPr>
-          <w:p>
-            <w:pPr>
-              <w:spacing w:after="20" w:before="20"/>
-            </w:pPr>
-            <w:r>
-              <w:rPr>
-                <w:b/>
-                <w:sz w:val="17"/>
-              </w:rPr>
-              <w:t>Params</w:t>
-            </w:r>
-          </w:p>
-        </w:tc>
-        <w:tc>
-          <w:tcPr>
-            <w:tcW w:type="dxa" w:w="1037"/>
-          </w:tcPr>
-          <w:p>
-            <w:pPr>
-              <w:spacing w:after="20" w:before="20"/>
-            </w:pPr>
-            <w:r>
-              <w:rPr>
-                <w:b/>
-                <w:sz w:val="17"/>
-              </w:rPr>
-              <w:t>Energy(mJ)</w:t>
-            </w:r>
-          </w:p>
-        </w:tc>
-        <w:tc>
-          <w:tcPr>
-            <w:tcW w:type="dxa" w:w="1325"/>
-          </w:tcPr>
-          <w:p>
-            <w:pPr>
-              <w:spacing w:after="20" w:before="20"/>
-            </w:pPr>
-            <w:r>
-              <w:rPr>
-                <w:b/>
-                <w:sz w:val="17"/>
-              </w:rPr>
-              <w:t>Pooled IoU</w:t>
-            </w:r>
-          </w:p>
-        </w:tc>
-        <w:tc>
-          <w:tcPr>
-            <w:tcW w:type="dxa" w:w="893"/>
-          </w:tcPr>
-          <w:p>
-            <w:pPr>
-              <w:spacing w:after="20" w:before="20"/>
-            </w:pPr>
-            <w:r>
-              <w:rPr>
-                <w:b/>
-                <w:sz w:val="17"/>
-              </w:rPr>
-              <w:t>Per-chip</w:t>
-            </w:r>
-          </w:p>
-        </w:tc>
-        <w:tc>
-          <w:tcPr>
-            <w:tcW w:type="dxa" w:w="792"/>
-          </w:tcPr>
-          <w:p>
-            <w:pPr>
-              <w:spacing w:after="20" w:before="20"/>
-            </w:pPr>
-            <w:r>
-              <w:rPr>
-                <w:b/>
-                <w:sz w:val="17"/>
-              </w:rPr>
-              <w:t>Spike%</w:t>
-            </w:r>
-          </w:p>
-        </w:tc>
-        <w:tc>
-          <w:tcPr>
-            <w:tcW w:type="dxa" w:w="792"/>
-          </w:tcPr>
-          <w:p>
-            <w:pPr>
-              <w:spacing w:after="20" w:before="20"/>
-            </w:pPr>
-            <w:r>
-              <w:rPr>
-                <w:b/>
-                <w:sz w:val="17"/>
-              </w:rPr>
-              <w:t>Cluster</w:t>
-            </w:r>
-          </w:p>
-        </w:tc>
-      </w:tr>
-      <w:tr>
-        <w:tc>
-          <w:tcPr>
-            <w:tcW w:type="dxa" w:w="2232"/>
-          </w:tcPr>
-          <w:p>
-            <w:pPr>
-              <w:spacing w:after="20" w:before="20"/>
-            </w:pPr>
-            <w:r>
-              <w:rPr>
-                <w:sz w:val="17"/>
-              </w:rPr>
-              <w:t>SegFormer-b2</w:t>
-            </w:r>
-          </w:p>
-        </w:tc>
-        <w:tc>
-          <w:tcPr>
-            <w:tcW w:type="dxa" w:w="1368"/>
-          </w:tcPr>
-          <w:p>
-            <w:pPr>
-              <w:spacing w:after="20" w:before="20"/>
-            </w:pPr>
-            <w:r>
-              <w:rPr>
-                <w:sz w:val="17"/>
-              </w:rPr>
-              <w:t>Transformer</w:t>
-            </w:r>
-          </w:p>
-        </w:tc>
-        <w:tc>
-          <w:tcPr>
-            <w:tcW w:type="dxa" w:w="893"/>
-          </w:tcPr>
-          <w:p>
-            <w:pPr>
-              <w:spacing w:after="20" w:before="20"/>
-            </w:pPr>
-            <w:r>
-              <w:rPr>
-                <w:sz w:val="17"/>
-              </w:rPr>
-              <w:t>24.7M</w:t>
-            </w:r>
-          </w:p>
-        </w:tc>
-        <w:tc>
-          <w:tcPr>
-            <w:tcW w:type="dxa" w:w="1037"/>
-          </w:tcPr>
-          <w:p>
-            <w:pPr>
-              <w:spacing w:after="20" w:before="20"/>
-            </w:pPr>
-            <w:r>
-              <w:rPr>
-                <w:sz w:val="17"/>
-              </w:rPr>
-              <w:t>98.0</w:t>
-            </w:r>
-          </w:p>
-        </w:tc>
-        <w:tc>
-          <w:tcPr>
-            <w:tcW w:type="dxa" w:w="1325"/>
-          </w:tcPr>
-          <w:p>
-            <w:pPr>
-              <w:spacing w:after="20" w:before="20"/>
-            </w:pPr>
-            <w:r>
-              <w:rPr>
-                <w:sz w:val="17"/>
-              </w:rPr>
-              <w:t>0.525±0.018</w:t>
-            </w:r>
-          </w:p>
-        </w:tc>
-        <w:tc>
-          <w:tcPr>
-            <w:tcW w:type="dxa" w:w="893"/>
-          </w:tcPr>
-          <w:p>
-            <w:pPr>
-              <w:spacing w:after="20" w:before="20"/>
-            </w:pPr>
-            <w:r>
-              <w:rPr>
-                <w:sz w:val="17"/>
-              </w:rPr>
-              <w:t>0.251</w:t>
-            </w:r>
-          </w:p>
-        </w:tc>
-        <w:tc>
-          <w:tcPr>
-            <w:tcW w:type="dxa" w:w="792"/>
-          </w:tcPr>
-          <w:p>
-            <w:pPr>
-              <w:spacing w:after="20" w:before="20"/>
-            </w:pPr>
-            <w:r>
-              <w:rPr>
-                <w:sz w:val="17"/>
-              </w:rPr>
-              <w:t>—</w:t>
-            </w:r>
-          </w:p>
-        </w:tc>
-        <w:tc>
-          <w:tcPr>
-            <w:tcW w:type="dxa" w:w="792"/>
-          </w:tcPr>
-          <w:p>
-            <w:pPr>
-              <w:spacing w:after="20" w:before="20"/>
-            </w:pPr>
-            <w:r>
-              <w:rPr>
-                <w:sz w:val="17"/>
-              </w:rPr>
-              <w:t>A</w:t>
-            </w:r>
-          </w:p>
-        </w:tc>
-      </w:tr>
-      <w:tr>
-        <w:tc>
-          <w:tcPr>
-            <w:tcW w:type="dxa" w:w="2232"/>
-          </w:tcPr>
-          <w:p>
-            <w:pPr>
-              <w:spacing w:after="20" w:before="20"/>
-            </w:pPr>
-            <w:r>
-              <w:rPr>
-                <w:sz w:val="17"/>
-              </w:rPr>
-              <w:t>U-Net (SMP)</w:t>
-            </w:r>
-          </w:p>
-        </w:tc>
-        <w:tc>
-          <w:tcPr>
-            <w:tcW w:type="dxa" w:w="1368"/>
-          </w:tcPr>
-          <w:p>
-            <w:pPr>
-              <w:spacing w:after="20" w:before="20"/>
-            </w:pPr>
-            <w:r>
-              <w:rPr>
-                <w:sz w:val="17"/>
-              </w:rPr>
-              <w:t>CNN</w:t>
-            </w:r>
-          </w:p>
-        </w:tc>
-        <w:tc>
-          <w:tcPr>
-            <w:tcW w:type="dxa" w:w="893"/>
-          </w:tcPr>
-          <w:p>
-            <w:pPr>
-              <w:spacing w:after="20" w:before="20"/>
-            </w:pPr>
-            <w:r>
-              <w:rPr>
-                <w:sz w:val="17"/>
-              </w:rPr>
-              <w:t>24.4M</w:t>
-            </w:r>
-          </w:p>
-        </w:tc>
-        <w:tc>
-          <w:tcPr>
-            <w:tcW w:type="dxa" w:w="1037"/>
-          </w:tcPr>
-          <w:p>
-            <w:pPr>
-              <w:spacing w:after="20" w:before="20"/>
-            </w:pPr>
-            <w:r>
-              <w:rPr>
-                <w:sz w:val="17"/>
-              </w:rPr>
-              <w:t>143.9</w:t>
-            </w:r>
-          </w:p>
-        </w:tc>
-        <w:tc>
-          <w:tcPr>
-            <w:tcW w:type="dxa" w:w="1325"/>
-          </w:tcPr>
-          <w:p>
-            <w:pPr>
-              <w:spacing w:after="20" w:before="20"/>
-            </w:pPr>
-            <w:r>
-              <w:rPr>
-                <w:sz w:val="17"/>
-              </w:rPr>
-              <w:t>0.509±0.028</w:t>
-            </w:r>
-          </w:p>
-        </w:tc>
-        <w:tc>
-          <w:tcPr>
-            <w:tcW w:type="dxa" w:w="893"/>
-          </w:tcPr>
-          <w:p>
-            <w:pPr>
-              <w:spacing w:after="20" w:before="20"/>
-            </w:pPr>
-            <w:r>
-              <w:rPr>
-                <w:sz w:val="17"/>
-              </w:rPr>
-              <w:t>0.291</w:t>
-            </w:r>
-          </w:p>
-        </w:tc>
-        <w:tc>
-          <w:tcPr>
-            <w:tcW w:type="dxa" w:w="792"/>
-          </w:tcPr>
-          <w:p>
-            <w:pPr>
-              <w:spacing w:after="20" w:before="20"/>
-            </w:pPr>
-            <w:r>
-              <w:rPr>
-                <w:sz w:val="17"/>
-              </w:rPr>
-              <w:t>—</w:t>
-            </w:r>
-          </w:p>
-        </w:tc>
-        <w:tc>
-          <w:tcPr>
-            <w:tcW w:type="dxa" w:w="792"/>
-          </w:tcPr>
-          <w:p>
-            <w:pPr>
-              <w:spacing w:after="20" w:before="20"/>
-            </w:pPr>
-            <w:r>
-              <w:rPr>
-                <w:sz w:val="17"/>
-              </w:rPr>
-              <w:t>A</w:t>
-            </w:r>
-          </w:p>
-        </w:tc>
-      </w:tr>
-      <w:tr>
-        <w:tc>
-          <w:tcPr>
-            <w:tcW w:type="dxa" w:w="2232"/>
-          </w:tcPr>
-          <w:p>
-            <w:pPr>
-              <w:spacing w:after="20" w:before="20"/>
-            </w:pPr>
-            <w:r>
-              <w:rPr>
-                <w:sz w:val="17"/>
-              </w:rPr>
-              <w:t>U-Net++</w:t>
-            </w:r>
-          </w:p>
-        </w:tc>
-        <w:tc>
-          <w:tcPr>
-            <w:tcW w:type="dxa" w:w="1368"/>
-          </w:tcPr>
-          <w:p>
-            <w:pPr>
-              <w:spacing w:after="20" w:before="20"/>
-            </w:pPr>
-            <w:r>
-              <w:rPr>
-                <w:sz w:val="17"/>
-              </w:rPr>
-              <w:t>CNN</w:t>
-            </w:r>
-          </w:p>
-        </w:tc>
-        <w:tc>
-          <w:tcPr>
-            <w:tcW w:type="dxa" w:w="893"/>
-          </w:tcPr>
-          <w:p>
-            <w:pPr>
-              <w:spacing w:after="20" w:before="20"/>
-            </w:pPr>
-            <w:r>
-              <w:rPr>
-                <w:sz w:val="17"/>
-              </w:rPr>
-              <w:t>26.1M</w:t>
-            </w:r>
-          </w:p>
-        </w:tc>
-        <w:tc>
-          <w:tcPr>
-            <w:tcW w:type="dxa" w:w="1037"/>
-          </w:tcPr>
-          <w:p>
-            <w:pPr>
-              <w:spacing w:after="20" w:before="20"/>
-            </w:pPr>
-            <w:r>
-              <w:rPr>
-                <w:sz w:val="17"/>
-              </w:rPr>
-              <w:t>339.1</w:t>
-            </w:r>
-          </w:p>
-        </w:tc>
-        <w:tc>
-          <w:tcPr>
-            <w:tcW w:type="dxa" w:w="1325"/>
-          </w:tcPr>
-          <w:p>
-            <w:pPr>
-              <w:spacing w:after="20" w:before="20"/>
-            </w:pPr>
-            <w:r>
-              <w:rPr>
-                <w:sz w:val="17"/>
-              </w:rPr>
-              <w:t>0.500±0.026</w:t>
-            </w:r>
-          </w:p>
-        </w:tc>
-        <w:tc>
-          <w:tcPr>
-            <w:tcW w:type="dxa" w:w="893"/>
-          </w:tcPr>
-          <w:p>
-            <w:pPr>
-              <w:spacing w:after="20" w:before="20"/>
-            </w:pPr>
-            <w:r>
-              <w:rPr>
-                <w:sz w:val="17"/>
-              </w:rPr>
-              <w:t>0.264</w:t>
-            </w:r>
-          </w:p>
-        </w:tc>
-        <w:tc>
-          <w:tcPr>
-            <w:tcW w:type="dxa" w:w="792"/>
-          </w:tcPr>
-          <w:p>
-            <w:pPr>
-              <w:spacing w:after="20" w:before="20"/>
-            </w:pPr>
-            <w:r>
-              <w:rPr>
-                <w:sz w:val="17"/>
-              </w:rPr>
-              <w:t>—</w:t>
-            </w:r>
-          </w:p>
-        </w:tc>
-        <w:tc>
-          <w:tcPr>
-            <w:tcW w:type="dxa" w:w="792"/>
-          </w:tcPr>
-          <w:p>
-            <w:pPr>
-              <w:spacing w:after="20" w:before="20"/>
-            </w:pPr>
-            <w:r>
-              <w:rPr>
-                <w:sz w:val="17"/>
-              </w:rPr>
-              <w:t>A</w:t>
-            </w:r>
-          </w:p>
-        </w:tc>
-      </w:tr>
-      <w:tr>
-        <w:tc>
-          <w:tcPr>
-            <w:tcW w:type="dxa" w:w="2232"/>
-          </w:tcPr>
-          <w:p>
-            <w:pPr>
-              <w:spacing w:after="20" w:before="20"/>
-            </w:pPr>
-            <w:r>
-              <w:rPr>
-                <w:sz w:val="17"/>
-              </w:rPr>
-              <w:t>MobileNet-UNet</w:t>
-            </w:r>
-          </w:p>
-        </w:tc>
-        <w:tc>
-          <w:tcPr>
-            <w:tcW w:type="dxa" w:w="1368"/>
-          </w:tcPr>
-          <w:p>
-            <w:pPr>
-              <w:spacing w:after="20" w:before="20"/>
-            </w:pPr>
-            <w:r>
-              <w:rPr>
-                <w:sz w:val="17"/>
-              </w:rPr>
-              <w:t>CNN</w:t>
-            </w:r>
-          </w:p>
-        </w:tc>
-        <w:tc>
-          <w:tcPr>
-            <w:tcW w:type="dxa" w:w="893"/>
-          </w:tcPr>
-          <w:p>
-            <w:pPr>
-              <w:spacing w:after="20" w:before="20"/>
-            </w:pPr>
-            <w:r>
-              <w:rPr>
-                <w:sz w:val="17"/>
-              </w:rPr>
-              <w:t>6.6M</w:t>
-            </w:r>
-          </w:p>
-        </w:tc>
-        <w:tc>
-          <w:tcPr>
-            <w:tcW w:type="dxa" w:w="1037"/>
-          </w:tcPr>
-          <w:p>
-            <w:pPr>
-              <w:spacing w:after="20" w:before="20"/>
-            </w:pPr>
-            <w:r>
-              <w:rPr>
-                <w:sz w:val="17"/>
-              </w:rPr>
-              <w:t>62.7</w:t>
-            </w:r>
-          </w:p>
-        </w:tc>
-        <w:tc>
-          <w:tcPr>
-            <w:tcW w:type="dxa" w:w="1325"/>
-          </w:tcPr>
-          <w:p>
-            <w:pPr>
-              <w:spacing w:after="20" w:before="20"/>
-            </w:pPr>
-            <w:r>
-              <w:rPr>
-                <w:sz w:val="17"/>
-              </w:rPr>
-              <w:t>0.498±0.007</w:t>
-            </w:r>
-          </w:p>
-        </w:tc>
-        <w:tc>
-          <w:tcPr>
-            <w:tcW w:type="dxa" w:w="893"/>
-          </w:tcPr>
-          <w:p>
-            <w:pPr>
-              <w:spacing w:after="20" w:before="20"/>
-            </w:pPr>
-            <w:r>
-              <w:rPr>
-                <w:sz w:val="17"/>
-              </w:rPr>
-              <w:t>0.272</w:t>
-            </w:r>
-          </w:p>
-        </w:tc>
-        <w:tc>
-          <w:tcPr>
-            <w:tcW w:type="dxa" w:w="792"/>
-          </w:tcPr>
-          <w:p>
-            <w:pPr>
-              <w:spacing w:after="20" w:before="20"/>
-            </w:pPr>
-            <w:r>
-              <w:rPr>
-                <w:sz w:val="17"/>
-              </w:rPr>
-              <w:t>—</w:t>
-            </w:r>
-          </w:p>
-        </w:tc>
-        <w:tc>
-          <w:tcPr>
-            <w:tcW w:type="dxa" w:w="792"/>
-          </w:tcPr>
-          <w:p>
-            <w:pPr>
-              <w:spacing w:after="20" w:before="20"/>
-            </w:pPr>
-            <w:r>
-              <w:rPr>
-                <w:sz w:val="17"/>
-              </w:rPr>
-              <w:t>A</w:t>
-            </w:r>
-          </w:p>
-        </w:tc>
-      </w:tr>
-      <w:tr>
-        <w:tc>
-          <w:tcPr>
-            <w:tcW w:type="dxa" w:w="2232"/>
-          </w:tcPr>
-          <w:p>
-            <w:pPr>
-              <w:spacing w:after="20" w:before="20"/>
-            </w:pPr>
-            <w:r>
-              <w:rPr>
-                <w:sz w:val="17"/>
-              </w:rPr>
-              <w:t>MobileNet-UNet INT8</w:t>
-            </w:r>
-          </w:p>
-        </w:tc>
-        <w:tc>
-          <w:tcPr>
-            <w:tcW w:type="dxa" w:w="1368"/>
-          </w:tcPr>
-          <w:p>
-            <w:pPr>
-              <w:spacing w:after="20" w:before="20"/>
-            </w:pPr>
-            <w:r>
-              <w:rPr>
-                <w:sz w:val="17"/>
-              </w:rPr>
-              <w:t>Quantized</w:t>
-            </w:r>
-          </w:p>
-        </w:tc>
-        <w:tc>
-          <w:tcPr>
-            <w:tcW w:type="dxa" w:w="893"/>
-          </w:tcPr>
-          <w:p>
-            <w:pPr>
-              <w:spacing w:after="20" w:before="20"/>
-            </w:pPr>
-            <w:r>
-              <w:rPr>
-                <w:sz w:val="17"/>
-              </w:rPr>
-              <w:t>6.6M</w:t>
-            </w:r>
-          </w:p>
-        </w:tc>
-        <w:tc>
-          <w:tcPr>
-            <w:tcW w:type="dxa" w:w="1037"/>
-          </w:tcPr>
-          <w:p>
-            <w:pPr>
-              <w:spacing w:after="20" w:before="20"/>
-            </w:pPr>
-            <w:r>
-              <w:rPr>
-                <w:sz w:val="17"/>
-              </w:rPr>
-              <w:t>3.1</w:t>
-            </w:r>
-          </w:p>
-        </w:tc>
-        <w:tc>
-          <w:tcPr>
-            <w:tcW w:type="dxa" w:w="1325"/>
-          </w:tcPr>
-          <w:p>
-            <w:pPr>
-              <w:spacing w:after="20" w:before="20"/>
-            </w:pPr>
-            <w:r>
-              <w:rPr>
-                <w:sz w:val="17"/>
-              </w:rPr>
-              <w:t>0.490±0.003</w:t>
-            </w:r>
-          </w:p>
-        </w:tc>
-        <w:tc>
-          <w:tcPr>
-            <w:tcW w:type="dxa" w:w="893"/>
-          </w:tcPr>
-          <w:p>
-            <w:pPr>
-              <w:spacing w:after="20" w:before="20"/>
-            </w:pPr>
-            <w:r>
-              <w:rPr>
-                <w:sz w:val="17"/>
-              </w:rPr>
-              <w:t>0.258</w:t>
-            </w:r>
-          </w:p>
-        </w:tc>
-        <w:tc>
-          <w:tcPr>
-            <w:tcW w:type="dxa" w:w="792"/>
-          </w:tcPr>
-          <w:p>
-            <w:pPr>
-              <w:spacing w:after="20" w:before="20"/>
-            </w:pPr>
-            <w:r>
-              <w:rPr>
-                <w:sz w:val="17"/>
-              </w:rPr>
-              <w:t>—</w:t>
-            </w:r>
-          </w:p>
-        </w:tc>
-        <w:tc>
-          <w:tcPr>
-            <w:tcW w:type="dxa" w:w="792"/>
-          </w:tcPr>
-          <w:p>
-            <w:pPr>
-              <w:spacing w:after="20" w:before="20"/>
-            </w:pPr>
-            <w:r>
-              <w:rPr>
-                <w:sz w:val="17"/>
-              </w:rPr>
-              <w:t>B</w:t>
-            </w:r>
-          </w:p>
-        </w:tc>
-      </w:tr>
-      <w:tr>
-        <w:tc>
-          <w:tcPr>
-            <w:tcW w:type="dxa" w:w="2232"/>
-          </w:tcPr>
-          <w:p>
-            <w:pPr>
-              <w:spacing w:after="20" w:before="20"/>
-            </w:pPr>
-            <w:r>
-              <w:rPr>
-                <w:sz w:val="17"/>
-              </w:rPr>
-              <w:t>U-Net (vanilla)</w:t>
-            </w:r>
-          </w:p>
-        </w:tc>
-        <w:tc>
-          <w:tcPr>
-            <w:tcW w:type="dxa" w:w="1368"/>
-          </w:tcPr>
-          <w:p>
-            <w:pPr>
-              <w:spacing w:after="20" w:before="20"/>
-            </w:pPr>
-            <w:r>
-              <w:rPr>
-                <w:sz w:val="17"/>
-              </w:rPr>
-              <w:t>CNN</w:t>
-            </w:r>
-          </w:p>
-        </w:tc>
-        <w:tc>
-          <w:tcPr>
-            <w:tcW w:type="dxa" w:w="893"/>
-          </w:tcPr>
-          <w:p>
-            <w:pPr>
-              <w:spacing w:after="20" w:before="20"/>
-            </w:pPr>
-            <w:r>
-              <w:rPr>
-                <w:sz w:val="17"/>
-              </w:rPr>
-              <w:t>7.8M</w:t>
-            </w:r>
-          </w:p>
-        </w:tc>
-        <w:tc>
-          <w:tcPr>
-            <w:tcW w:type="dxa" w:w="1037"/>
-          </w:tcPr>
-          <w:p>
-            <w:pPr>
-              <w:spacing w:after="20" w:before="20"/>
-            </w:pPr>
-            <w:r>
-              <w:rPr>
-                <w:sz w:val="17"/>
-              </w:rPr>
-              <w:t>223.2</w:t>
-            </w:r>
-          </w:p>
-        </w:tc>
-        <w:tc>
-          <w:tcPr>
-            <w:tcW w:type="dxa" w:w="1325"/>
-          </w:tcPr>
-          <w:p>
-            <w:pPr>
-              <w:spacing w:after="20" w:before="20"/>
-            </w:pPr>
-            <w:r>
-              <w:rPr>
-                <w:sz w:val="17"/>
-              </w:rPr>
-              <w:t>0.482±0.019</w:t>
-            </w:r>
-          </w:p>
-        </w:tc>
-        <w:tc>
-          <w:tcPr>
-            <w:tcW w:type="dxa" w:w="893"/>
-          </w:tcPr>
-          <w:p>
-            <w:pPr>
-              <w:spacing w:after="20" w:before="20"/>
-            </w:pPr>
-            <w:r>
-              <w:rPr>
-                <w:sz w:val="17"/>
-              </w:rPr>
-              <w:t>0.306</w:t>
-            </w:r>
-          </w:p>
-        </w:tc>
-        <w:tc>
-          <w:tcPr>
-            <w:tcW w:type="dxa" w:w="792"/>
-          </w:tcPr>
-          <w:p>
-            <w:pPr>
-              <w:spacing w:after="20" w:before="20"/>
-            </w:pPr>
-            <w:r>
-              <w:rPr>
-                <w:sz w:val="17"/>
-              </w:rPr>
-              <w:t>—</w:t>
-            </w:r>
-          </w:p>
-        </w:tc>
-        <w:tc>
-          <w:tcPr>
-            <w:tcW w:type="dxa" w:w="792"/>
-          </w:tcPr>
-          <w:p>
-            <w:pPr>
-              <w:spacing w:after="20" w:before="20"/>
-            </w:pPr>
-            <w:r>
-              <w:rPr>
-                <w:sz w:val="17"/>
-              </w:rPr>
-              <w:t>A</w:t>
-            </w:r>
-          </w:p>
-        </w:tc>
-      </w:tr>
-      <w:tr>
-        <w:tc>
-          <w:tcPr>
-            <w:tcW w:type="dxa" w:w="2232"/>
-          </w:tcPr>
-          <w:p>
-            <w:pPr>
-              <w:spacing w:after="20" w:before="20"/>
-            </w:pPr>
-            <w:r>
-              <w:rPr>
-                <w:sz w:val="17"/>
-              </w:rPr>
-              <w:t>SNN-Flood T2</w:t>
-            </w:r>
-          </w:p>
-        </w:tc>
-        <w:tc>
-          <w:tcPr>
-            <w:tcW w:type="dxa" w:w="1368"/>
-          </w:tcPr>
-          <w:p>
-            <w:pPr>
-              <w:spacing w:after="20" w:before="20"/>
-            </w:pPr>
-            <w:r>
-              <w:rPr>
-                <w:sz w:val="17"/>
-              </w:rPr>
-              <w:t>SNN</w:t>
-            </w:r>
-          </w:p>
-        </w:tc>
-        <w:tc>
-          <w:tcPr>
-            <w:tcW w:type="dxa" w:w="893"/>
-          </w:tcPr>
-          <w:p>
-            <w:pPr>
-              <w:spacing w:after="20" w:before="20"/>
-            </w:pPr>
-            <w:r>
-              <w:rPr>
-                <w:sz w:val="17"/>
-              </w:rPr>
-              <w:t>7.8M</w:t>
-            </w:r>
-          </w:p>
-        </w:tc>
-        <w:tc>
-          <w:tcPr>
-            <w:tcW w:type="dxa" w:w="1037"/>
-          </w:tcPr>
-          <w:p>
-            <w:pPr>
-              <w:spacing w:after="20" w:before="20"/>
-            </w:pPr>
-            <w:r>
-              <w:rPr>
-                <w:sz w:val="17"/>
-              </w:rPr>
-              <w:t>31.4</w:t>
-            </w:r>
-          </w:p>
-        </w:tc>
-        <w:tc>
-          <w:tcPr>
-            <w:tcW w:type="dxa" w:w="1325"/>
-          </w:tcPr>
-          <w:p>
-            <w:pPr>
-              <w:spacing w:after="20" w:before="20"/>
-            </w:pPr>
-            <w:r>
-              <w:rPr>
-                <w:sz w:val="17"/>
-              </w:rPr>
-              <w:t>0.391±0.045</w:t>
-            </w:r>
-          </w:p>
-        </w:tc>
-        <w:tc>
-          <w:tcPr>
-            <w:tcW w:type="dxa" w:w="893"/>
-          </w:tcPr>
-          <w:p>
-            <w:pPr>
-              <w:spacing w:after="20" w:before="20"/>
-            </w:pPr>
-            <w:r>
-              <w:rPr>
-                <w:sz w:val="17"/>
-              </w:rPr>
-              <w:t>0.240</w:t>
-            </w:r>
-          </w:p>
-        </w:tc>
-        <w:tc>
-          <w:tcPr>
-            <w:tcW w:type="dxa" w:w="792"/>
-          </w:tcPr>
-          <w:p>
-            <w:pPr>
-              <w:spacing w:after="20" w:before="20"/>
-            </w:pPr>
-            <w:r>
-              <w:rPr>
-                <w:sz w:val="17"/>
-              </w:rPr>
-              <w:t>13.6</w:t>
-            </w:r>
-          </w:p>
-        </w:tc>
-        <w:tc>
-          <w:tcPr>
-            <w:tcW w:type="dxa" w:w="792"/>
-          </w:tcPr>
-          <w:p>
-            <w:pPr>
-              <w:spacing w:after="20" w:before="20"/>
-            </w:pPr>
-            <w:r>
-              <w:rPr>
-                <w:sz w:val="17"/>
-              </w:rPr>
-              <w:t>B</w:t>
-            </w:r>
-          </w:p>
-        </w:tc>
-      </w:tr>
-      <w:tr>
-        <w:tc>
-          <w:tcPr>
-            <w:tcW w:type="dxa" w:w="2232"/>
-          </w:tcPr>
-          <w:p>
-            <w:pPr>
-              <w:spacing w:after="20" w:before="20"/>
-            </w:pPr>
-            <w:r>
-              <w:rPr>
-                <w:sz w:val="17"/>
-              </w:rPr>
-              <w:t>SNN-Flood T8</w:t>
-            </w:r>
-          </w:p>
-        </w:tc>
-        <w:tc>
-          <w:tcPr>
-            <w:tcW w:type="dxa" w:w="1368"/>
-          </w:tcPr>
-          <w:p>
-            <w:pPr>
-              <w:spacing w:after="20" w:before="20"/>
-            </w:pPr>
-            <w:r>
-              <w:rPr>
-                <w:sz w:val="17"/>
-              </w:rPr>
-              <w:t>SNN</w:t>
-            </w:r>
-          </w:p>
-        </w:tc>
-        <w:tc>
-          <w:tcPr>
-            <w:tcW w:type="dxa" w:w="893"/>
-          </w:tcPr>
-          <w:p>
-            <w:pPr>
-              <w:spacing w:after="20" w:before="20"/>
-            </w:pPr>
-            <w:r>
-              <w:rPr>
-                <w:sz w:val="17"/>
-              </w:rPr>
-              <w:t>7.8M</w:t>
-            </w:r>
-          </w:p>
-        </w:tc>
-        <w:tc>
-          <w:tcPr>
-            <w:tcW w:type="dxa" w:w="1037"/>
-          </w:tcPr>
-          <w:p>
-            <w:pPr>
-              <w:spacing w:after="20" w:before="20"/>
-            </w:pPr>
-            <w:r>
-              <w:rPr>
-                <w:sz w:val="17"/>
-              </w:rPr>
-              <w:t>166.8</w:t>
-            </w:r>
-          </w:p>
-        </w:tc>
-        <w:tc>
-          <w:tcPr>
-            <w:tcW w:type="dxa" w:w="1325"/>
-          </w:tcPr>
-          <w:p>
-            <w:pPr>
-              <w:spacing w:after="20" w:before="20"/>
-            </w:pPr>
-            <w:r>
-              <w:rPr>
-                <w:sz w:val="17"/>
-              </w:rPr>
-              <w:t>0.388±0.030</w:t>
-            </w:r>
-          </w:p>
-        </w:tc>
-        <w:tc>
-          <w:tcPr>
-            <w:tcW w:type="dxa" w:w="893"/>
-          </w:tcPr>
-          <w:p>
-            <w:pPr>
-              <w:spacing w:after="20" w:before="20"/>
-            </w:pPr>
-            <w:r>
-              <w:rPr>
-                <w:sz w:val="17"/>
-              </w:rPr>
-              <w:t>0.246</w:t>
-            </w:r>
-          </w:p>
-        </w:tc>
-        <w:tc>
-          <w:tcPr>
-            <w:tcW w:type="dxa" w:w="792"/>
-          </w:tcPr>
-          <w:p>
-            <w:pPr>
-              <w:spacing w:after="20" w:before="20"/>
-            </w:pPr>
-            <w:r>
-              <w:rPr>
-                <w:sz w:val="17"/>
-              </w:rPr>
-              <w:t>23.8</w:t>
-            </w:r>
-          </w:p>
-        </w:tc>
-        <w:tc>
-          <w:tcPr>
-            <w:tcW w:type="dxa" w:w="792"/>
-          </w:tcPr>
-          <w:p>
-            <w:pPr>
-              <w:spacing w:after="20" w:before="20"/>
-            </w:pPr>
-            <w:r>
-              <w:rPr>
-                <w:sz w:val="17"/>
-              </w:rPr>
-              <w:t>B</w:t>
-            </w:r>
-          </w:p>
-        </w:tc>
-      </w:tr>
-      <w:tr>
-        <w:tc>
-          <w:tcPr>
-            <w:tcW w:type="dxa" w:w="2232"/>
-          </w:tcPr>
-          <w:p>
-            <w:pPr>
-              <w:spacing w:after="20" w:before="20"/>
-            </w:pPr>
-            <w:r>
-              <w:rPr>
-                <w:sz w:val="17"/>
-              </w:rPr>
-              <w:t>ANN2SNN (T=128)</w:t>
-            </w:r>
-          </w:p>
-        </w:tc>
-        <w:tc>
-          <w:tcPr>
-            <w:tcW w:type="dxa" w:w="1368"/>
-          </w:tcPr>
-          <w:p>
-            <w:pPr>
-              <w:spacing w:after="20" w:before="20"/>
-            </w:pPr>
-            <w:r>
-              <w:rPr>
-                <w:sz w:val="17"/>
-              </w:rPr>
-              <w:t>SNN</w:t>
-            </w:r>
-          </w:p>
-        </w:tc>
-        <w:tc>
-          <w:tcPr>
-            <w:tcW w:type="dxa" w:w="893"/>
-          </w:tcPr>
-          <w:p>
-            <w:pPr>
-              <w:spacing w:after="20" w:before="20"/>
-            </w:pPr>
-            <w:r>
-              <w:rPr>
-                <w:sz w:val="17"/>
-              </w:rPr>
-              <w:t>24.4M</w:t>
-            </w:r>
-          </w:p>
-        </w:tc>
-        <w:tc>
-          <w:tcPr>
-            <w:tcW w:type="dxa" w:w="1037"/>
-          </w:tcPr>
-          <w:p>
-            <w:pPr>
-              <w:spacing w:after="20" w:before="20"/>
-            </w:pPr>
-            <w:r>
-              <w:rPr>
-                <w:sz w:val="17"/>
-              </w:rPr>
-              <w:t>440.4</w:t>
-            </w:r>
-          </w:p>
-        </w:tc>
-        <w:tc>
-          <w:tcPr>
-            <w:tcW w:type="dxa" w:w="1325"/>
-          </w:tcPr>
-          <w:p>
-            <w:pPr>
-              <w:spacing w:after="20" w:before="20"/>
-            </w:pPr>
-            <w:r>
-              <w:rPr>
-                <w:sz w:val="17"/>
-              </w:rPr>
-              <w:t>0.290±0.062</w:t>
-            </w:r>
-          </w:p>
-        </w:tc>
-        <w:tc>
-          <w:tcPr>
-            <w:tcW w:type="dxa" w:w="893"/>
-          </w:tcPr>
-          <w:p>
-            <w:pPr>
-              <w:spacing w:after="20" w:before="20"/>
-            </w:pPr>
-            <w:r>
-              <w:rPr>
-                <w:sz w:val="17"/>
-              </w:rPr>
-              <w:t>0.196</w:t>
-            </w:r>
-          </w:p>
-        </w:tc>
-        <w:tc>
-          <w:tcPr>
-            <w:tcW w:type="dxa" w:w="792"/>
-          </w:tcPr>
-          <w:p>
-            <w:pPr>
-              <w:spacing w:after="20" w:before="20"/>
-            </w:pPr>
-            <w:r>
-              <w:rPr>
-                <w:sz w:val="17"/>
-              </w:rPr>
-              <w:t>10.6</w:t>
-            </w:r>
-          </w:p>
-        </w:tc>
-        <w:tc>
-          <w:tcPr>
-            <w:tcW w:type="dxa" w:w="792"/>
-          </w:tcPr>
-          <w:p>
-            <w:pPr>
-              <w:spacing w:after="20" w:before="20"/>
-            </w:pPr>
-            <w:r>
-              <w:rPr>
-                <w:sz w:val="17"/>
-              </w:rPr>
-              <w:t>C</w:t>
-            </w:r>
-          </w:p>
-        </w:tc>
-      </w:tr>
-      <w:tr>
-        <w:tc>
-          <w:tcPr>
-            <w:tcW w:type="dxa" w:w="2232"/>
-          </w:tcPr>
-          <w:p>
-            <w:pPr>
-              <w:spacing w:after="20" w:before="20"/>
-            </w:pPr>
-            <w:r>
-              <w:rPr>
-                <w:sz w:val="17"/>
-              </w:rPr>
-              <w:t>DeepLabV3</w:t>
-            </w:r>
-          </w:p>
-        </w:tc>
-        <w:tc>
-          <w:tcPr>
-            <w:tcW w:type="dxa" w:w="1368"/>
-          </w:tcPr>
-          <w:p>
-            <w:pPr>
-              <w:spacing w:after="20" w:before="20"/>
-            </w:pPr>
-            <w:r>
-              <w:rPr>
-                <w:sz w:val="17"/>
-              </w:rPr>
-              <w:t>CNN</w:t>
-            </w:r>
-          </w:p>
-        </w:tc>
-        <w:tc>
-          <w:tcPr>
-            <w:tcW w:type="dxa" w:w="893"/>
-          </w:tcPr>
-          <w:p>
-            <w:pPr>
-              <w:spacing w:after="20" w:before="20"/>
-            </w:pPr>
-            <w:r>
-              <w:rPr>
-                <w:sz w:val="17"/>
-              </w:rPr>
-              <w:t>26.0M</w:t>
-            </w:r>
-          </w:p>
-        </w:tc>
-        <w:tc>
-          <w:tcPr>
-            <w:tcW w:type="dxa" w:w="1037"/>
-          </w:tcPr>
-          <w:p>
-            <w:pPr>
-              <w:spacing w:after="20" w:before="20"/>
-            </w:pPr>
-            <w:r>
-              <w:rPr>
-                <w:sz w:val="17"/>
-              </w:rPr>
-              <w:t>502.3</w:t>
-            </w:r>
-          </w:p>
-        </w:tc>
-        <w:tc>
-          <w:tcPr>
-            <w:tcW w:type="dxa" w:w="1325"/>
-          </w:tcPr>
-          <w:p>
-            <w:pPr>
-              <w:spacing w:after="20" w:before="20"/>
-            </w:pPr>
-            <w:r>
-              <w:rPr>
-                <w:sz w:val="17"/>
-              </w:rPr>
-              <w:t>0.419±0.014</w:t>
-            </w:r>
-          </w:p>
-        </w:tc>
-        <w:tc>
-          <w:tcPr>
-            <w:tcW w:type="dxa" w:w="893"/>
-          </w:tcPr>
-          <w:p>
-            <w:pPr>
-              <w:spacing w:after="20" w:before="20"/>
-            </w:pPr>
-            <w:r>
-              <w:rPr>
-                <w:sz w:val="17"/>
-              </w:rPr>
-              <w:t>0.127</w:t>
-            </w:r>
-          </w:p>
-        </w:tc>
-        <w:tc>
-          <w:tcPr>
-            <w:tcW w:type="dxa" w:w="792"/>
-          </w:tcPr>
-          <w:p>
-            <w:pPr>
-              <w:spacing w:after="20" w:before="20"/>
-            </w:pPr>
-            <w:r>
-              <w:rPr>
-                <w:sz w:val="17"/>
-              </w:rPr>
-              <w:t>—</w:t>
-            </w:r>
-          </w:p>
-        </w:tc>
-        <w:tc>
-          <w:tcPr>
-            <w:tcW w:type="dxa" w:w="792"/>
-          </w:tcPr>
-          <w:p>
-            <w:pPr>
-              <w:spacing w:after="20" w:before="20"/>
-            </w:pPr>
-            <w:r>
-              <w:rPr>
-                <w:sz w:val="17"/>
-              </w:rPr>
-              <w:t>weak</w:t>
-            </w:r>
-          </w:p>
-        </w:tc>
-      </w:tr>
-    </w:tbl>
-    <w:p>
-      <w:pPr>
-        <w:spacing w:after="160"/>
-      </w:pPr>
-      <w:r>
-        <w:rPr>
-          <w:i/>
-          <w:sz w:val="18"/>
-        </w:rPr>
-        <w:t>Table 1. Selected models (full 25-config table in Appendix A). Energy per 512×512 chip. Cluster = statistical grouping by Wilcoxon signed-rank on per-chip flood-IoU: A = top ANNs; B = INT8 CNN and best SNNs (mutually indistinguishable, p &gt; 0.05); C = ANN2SNN; weak = low per-chip IoU.</w:t>
-      </w:r>
-    </w:p>
-    <w:p>
-      <w:pPr>
-        <w:spacing w:after="120"/>
-        <w:jc w:val="both"/>
-      </w:pPr>
-      <w:r>
-        <w:rPr>
-          <w:i w:val="0"/>
-        </w:rPr>
-        <w:t>On pooled IoU the accuracy leaders are pretrained ANNs (SegFormer 0.525); MobileNet-UNet INT8 reaches 0.490 at only 3.1 mJ (≈ its FP32 parent at 20× lower energy). SNN-Flood tops out at ≈0.39 pooled IoU, below the quantized CNN. Table 2 reports all 25 configurations.</w:t>
-      </w:r>
-    </w:p>
-    <w:p>
-      <w:pPr>
-        <w:spacing w:after="120"/>
-        <w:jc w:val="both"/>
-      </w:pPr>
-      <w:r>
-        <w:rPr>
-          <w:i w:val="0"/>
-        </w:rPr>
       </w:r>
     </w:p>
     <w:tbl>
@@ -5258,7 +3767,19 @@
           <w:i/>
           <w:sz w:val="18"/>
         </w:rPr>
-        <w:t>Table 2. Full benchmark — all 25 configurations (mean over seeds; n in parentheses). F1 = flood Dice; pwIoU = permanent-water IoU. Sorted by pooled flood-IoU.</w:t>
+        <w:t>Table 1. Full benchmark — all 25 configurations (mean over seeds; n in parentheses). F1 = flood Dice; pwIoU = permanent-water IoU. Sorted by pooled flood-IoU.</w:t>
+      </w:r>
+    </w:p>
+    <w:p>
+      <w:pPr>
+        <w:spacing w:after="120"/>
+        <w:jc w:val="both"/>
+      </w:pPr>
+      <w:r>
+        <w:rPr>
+          <w:i w:val="0"/>
+        </w:rPr>
+        <w:t>On pooled IoU the accuracy leaders are pretrained ANNs (SegFormer 0.525); MobileNet-UNet INT8 reaches 0.490 at only 3.1 mJ (≈ its FP32 parent at 20× lower energy). SNN-Flood tops out at ≈0.39 pooled IoU, below the quantized CNN. The statistical grouping (Cluster A/B/C) is analysed in §5.2: the INT8 CNN and the best SNNs form one indistinguishable cluster on per-chip flood-IoU.</w:t>
       </w:r>
     </w:p>
     <w:p>

</xml_diff>

<commit_message>
Thêm tác giả 2: Hoang Dinh (Huong Bui giữ vai advisor)
</commit_message>
<xml_diff>
--- a/paper/SNN-Flood-Paper.docx
+++ b/paper/SNN-Flood-Paper.docx
@@ -22,7 +22,7 @@
         <w:rPr>
           <w:sz w:val="24"/>
         </w:rPr>
-        <w:t>Tran Nhat Phi¹, Huong Bui² (advisor)</w:t>
+        <w:t>Tran Nhat Phi¹, Hoang Dinh², Huong Bui³ (advisor)</w:t>
       </w:r>
     </w:p>
     <w:p>
@@ -34,7 +34,7 @@
           <w:i/>
           <w:sz w:val="20"/>
         </w:rPr>
-        <w:t>¹ ² [Affiliation / University] — {emails}   [TODO điền cơ quan, email]</w:t>
+        <w:t>¹ ² ³ [Affiliation / University] — {emails}   [TODO điền cơ quan, email]</w:t>
       </w:r>
     </w:p>
     <w:p>

</xml_diff>

<commit_message>
Tác giả: Phi Tran(1), Huong Bui(2), Hoang Dinh(2)
</commit_message>
<xml_diff>
--- a/paper/SNN-Flood-Paper.docx
+++ b/paper/SNN-Flood-Paper.docx
@@ -22,7 +22,7 @@
         <w:rPr>
           <w:sz w:val="24"/>
         </w:rPr>
-        <w:t>Tran Nhat Phi¹, Hoang Dinh², Huong Bui³ (advisor)</w:t>
+        <w:t>Phi Tran¹, Huong Bui², Hoang Dinh²</w:t>
       </w:r>
     </w:p>
     <w:p>
@@ -34,7 +34,7 @@
           <w:i/>
           <w:sz w:val="20"/>
         </w:rPr>
-        <w:t>¹ ² ³ [Affiliation / University] — {emails}   [TODO điền cơ quan, email]</w:t>
+        <w:t>¹ [Affiliation 1] — [email]    ² [Affiliation 2] — [emails]    [TODO điền cơ quan + email]</w:t>
       </w:r>
     </w:p>
     <w:p>

</xml_diff>

<commit_message>
Thêm §5.6 Qualitative + Figure 5 (so sánh SegFormer/MobileNet/SNN-T2) vào paper; make_qualitative.py
</commit_message>
<xml_diff>
--- a/paper/SNN-Flood-Paper.docx
+++ b/paper/SNN-Flood-Paper.docx
@@ -4112,6 +4112,82 @@
     </w:p>
     <w:p>
       <w:pPr>
+        <w:spacing w:before="120" w:after="80"/>
+      </w:pPr>
+      <w:r>
+        <w:rPr>
+          <w:b/>
+          <w:sz w:val="22"/>
+        </w:rPr>
+        <w:t>5.6 Qualitative results</w:t>
+      </w:r>
+    </w:p>
+    <w:p>
+      <w:pPr>
+        <w:spacing w:after="120"/>
+        <w:jc w:val="both"/>
+      </w:pPr>
+      <w:r>
+        <w:rPr>
+          <w:i w:val="0"/>
+        </w:rPr>
+        <w:t>Figure 5 compares predictions on four permanent-water-rich chips. SegFormer and MobileNet delineate the permanent-water channels (blue) cleanly, whereas SNN-T2 produces salt-and-pepper predictions and largely merges water into the flood class — consistent with its low permanent-water IoU (Table 1). All models still struggle on the hardest scenes (e.g., Bolivia).</w:t>
+      </w:r>
+    </w:p>
+    <w:p>
+      <w:pPr>
+        <w:jc w:val="center"/>
+      </w:pPr>
+      <w:r>
+        <w:drawing>
+          <wp:inline xmlns:a="http://schemas.openxmlformats.org/drawingml/2006/main" xmlns:pic="http://schemas.openxmlformats.org/drawingml/2006/picture">
+            <wp:extent cx="5669280" cy="4913376"/>
+            <wp:docPr id="5" name="Picture 5"/>
+            <wp:cNvGraphicFramePr>
+              <a:graphicFrameLocks noChangeAspect="1"/>
+            </wp:cNvGraphicFramePr>
+            <a:graphic>
+              <a:graphicData uri="http://schemas.openxmlformats.org/drawingml/2006/picture">
+                <pic:pic>
+                  <pic:nvPicPr>
+                    <pic:cNvPr id="0" name="qual_comparison.png"/>
+                    <pic:cNvPicPr/>
+                  </pic:nvPicPr>
+                  <pic:blipFill>
+                    <a:blip r:embed="rId13"/>
+                    <a:stretch>
+                      <a:fillRect/>
+                    </a:stretch>
+                  </pic:blipFill>
+                  <pic:spPr>
+                    <a:xfrm>
+                      <a:off x="0" y="0"/>
+                      <a:ext cx="5669280" cy="4913376"/>
+                    </a:xfrm>
+                    <a:prstGeom prst="rect"/>
+                  </pic:spPr>
+                </pic:pic>
+              </a:graphicData>
+            </a:graphic>
+          </wp:inline>
+        </w:drawing>
+      </w:r>
+    </w:p>
+    <w:p>
+      <w:pPr>
+        <w:spacing w:after="200"/>
+        <w:jc w:val="center"/>
+      </w:pPr>
+      <w:r>
+        <w:rPr>
+          <w:i/>
+          <w:sz w:val="18"/>
+        </w:rPr>
+        <w:t>Figure 5. Qualitative comparison on test chips (columns: SAR VV | Ground truth | SegFormer | MobileNet | SNN-T2). MobileNet-INT8 is visually identical to MobileNet FP32 (−0.008 IoU).</w:t>
+      </w:r>
+    </w:p>
+    <w:p>
+      <w:pPr>
         <w:spacing w:before="200" w:after="80"/>
       </w:pPr>
       <w:r>

</xml_diff>

<commit_message>
Split 60/20/20 (271/87/87) theo thầy: chia lại splits + cập nhật docs; giữ v1 70/20/10 (archive results/figures + tag paper-v1); banner số liệu chờ retrain
</commit_message>
<xml_diff>
--- a/paper/SNN-Flood-Paper.docx
+++ b/paper/SNN-Flood-Paper.docx
@@ -35,6 +35,16 @@
           <w:sz w:val="20"/>
         </w:rPr>
         <w:t>¹ [Affiliation 1] — [email]    ² [Affiliation 2] — [emails]    [TODO điền cơ quan + email]</w:t>
+      </w:r>
+    </w:p>
+    <w:p>
+      <w:r>
+        <w:rPr>
+          <w:i/>
+          <w:color w:val="B00000"/>
+          <w:sz w:val="18"/>
+        </w:rPr>
+        <w:t>⚠️ DRAFT NOTE: numbers below are v1 (70/20/10 split). The split is now 60/20/20 (agreed 09/07); models are being retrained and Table 1 / figures will be refreshed from the new run. Remove this note after updating.</w:t>
       </w:r>
     </w:p>
     <w:p>
@@ -301,7 +311,7 @@
         <w:rPr>
           <w:i w:val="0"/>
         </w:rPr>
-        <w:t>4.2 Preprocessing &amp; splits. dB clipped to [−50,0], normalized to [0,1]; NaN → ignore-index. Region-stratified split 70/20/10 → 312/88/45 chips (agreed protocol), fixed seed.</w:t>
+        <w:t>4.2 Preprocessing &amp; splits. dB clipped to [−50,0], normalized to [0,1]; NaN → ignore-index. One NaN-only chip is dropped (445 valid). Region-stratified split 60/20/20 → 271/87/87 chips (agreed protocol; larger test set than the earlier 70/20/10 for more reliable evaluation), with spatially-overlapping chips kept in the same split to avoid leakage, fixed seed 42.</w:t>
       </w:r>
     </w:p>
     <w:p>
@@ -4340,7 +4350,7 @@
         <w:rPr>
           <w:i/>
         </w:rPr>
-        <w:t>Code, configs, region-stratified splits and fixed seeds are released at [GitHub repo link]. Results correspond to git tag paper-v1. Hardware: 1× NVIDIA H100 (training); energy is estimated analytically at 45 nm (not measured on-chip). Seeds: {0,1,2} (T=6 also {3,4}). [TODO: điền git SHA + repo URL].</w:t>
+        <w:t>Code, configs, region-stratified splits and fixed seeds are released at [GitHub repo link]. We keep all experiment versions: v1 = 70/20/10 split (git tag paper-v1, archived in paper/results_v1_70-20-10/); v2 = 60/20/20 split (current). Hardware: 1× NVIDIA H100 (training); energy is estimated analytically at 45 nm (not measured on-chip). Seeds: {0,1,2} (T=6 also {3,4}). [TODO: điền git SHA + repo URL].</w:t>
       </w:r>
     </w:p>
     <w:sectPr>

</xml_diff>

<commit_message>
Cập nhật paper sang v2 (60/20/20): Table 1 + tất cả prose (INT8 0.464@3.1mJ; INT8 hơn SNN per-chip p=0.043 d=0.24; T flat; LR không giúp SNN) + figures v2; gỡ banner; make_figures tự sync results
</commit_message>
<xml_diff>
--- a/paper/SNN-Flood-Paper.docx
+++ b/paper/SNN-Flood-Paper.docx
@@ -38,16 +38,6 @@
       </w:r>
     </w:p>
     <w:p>
-      <w:r>
-        <w:rPr>
-          <w:i/>
-          <w:color w:val="B00000"/>
-          <w:sz w:val="18"/>
-        </w:rPr>
-        <w:t>⚠️ DRAFT NOTE: numbers below are v1 (70/20/10 split). The split is now 60/20/20 (agreed 09/07); models are being retrained and Table 1 / figures will be refreshed from the new run. Remove this note after updating.</w:t>
-      </w:r>
-    </w:p>
-    <w:p>
       <w:pPr>
         <w:spacing w:before="200" w:after="80"/>
       </w:pPr>
@@ -68,7 +58,7 @@
         <w:rPr>
           <w:i w:val="0"/>
         </w:rPr>
-        <w:t>Rapid flood-extent mapping from Sentinel-1 SAR is critical for disaster response, and on-board or edge deployment demands energy-efficient models. Spiking Neural Networks (SNNs) promise low-energy inference through sparse, event-driven computation, yet they have never been benchmarked for flood segmentation on SAR. We present the first systematic energy–accuracy benchmark of direct-trained SNNs against strong ANN baselines — CNNs, a Transformer, an ANN-to-SNN conversion, and an INT8-quantized CNN — for 3-class flood-on-land segmentation (background / permanent water / flood) on Sen1Floods11, where permanent water is separated from flood using the JRC Global Surface Water layer. Across 20+ configurations trained with multiple seeds, we find that (i) with pooled flood-IoU an INT8 MobileNet-UNet dominates the accuracy–energy Pareto front (0.490 IoU at 3.1 mJ), while (ii) with a per-chip paired metric the best direct-trained SNN is statistically indistinguishable from the INT8 CNN (Wilcoxon, p = 0.40; Cohen's d = 0.09) — the conclusion about SNN competitiveness is metric-dependent. We verify 13.6–23.8% spike sparsity supporting the energy estimate, show ANN-to-SNN conversion fails even at T = 128, analyse per-region geographic sensitivity, and give practical guidance for choosing SNN vs. quantized CNN.</w:t>
+        <w:t>Rapid flood-extent mapping from Sentinel-1 SAR is critical for disaster response, and on-board or edge deployment demands energy-efficient models. Spiking Neural Networks (SNNs) promise low-energy inference through sparse, event-driven computation, yet they have never been benchmarked for flood segmentation on SAR. We present the first systematic energy–accuracy benchmark of direct-trained SNNs against strong ANN baselines — CNNs, a Transformer, an ANN-to-SNN conversion, and an INT8-quantized CNN — for 3-class flood-on-land segmentation (background / permanent water / flood) on Sen1Floods11, where permanent water is separated from flood using the JRC Global Surface Water layer. Across 20+ configurations trained with multiple seeds, we find that an INT8 MobileNet-UNet dominates the accuracy–energy Pareto front (0.464 IoU at 3.1 mJ, versus its FP32 parent's 0.465 at 62.7 mJ) and significantly outperforms the best direct-trained SNN on both pooled IoU (≈0.47 vs ≈0.35) and a per-chip paired metric, though the per-chip gap is small (Wilcoxon p = 0.04, Cohen's d = 0.24). We verify 13–27% spike sparsity supporting the energy estimate, show ANN-to-SNN conversion fails even at T = 128, analyse per-region geographic sensitivity, and give practical guidance for choosing SNN vs. quantized CNN.</w:t>
       </w:r>
     </w:p>
     <w:p>
@@ -143,7 +133,7 @@
         <w:pStyle w:val="ListNumber"/>
       </w:pPr>
       <w:r>
-        <w:t>Rigorous statistical comparison via Wilcoxon signed-rank on paired per-chip flood-IoU: a direct-trained SNN is statistically indistinguishable from an INT8 MobileNet-UNet (p &gt; 0.05), whereas pooled IoU lets the quantized CNN dominate — metric choice determines the conclusion.</w:t>
+        <w:t>Rigorous statistical comparison via Wilcoxon signed-rank on paired per-chip flood-IoU with bootstrap CIs and effect sizes: the INT8 CNN significantly outperforms the best SNN on both pooled and per-chip IoU, but the per-chip gap is small (Cohen's d ≈ 0.24) — quantifying exactly how far SNNs trail on this task.</w:t>
       </w:r>
     </w:p>
     <w:p>
@@ -151,7 +141,7 @@
         <w:pStyle w:val="ListNumber"/>
       </w:pPr>
       <w:r>
-        <w:t>Verified energy claim: measured spike sparsity 13.6–23.8% confirms the SynOps estimate; and ANN-to-SNN conversion fails to converge even at T = 128, so direct training is essential.</w:t>
+        <w:t>Verified energy claim: measured spike sparsity 13–27% confirms the SynOps estimate; and ANN-to-SNN conversion fails to converge even at T = 128, so direct training is essential.</w:t>
       </w:r>
     </w:p>
     <w:p>
@@ -530,6 +520,136 @@
               <w:rPr>
                 <w:sz w:val="16"/>
               </w:rPr>
+              <w:t>unetpp</w:t>
+            </w:r>
+          </w:p>
+        </w:tc>
+        <w:tc>
+          <w:tcPr>
+            <w:tcW w:type="dxa" w:w="2088"/>
+          </w:tcPr>
+          <w:p>
+            <w:pPr>
+              <w:spacing w:after="20" w:before="20"/>
+            </w:pPr>
+            <w:r>
+              <w:rPr>
+                <w:sz w:val="16"/>
+              </w:rPr>
+              <w:t>0.489±0.024 (n3)</w:t>
+            </w:r>
+          </w:p>
+        </w:tc>
+        <w:tc>
+          <w:tcPr>
+            <w:tcW w:type="dxa" w:w="864"/>
+          </w:tcPr>
+          <w:p>
+            <w:pPr>
+              <w:spacing w:after="20" w:before="20"/>
+            </w:pPr>
+            <w:r>
+              <w:rPr>
+                <w:sz w:val="16"/>
+              </w:rPr>
+              <w:t>0.318</w:t>
+            </w:r>
+          </w:p>
+        </w:tc>
+        <w:tc>
+          <w:tcPr>
+            <w:tcW w:type="dxa" w:w="720"/>
+          </w:tcPr>
+          <w:p>
+            <w:pPr>
+              <w:spacing w:after="20" w:before="20"/>
+            </w:pPr>
+            <w:r>
+              <w:rPr>
+                <w:sz w:val="16"/>
+              </w:rPr>
+              <w:t>0.656</w:t>
+            </w:r>
+          </w:p>
+        </w:tc>
+        <w:tc>
+          <w:tcPr>
+            <w:tcW w:type="dxa" w:w="792"/>
+          </w:tcPr>
+          <w:p>
+            <w:pPr>
+              <w:spacing w:after="20" w:before="20"/>
+            </w:pPr>
+            <w:r>
+              <w:rPr>
+                <w:sz w:val="16"/>
+              </w:rPr>
+              <w:t>0.768</w:t>
+            </w:r>
+          </w:p>
+        </w:tc>
+        <w:tc>
+          <w:tcPr>
+            <w:tcW w:type="dxa" w:w="864"/>
+          </w:tcPr>
+          <w:p>
+            <w:pPr>
+              <w:spacing w:after="20" w:before="20"/>
+            </w:pPr>
+            <w:r>
+              <w:rPr>
+                <w:sz w:val="16"/>
+              </w:rPr>
+              <w:t>26.08</w:t>
+            </w:r>
+          </w:p>
+        </w:tc>
+        <w:tc>
+          <w:tcPr>
+            <w:tcW w:type="dxa" w:w="1037"/>
+          </w:tcPr>
+          <w:p>
+            <w:pPr>
+              <w:spacing w:after="20" w:before="20"/>
+            </w:pPr>
+            <w:r>
+              <w:rPr>
+                <w:sz w:val="16"/>
+              </w:rPr>
+              <w:t>339.1</w:t>
+            </w:r>
+          </w:p>
+        </w:tc>
+        <w:tc>
+          <w:tcPr>
+            <w:tcW w:type="dxa" w:w="763"/>
+          </w:tcPr>
+          <w:p>
+            <w:pPr>
+              <w:spacing w:after="20" w:before="20"/>
+            </w:pPr>
+            <w:r>
+              <w:rPr>
+                <w:sz w:val="16"/>
+              </w:rPr>
+              <w:t>—</w:t>
+            </w:r>
+          </w:p>
+        </w:tc>
+      </w:tr>
+      <w:tr>
+        <w:tc>
+          <w:tcPr>
+            <w:tcW w:type="dxa" w:w="2304"/>
+          </w:tcPr>
+          <w:p>
+            <w:pPr>
+              <w:spacing w:after="20" w:before="20"/>
+            </w:pPr>
+            <w:r>
+              <w:rPr>
+                <w:sz w:val="16"/>
+              </w:rPr>
               <w:t>segformer_b2</w:t>
             </w:r>
           </w:p>
@@ -546,7 +666,7 @@
               <w:rPr>
                 <w:sz w:val="16"/>
               </w:rPr>
-              <w:t>0.525±0.018 (n3)</w:t>
+              <w:t>0.488±0.013 (n3)</w:t>
             </w:r>
           </w:p>
         </w:tc>
@@ -562,7 +682,7 @@
               <w:rPr>
                 <w:sz w:val="16"/>
               </w:rPr>
-              <w:t>0.251</w:t>
+              <w:t>0.273</w:t>
             </w:r>
           </w:p>
         </w:tc>
@@ -578,7 +698,7 @@
               <w:rPr>
                 <w:sz w:val="16"/>
               </w:rPr>
-              <w:t>0.688</w:t>
+              <w:t>0.656</w:t>
             </w:r>
           </w:p>
         </w:tc>
@@ -594,7 +714,7 @@
               <w:rPr>
                 <w:sz w:val="16"/>
               </w:rPr>
-              <w:t>0.700</w:t>
+              <w:t>0.774</w:t>
             </w:r>
           </w:p>
         </w:tc>
@@ -676,7 +796,7 @@
               <w:rPr>
                 <w:sz w:val="16"/>
               </w:rPr>
-              <w:t>0.509±0.028 (n3)</w:t>
+              <w:t>0.476±0.023 (n3)</w:t>
             </w:r>
           </w:p>
         </w:tc>
@@ -692,7 +812,7 @@
               <w:rPr>
                 <w:sz w:val="16"/>
               </w:rPr>
-              <w:t>0.291</w:t>
+              <w:t>0.280</w:t>
             </w:r>
           </w:p>
         </w:tc>
@@ -708,7 +828,7 @@
               <w:rPr>
                 <w:sz w:val="16"/>
               </w:rPr>
-              <w:t>0.674</w:t>
+              <w:t>0.645</w:t>
             </w:r>
           </w:p>
         </w:tc>
@@ -724,7 +844,7 @@
               <w:rPr>
                 <w:sz w:val="16"/>
               </w:rPr>
-              <w:t>0.626</w:t>
+              <w:t>0.748</w:t>
             </w:r>
           </w:p>
         </w:tc>
@@ -790,136 +910,6 @@
               <w:rPr>
                 <w:sz w:val="16"/>
               </w:rPr>
-              <w:t>unetpp</w:t>
-            </w:r>
-          </w:p>
-        </w:tc>
-        <w:tc>
-          <w:tcPr>
-            <w:tcW w:type="dxa" w:w="2088"/>
-          </w:tcPr>
-          <w:p>
-            <w:pPr>
-              <w:spacing w:after="20" w:before="20"/>
-            </w:pPr>
-            <w:r>
-              <w:rPr>
-                <w:sz w:val="16"/>
-              </w:rPr>
-              <w:t>0.500±0.026 (n3)</w:t>
-            </w:r>
-          </w:p>
-        </w:tc>
-        <w:tc>
-          <w:tcPr>
-            <w:tcW w:type="dxa" w:w="864"/>
-          </w:tcPr>
-          <w:p>
-            <w:pPr>
-              <w:spacing w:after="20" w:before="20"/>
-            </w:pPr>
-            <w:r>
-              <w:rPr>
-                <w:sz w:val="16"/>
-              </w:rPr>
-              <w:t>0.264</w:t>
-            </w:r>
-          </w:p>
-        </w:tc>
-        <w:tc>
-          <w:tcPr>
-            <w:tcW w:type="dxa" w:w="720"/>
-          </w:tcPr>
-          <w:p>
-            <w:pPr>
-              <w:spacing w:after="20" w:before="20"/>
-            </w:pPr>
-            <w:r>
-              <w:rPr>
-                <w:sz w:val="16"/>
-              </w:rPr>
-              <w:t>0.666</w:t>
-            </w:r>
-          </w:p>
-        </w:tc>
-        <w:tc>
-          <w:tcPr>
-            <w:tcW w:type="dxa" w:w="792"/>
-          </w:tcPr>
-          <w:p>
-            <w:pPr>
-              <w:spacing w:after="20" w:before="20"/>
-            </w:pPr>
-            <w:r>
-              <w:rPr>
-                <w:sz w:val="16"/>
-              </w:rPr>
-              <w:t>0.585</w:t>
-            </w:r>
-          </w:p>
-        </w:tc>
-        <w:tc>
-          <w:tcPr>
-            <w:tcW w:type="dxa" w:w="864"/>
-          </w:tcPr>
-          <w:p>
-            <w:pPr>
-              <w:spacing w:after="20" w:before="20"/>
-            </w:pPr>
-            <w:r>
-              <w:rPr>
-                <w:sz w:val="16"/>
-              </w:rPr>
-              <w:t>26.08</w:t>
-            </w:r>
-          </w:p>
-        </w:tc>
-        <w:tc>
-          <w:tcPr>
-            <w:tcW w:type="dxa" w:w="1037"/>
-          </w:tcPr>
-          <w:p>
-            <w:pPr>
-              <w:spacing w:after="20" w:before="20"/>
-            </w:pPr>
-            <w:r>
-              <w:rPr>
-                <w:sz w:val="16"/>
-              </w:rPr>
-              <w:t>339.1</w:t>
-            </w:r>
-          </w:p>
-        </w:tc>
-        <w:tc>
-          <w:tcPr>
-            <w:tcW w:type="dxa" w:w="763"/>
-          </w:tcPr>
-          <w:p>
-            <w:pPr>
-              <w:spacing w:after="20" w:before="20"/>
-            </w:pPr>
-            <w:r>
-              <w:rPr>
-                <w:sz w:val="16"/>
-              </w:rPr>
-              <w:t>—</w:t>
-            </w:r>
-          </w:p>
-        </w:tc>
-      </w:tr>
-      <w:tr>
-        <w:tc>
-          <w:tcPr>
-            <w:tcW w:type="dxa" w:w="2304"/>
-          </w:tcPr>
-          <w:p>
-            <w:pPr>
-              <w:spacing w:after="20" w:before="20"/>
-            </w:pPr>
-            <w:r>
-              <w:rPr>
-                <w:sz w:val="16"/>
-              </w:rPr>
               <w:t>mobilenet_unet_lr2e4</w:t>
             </w:r>
           </w:p>
@@ -936,7 +926,7 @@
               <w:rPr>
                 <w:sz w:val="16"/>
               </w:rPr>
-              <w:t>0.498±0.007 (n3)</w:t>
+              <w:t>0.465±0.009 (n3)</w:t>
             </w:r>
           </w:p>
         </w:tc>
@@ -952,7 +942,7 @@
               <w:rPr>
                 <w:sz w:val="16"/>
               </w:rPr>
-              <w:t>0.272</w:t>
+              <w:t>0.262</w:t>
             </w:r>
           </w:p>
         </w:tc>
@@ -968,7 +958,7 @@
               <w:rPr>
                 <w:sz w:val="16"/>
               </w:rPr>
-              <w:t>0.665</w:t>
+              <w:t>0.635</w:t>
             </w:r>
           </w:p>
         </w:tc>
@@ -984,7 +974,7 @@
               <w:rPr>
                 <w:sz w:val="16"/>
               </w:rPr>
-              <w:t>0.631</w:t>
+              <w:t>0.716</w:t>
             </w:r>
           </w:p>
         </w:tc>
@@ -1066,7 +1056,7 @@
               <w:rPr>
                 <w:sz w:val="16"/>
               </w:rPr>
-              <w:t>0.490±0.003 (n3)</w:t>
+              <w:t>0.464±0.007 (n3)</w:t>
             </w:r>
           </w:p>
         </w:tc>
@@ -1082,7 +1072,7 @@
               <w:rPr>
                 <w:sz w:val="16"/>
               </w:rPr>
-              <w:t>0.258</w:t>
+              <w:t>0.255</w:t>
             </w:r>
           </w:p>
         </w:tc>
@@ -1098,7 +1088,7 @@
               <w:rPr>
                 <w:sz w:val="16"/>
               </w:rPr>
-              <w:t>0.658</w:t>
+              <w:t>0.634</w:t>
             </w:r>
           </w:p>
         </w:tc>
@@ -1114,7 +1104,7 @@
               <w:rPr>
                 <w:sz w:val="16"/>
               </w:rPr>
-              <w:t>0.616</w:t>
+              <w:t>0.720</w:t>
             </w:r>
           </w:p>
         </w:tc>
@@ -1180,6 +1170,136 @@
               <w:rPr>
                 <w:sz w:val="16"/>
               </w:rPr>
+              <w:t>mobilenet_unet</w:t>
+            </w:r>
+          </w:p>
+        </w:tc>
+        <w:tc>
+          <w:tcPr>
+            <w:tcW w:type="dxa" w:w="2088"/>
+          </w:tcPr>
+          <w:p>
+            <w:pPr>
+              <w:spacing w:after="20" w:before="20"/>
+            </w:pPr>
+            <w:r>
+              <w:rPr>
+                <w:sz w:val="16"/>
+              </w:rPr>
+              <w:t>0.462±0.005 (n3)</w:t>
+            </w:r>
+          </w:p>
+        </w:tc>
+        <w:tc>
+          <w:tcPr>
+            <w:tcW w:type="dxa" w:w="864"/>
+          </w:tcPr>
+          <w:p>
+            <w:pPr>
+              <w:spacing w:after="20" w:before="20"/>
+            </w:pPr>
+            <w:r>
+              <w:rPr>
+                <w:sz w:val="16"/>
+              </w:rPr>
+              <w:t>0.277</w:t>
+            </w:r>
+          </w:p>
+        </w:tc>
+        <w:tc>
+          <w:tcPr>
+            <w:tcW w:type="dxa" w:w="720"/>
+          </w:tcPr>
+          <w:p>
+            <w:pPr>
+              <w:spacing w:after="20" w:before="20"/>
+            </w:pPr>
+            <w:r>
+              <w:rPr>
+                <w:sz w:val="16"/>
+              </w:rPr>
+              <w:t>0.632</w:t>
+            </w:r>
+          </w:p>
+        </w:tc>
+        <w:tc>
+          <w:tcPr>
+            <w:tcW w:type="dxa" w:w="792"/>
+          </w:tcPr>
+          <w:p>
+            <w:pPr>
+              <w:spacing w:after="20" w:before="20"/>
+            </w:pPr>
+            <w:r>
+              <w:rPr>
+                <w:sz w:val="16"/>
+              </w:rPr>
+              <w:t>0.751</w:t>
+            </w:r>
+          </w:p>
+        </w:tc>
+        <w:tc>
+          <w:tcPr>
+            <w:tcW w:type="dxa" w:w="864"/>
+          </w:tcPr>
+          <w:p>
+            <w:pPr>
+              <w:spacing w:after="20" w:before="20"/>
+            </w:pPr>
+            <w:r>
+              <w:rPr>
+                <w:sz w:val="16"/>
+              </w:rPr>
+              <w:t>6.63</w:t>
+            </w:r>
+          </w:p>
+        </w:tc>
+        <w:tc>
+          <w:tcPr>
+            <w:tcW w:type="dxa" w:w="1037"/>
+          </w:tcPr>
+          <w:p>
+            <w:pPr>
+              <w:spacing w:after="20" w:before="20"/>
+            </w:pPr>
+            <w:r>
+              <w:rPr>
+                <w:sz w:val="16"/>
+              </w:rPr>
+              <w:t>62.7</w:t>
+            </w:r>
+          </w:p>
+        </w:tc>
+        <w:tc>
+          <w:tcPr>
+            <w:tcW w:type="dxa" w:w="763"/>
+          </w:tcPr>
+          <w:p>
+            <w:pPr>
+              <w:spacing w:after="20" w:before="20"/>
+            </w:pPr>
+            <w:r>
+              <w:rPr>
+                <w:sz w:val="16"/>
+              </w:rPr>
+              <w:t>—</w:t>
+            </w:r>
+          </w:p>
+        </w:tc>
+      </w:tr>
+      <w:tr>
+        <w:tc>
+          <w:tcPr>
+            <w:tcW w:type="dxa" w:w="2304"/>
+          </w:tcPr>
+          <w:p>
+            <w:pPr>
+              <w:spacing w:after="20" w:before="20"/>
+            </w:pPr>
+            <w:r>
+              <w:rPr>
+                <w:sz w:val="16"/>
+              </w:rPr>
               <w:t>mobilenet_unet_lr5e5</w:t>
             </w:r>
           </w:p>
@@ -1196,7 +1316,7 @@
               <w:rPr>
                 <w:sz w:val="16"/>
               </w:rPr>
-              <w:t>0.490±0.002 (n3)</w:t>
+              <w:t>0.450±0.015 (n3)</w:t>
             </w:r>
           </w:p>
         </w:tc>
@@ -1212,7 +1332,7 @@
               <w:rPr>
                 <w:sz w:val="16"/>
               </w:rPr>
-              <w:t>0.262</w:t>
+              <w:t>0.275</w:t>
             </w:r>
           </w:p>
         </w:tc>
@@ -1228,7 +1348,7 @@
               <w:rPr>
                 <w:sz w:val="16"/>
               </w:rPr>
-              <w:t>0.658</w:t>
+              <w:t>0.620</w:t>
             </w:r>
           </w:p>
         </w:tc>
@@ -1244,7 +1364,7 @@
               <w:rPr>
                 <w:sz w:val="16"/>
               </w:rPr>
-              <w:t>0.656</w:t>
+              <w:t>0.733</w:t>
             </w:r>
           </w:p>
         </w:tc>
@@ -1326,7 +1446,7 @@
               <w:rPr>
                 <w:sz w:val="16"/>
               </w:rPr>
-              <w:t>0.482±0.019 (n3)</w:t>
+              <w:t>0.444±0.011 (n3)</w:t>
             </w:r>
           </w:p>
         </w:tc>
@@ -1342,7 +1462,7 @@
               <w:rPr>
                 <w:sz w:val="16"/>
               </w:rPr>
-              <w:t>0.306</w:t>
+              <w:t>0.307</w:t>
             </w:r>
           </w:p>
         </w:tc>
@@ -1358,7 +1478,7 @@
               <w:rPr>
                 <w:sz w:val="16"/>
               </w:rPr>
-              <w:t>0.650</w:t>
+              <w:t>0.615</w:t>
             </w:r>
           </w:p>
         </w:tc>
@@ -1374,7 +1494,7 @@
               <w:rPr>
                 <w:sz w:val="16"/>
               </w:rPr>
-              <w:t>0.632</w:t>
+              <w:t>0.570</w:t>
             </w:r>
           </w:p>
         </w:tc>
@@ -1440,136 +1560,6 @@
               <w:rPr>
                 <w:sz w:val="16"/>
               </w:rPr>
-              <w:t>mobilenet_unet</w:t>
-            </w:r>
-          </w:p>
-        </w:tc>
-        <w:tc>
-          <w:tcPr>
-            <w:tcW w:type="dxa" w:w="2088"/>
-          </w:tcPr>
-          <w:p>
-            <w:pPr>
-              <w:spacing w:after="20" w:before="20"/>
-            </w:pPr>
-            <w:r>
-              <w:rPr>
-                <w:sz w:val="16"/>
-              </w:rPr>
-              <w:t>0.480±0.017 (n3)</w:t>
-            </w:r>
-          </w:p>
-        </w:tc>
-        <w:tc>
-          <w:tcPr>
-            <w:tcW w:type="dxa" w:w="864"/>
-          </w:tcPr>
-          <w:p>
-            <w:pPr>
-              <w:spacing w:after="20" w:before="20"/>
-            </w:pPr>
-            <w:r>
-              <w:rPr>
-                <w:sz w:val="16"/>
-              </w:rPr>
-              <w:t>0.250</w:t>
-            </w:r>
-          </w:p>
-        </w:tc>
-        <w:tc>
-          <w:tcPr>
-            <w:tcW w:type="dxa" w:w="720"/>
-          </w:tcPr>
-          <w:p>
-            <w:pPr>
-              <w:spacing w:after="20" w:before="20"/>
-            </w:pPr>
-            <w:r>
-              <w:rPr>
-                <w:sz w:val="16"/>
-              </w:rPr>
-              <w:t>0.649</w:t>
-            </w:r>
-          </w:p>
-        </w:tc>
-        <w:tc>
-          <w:tcPr>
-            <w:tcW w:type="dxa" w:w="792"/>
-          </w:tcPr>
-          <w:p>
-            <w:pPr>
-              <w:spacing w:after="20" w:before="20"/>
-            </w:pPr>
-            <w:r>
-              <w:rPr>
-                <w:sz w:val="16"/>
-              </w:rPr>
-              <w:t>0.634</w:t>
-            </w:r>
-          </w:p>
-        </w:tc>
-        <w:tc>
-          <w:tcPr>
-            <w:tcW w:type="dxa" w:w="864"/>
-          </w:tcPr>
-          <w:p>
-            <w:pPr>
-              <w:spacing w:after="20" w:before="20"/>
-            </w:pPr>
-            <w:r>
-              <w:rPr>
-                <w:sz w:val="16"/>
-              </w:rPr>
-              <w:t>6.63</w:t>
-            </w:r>
-          </w:p>
-        </w:tc>
-        <w:tc>
-          <w:tcPr>
-            <w:tcW w:type="dxa" w:w="1037"/>
-          </w:tcPr>
-          <w:p>
-            <w:pPr>
-              <w:spacing w:after="20" w:before="20"/>
-            </w:pPr>
-            <w:r>
-              <w:rPr>
-                <w:sz w:val="16"/>
-              </w:rPr>
-              <w:t>62.7</w:t>
-            </w:r>
-          </w:p>
-        </w:tc>
-        <w:tc>
-          <w:tcPr>
-            <w:tcW w:type="dxa" w:w="763"/>
-          </w:tcPr>
-          <w:p>
-            <w:pPr>
-              <w:spacing w:after="20" w:before="20"/>
-            </w:pPr>
-            <w:r>
-              <w:rPr>
-                <w:sz w:val="16"/>
-              </w:rPr>
-              <w:t>—</w:t>
-            </w:r>
-          </w:p>
-        </w:tc>
-      </w:tr>
-      <w:tr>
-        <w:tc>
-          <w:tcPr>
-            <w:tcW w:type="dxa" w:w="2304"/>
-          </w:tcPr>
-          <w:p>
-            <w:pPr>
-              <w:spacing w:after="20" w:before="20"/>
-            </w:pPr>
-            <w:r>
-              <w:rPr>
-                <w:sz w:val="16"/>
-              </w:rPr>
               <w:t>deeplabv3</w:t>
             </w:r>
           </w:p>
@@ -1586,7 +1576,7 @@
               <w:rPr>
                 <w:sz w:val="16"/>
               </w:rPr>
-              <w:t>0.419±0.014 (n3)</w:t>
+              <w:t>0.388±0.011 (n3)</w:t>
             </w:r>
           </w:p>
         </w:tc>
@@ -1602,7 +1592,7 @@
               <w:rPr>
                 <w:sz w:val="16"/>
               </w:rPr>
-              <w:t>0.127</w:t>
+              <w:t>0.163</w:t>
             </w:r>
           </w:p>
         </w:tc>
@@ -1618,7 +1608,7 @@
               <w:rPr>
                 <w:sz w:val="16"/>
               </w:rPr>
-              <w:t>0.590</w:t>
+              <w:t>0.558</w:t>
             </w:r>
           </w:p>
         </w:tc>
@@ -1634,7 +1624,7 @@
               <w:rPr>
                 <w:sz w:val="16"/>
               </w:rPr>
-              <w:t>0.496</w:t>
+              <w:t>0.611</w:t>
             </w:r>
           </w:p>
         </w:tc>
@@ -1700,7 +1690,7 @@
               <w:rPr>
                 <w:sz w:val="16"/>
               </w:rPr>
-              <w:t>spiking_unet_T2</w:t>
+              <w:t>spiking_unet_T10</w:t>
             </w:r>
           </w:p>
         </w:tc>
@@ -1716,7 +1706,7 @@
               <w:rPr>
                 <w:sz w:val="16"/>
               </w:rPr>
-              <w:t>0.391±0.045 (n3)</w:t>
+              <w:t>0.354±0.012 (n3)</w:t>
             </w:r>
           </w:p>
         </w:tc>
@@ -1732,7 +1722,7 @@
               <w:rPr>
                 <w:sz w:val="16"/>
               </w:rPr>
-              <w:t>0.240</w:t>
+              <w:t>0.278</w:t>
             </w:r>
           </w:p>
         </w:tc>
@@ -1748,7 +1738,7 @@
               <w:rPr>
                 <w:sz w:val="16"/>
               </w:rPr>
-              <w:t>0.561</w:t>
+              <w:t>0.523</w:t>
             </w:r>
           </w:p>
         </w:tc>
@@ -1764,7 +1754,7 @@
               <w:rPr>
                 <w:sz w:val="16"/>
               </w:rPr>
-              <w:t>0.508</w:t>
+              <w:t>0.173</w:t>
             </w:r>
           </w:p>
         </w:tc>
@@ -1796,7 +1786,7 @@
               <w:rPr>
                 <w:sz w:val="16"/>
               </w:rPr>
-              <w:t>31.4</w:t>
+              <w:t>188.1</w:t>
             </w:r>
           </w:p>
         </w:tc>
@@ -1812,7 +1802,7 @@
               <w:rPr>
                 <w:sz w:val="16"/>
               </w:rPr>
-              <w:t>13.6</w:t>
+              <w:t>20.2</w:t>
             </w:r>
           </w:p>
         </w:tc>
@@ -1846,7 +1836,7 @@
               <w:rPr>
                 <w:sz w:val="16"/>
               </w:rPr>
-              <w:t>0.388±0.030 (n3)</w:t>
+              <w:t>0.342±0.010 (n3)</w:t>
             </w:r>
           </w:p>
         </w:tc>
@@ -1862,7 +1852,7 @@
               <w:rPr>
                 <w:sz w:val="16"/>
               </w:rPr>
-              <w:t>0.246</w:t>
+              <w:t>0.275</w:t>
             </w:r>
           </w:p>
         </w:tc>
@@ -1878,7 +1868,7 @@
               <w:rPr>
                 <w:sz w:val="16"/>
               </w:rPr>
-              <w:t>0.558</w:t>
+              <w:t>0.509</w:t>
             </w:r>
           </w:p>
         </w:tc>
@@ -1894,7 +1884,7 @@
               <w:rPr>
                 <w:sz w:val="16"/>
               </w:rPr>
-              <w:t>0.368</w:t>
+              <w:t>0.108</w:t>
             </w:r>
           </w:p>
         </w:tc>
@@ -1926,7 +1916,7 @@
               <w:rPr>
                 <w:sz w:val="16"/>
               </w:rPr>
-              <w:t>166.8</w:t>
+              <w:t>164.6</w:t>
             </w:r>
           </w:p>
         </w:tc>
@@ -1942,7 +1932,7 @@
               <w:rPr>
                 <w:sz w:val="16"/>
               </w:rPr>
-              <w:t>23.8</w:t>
+              <w:t>24.6</w:t>
             </w:r>
           </w:p>
         </w:tc>
@@ -1960,7 +1950,7 @@
               <w:rPr>
                 <w:sz w:val="16"/>
               </w:rPr>
-              <w:t>spiking_unet_T2_lr2e4</w:t>
+              <w:t>spiking_unet_T2</w:t>
             </w:r>
           </w:p>
         </w:tc>
@@ -1976,7 +1966,7 @@
               <w:rPr>
                 <w:sz w:val="16"/>
               </w:rPr>
-              <w:t>0.370±0.034 (n3)</w:t>
+              <w:t>0.340±0.027 (n3)</w:t>
             </w:r>
           </w:p>
         </w:tc>
@@ -1992,7 +1982,7 @@
               <w:rPr>
                 <w:sz w:val="16"/>
               </w:rPr>
-              <w:t>0.245</w:t>
+              <w:t>0.243</w:t>
             </w:r>
           </w:p>
         </w:tc>
@@ -2008,7 +1998,7 @@
               <w:rPr>
                 <w:sz w:val="16"/>
               </w:rPr>
-              <w:t>0.539</w:t>
+              <w:t>0.507</w:t>
             </w:r>
           </w:p>
         </w:tc>
@@ -2024,7 +2014,7 @@
               <w:rPr>
                 <w:sz w:val="16"/>
               </w:rPr>
-              <w:t>0.315</w:t>
+              <w:t>0.150</w:t>
             </w:r>
           </w:p>
         </w:tc>
@@ -2056,7 +2046,7 @@
               <w:rPr>
                 <w:sz w:val="16"/>
               </w:rPr>
-              <w:t>26.6</w:t>
+              <w:t>33.2</w:t>
             </w:r>
           </w:p>
         </w:tc>
@@ -2072,7 +2062,137 @@
               <w:rPr>
                 <w:sz w:val="16"/>
               </w:rPr>
-              <w:t>12.7</w:t>
+              <w:t>14.9</w:t>
+            </w:r>
+          </w:p>
+        </w:tc>
+      </w:tr>
+      <w:tr>
+        <w:tc>
+          <w:tcPr>
+            <w:tcW w:type="dxa" w:w="2304"/>
+          </w:tcPr>
+          <w:p>
+            <w:pPr>
+              <w:spacing w:after="20" w:before="20"/>
+            </w:pPr>
+            <w:r>
+              <w:rPr>
+                <w:sz w:val="16"/>
+              </w:rPr>
+              <w:t>spiking_unet_T4</w:t>
+            </w:r>
+          </w:p>
+        </w:tc>
+        <w:tc>
+          <w:tcPr>
+            <w:tcW w:type="dxa" w:w="2088"/>
+          </w:tcPr>
+          <w:p>
+            <w:pPr>
+              <w:spacing w:after="20" w:before="20"/>
+            </w:pPr>
+            <w:r>
+              <w:rPr>
+                <w:sz w:val="16"/>
+              </w:rPr>
+              <w:t>0.339±0.026 (n3)</w:t>
+            </w:r>
+          </w:p>
+        </w:tc>
+        <w:tc>
+          <w:tcPr>
+            <w:tcW w:type="dxa" w:w="864"/>
+          </w:tcPr>
+          <w:p>
+            <w:pPr>
+              <w:spacing w:after="20" w:before="20"/>
+            </w:pPr>
+            <w:r>
+              <w:rPr>
+                <w:sz w:val="16"/>
+              </w:rPr>
+              <w:t>0.270</w:t>
+            </w:r>
+          </w:p>
+        </w:tc>
+        <w:tc>
+          <w:tcPr>
+            <w:tcW w:type="dxa" w:w="720"/>
+          </w:tcPr>
+          <w:p>
+            <w:pPr>
+              <w:spacing w:after="20" w:before="20"/>
+            </w:pPr>
+            <w:r>
+              <w:rPr>
+                <w:sz w:val="16"/>
+              </w:rPr>
+              <w:t>0.506</w:t>
+            </w:r>
+          </w:p>
+        </w:tc>
+        <w:tc>
+          <w:tcPr>
+            <w:tcW w:type="dxa" w:w="792"/>
+          </w:tcPr>
+          <w:p>
+            <w:pPr>
+              <w:spacing w:after="20" w:before="20"/>
+            </w:pPr>
+            <w:r>
+              <w:rPr>
+                <w:sz w:val="16"/>
+              </w:rPr>
+              <w:t>0.277</w:t>
+            </w:r>
+          </w:p>
+        </w:tc>
+        <w:tc>
+          <w:tcPr>
+            <w:tcW w:type="dxa" w:w="864"/>
+          </w:tcPr>
+          <w:p>
+            <w:pPr>
+              <w:spacing w:after="20" w:before="20"/>
+            </w:pPr>
+            <w:r>
+              <w:rPr>
+                <w:sz w:val="16"/>
+              </w:rPr>
+              <w:t>7.76</w:t>
+            </w:r>
+          </w:p>
+        </w:tc>
+        <w:tc>
+          <w:tcPr>
+            <w:tcW w:type="dxa" w:w="1037"/>
+          </w:tcPr>
+          <w:p>
+            <w:pPr>
+              <w:spacing w:after="20" w:before="20"/>
+            </w:pPr>
+            <w:r>
+              <w:rPr>
+                <w:sz w:val="16"/>
+              </w:rPr>
+              <w:t>66.0</w:t>
+            </w:r>
+          </w:p>
+        </w:tc>
+        <w:tc>
+          <w:tcPr>
+            <w:tcW w:type="dxa" w:w="763"/>
+          </w:tcPr>
+          <w:p>
+            <w:pPr>
+              <w:spacing w:after="20" w:before="20"/>
+            </w:pPr>
+            <w:r>
+              <w:rPr>
+                <w:sz w:val="16"/>
+              </w:rPr>
+              <w:t>13.3</w:t>
             </w:r>
           </w:p>
         </w:tc>
@@ -2106,7 +2226,7 @@
               <w:rPr>
                 <w:sz w:val="16"/>
               </w:rPr>
-              <w:t>0.365±0.022 (n3)</w:t>
+              <w:t>0.338±0.017 (n3)</w:t>
             </w:r>
           </w:p>
         </w:tc>
@@ -2122,7 +2242,7 @@
               <w:rPr>
                 <w:sz w:val="16"/>
               </w:rPr>
-              <w:t>0.251</w:t>
+              <w:t>0.269</w:t>
             </w:r>
           </w:p>
         </w:tc>
@@ -2138,7 +2258,7 @@
               <w:rPr>
                 <w:sz w:val="16"/>
               </w:rPr>
-              <w:t>0.534</w:t>
+              <w:t>0.505</w:t>
             </w:r>
           </w:p>
         </w:tc>
@@ -2154,7 +2274,7 @@
               <w:rPr>
                 <w:sz w:val="16"/>
               </w:rPr>
-              <w:t>0.533</w:t>
+              <w:t>0.242</w:t>
             </w:r>
           </w:p>
         </w:tc>
@@ -2186,7 +2306,7 @@
               <w:rPr>
                 <w:sz w:val="16"/>
               </w:rPr>
-              <w:t>115.0</w:t>
+              <w:t>113.7</w:t>
             </w:r>
           </w:p>
         </w:tc>
@@ -2236,7 +2356,7 @@
               <w:rPr>
                 <w:sz w:val="16"/>
               </w:rPr>
-              <w:t>0.361±0.019 (n3)</w:t>
+              <w:t>0.337±0.015 (n3)</w:t>
             </w:r>
           </w:p>
         </w:tc>
@@ -2252,7 +2372,7 @@
               <w:rPr>
                 <w:sz w:val="16"/>
               </w:rPr>
-              <w:t>0.261</w:t>
+              <w:t>0.253</w:t>
             </w:r>
           </w:p>
         </w:tc>
@@ -2268,7 +2388,7 @@
               <w:rPr>
                 <w:sz w:val="16"/>
               </w:rPr>
-              <w:t>0.530</w:t>
+              <w:t>0.504</w:t>
             </w:r>
           </w:p>
         </w:tc>
@@ -2284,7 +2404,7 @@
               <w:rPr>
                 <w:sz w:val="16"/>
               </w:rPr>
-              <w:t>0.495</w:t>
+              <w:t>0.242</w:t>
             </w:r>
           </w:p>
         </w:tc>
@@ -2316,7 +2436,7 @@
               <w:rPr>
                 <w:sz w:val="16"/>
               </w:rPr>
-              <w:t>79.4</w:t>
+              <w:t>85.7</w:t>
             </w:r>
           </w:p>
         </w:tc>
@@ -2332,7 +2452,7 @@
               <w:rPr>
                 <w:sz w:val="16"/>
               </w:rPr>
-              <w:t>19.3</w:t>
+              <w:t>18.4</w:t>
             </w:r>
           </w:p>
         </w:tc>
@@ -2366,7 +2486,7 @@
               <w:rPr>
                 <w:sz w:val="16"/>
               </w:rPr>
-              <w:t>0.355±0.018 (n3)</w:t>
+              <w:t>0.332±0.020 (n3)</w:t>
             </w:r>
           </w:p>
         </w:tc>
@@ -2382,7 +2502,7 @@
               <w:rPr>
                 <w:sz w:val="16"/>
               </w:rPr>
-              <w:t>0.250</w:t>
+              <w:t>0.269</w:t>
             </w:r>
           </w:p>
         </w:tc>
@@ -2398,7 +2518,7 @@
               <w:rPr>
                 <w:sz w:val="16"/>
               </w:rPr>
-              <w:t>0.524</w:t>
+              <w:t>0.498</w:t>
             </w:r>
           </w:p>
         </w:tc>
@@ -2414,7 +2534,7 @@
               <w:rPr>
                 <w:sz w:val="16"/>
               </w:rPr>
-              <w:t>0.356</w:t>
+              <w:t>0.204</w:t>
             </w:r>
           </w:p>
         </w:tc>
@@ -2446,7 +2566,7 @@
               <w:rPr>
                 <w:sz w:val="16"/>
               </w:rPr>
-              <w:t>178.7</w:t>
+              <w:t>131.3</w:t>
             </w:r>
           </w:p>
         </w:tc>
@@ -2462,7 +2582,397 @@
               <w:rPr>
                 <w:sz w:val="16"/>
               </w:rPr>
-              <w:t>26.8</w:t>
+              <w:t>22.1</w:t>
+            </w:r>
+          </w:p>
+        </w:tc>
+      </w:tr>
+      <w:tr>
+        <w:tc>
+          <w:tcPr>
+            <w:tcW w:type="dxa" w:w="2304"/>
+          </w:tcPr>
+          <w:p>
+            <w:pPr>
+              <w:spacing w:after="20" w:before="20"/>
+            </w:pPr>
+            <w:r>
+              <w:rPr>
+                <w:sz w:val="16"/>
+              </w:rPr>
+              <w:t>spiking_unet_T3</w:t>
+            </w:r>
+          </w:p>
+        </w:tc>
+        <w:tc>
+          <w:tcPr>
+            <w:tcW w:type="dxa" w:w="2088"/>
+          </w:tcPr>
+          <w:p>
+            <w:pPr>
+              <w:spacing w:after="20" w:before="20"/>
+            </w:pPr>
+            <w:r>
+              <w:rPr>
+                <w:sz w:val="16"/>
+              </w:rPr>
+              <w:t>0.323±0.015 (n3)</w:t>
+            </w:r>
+          </w:p>
+        </w:tc>
+        <w:tc>
+          <w:tcPr>
+            <w:tcW w:type="dxa" w:w="864"/>
+          </w:tcPr>
+          <w:p>
+            <w:pPr>
+              <w:spacing w:after="20" w:before="20"/>
+            </w:pPr>
+            <w:r>
+              <w:rPr>
+                <w:sz w:val="16"/>
+              </w:rPr>
+              <w:t>0.248</w:t>
+            </w:r>
+          </w:p>
+        </w:tc>
+        <w:tc>
+          <w:tcPr>
+            <w:tcW w:type="dxa" w:w="720"/>
+          </w:tcPr>
+          <w:p>
+            <w:pPr>
+              <w:spacing w:after="20" w:before="20"/>
+            </w:pPr>
+            <w:r>
+              <w:rPr>
+                <w:sz w:val="16"/>
+              </w:rPr>
+              <w:t>0.488</w:t>
+            </w:r>
+          </w:p>
+        </w:tc>
+        <w:tc>
+          <w:tcPr>
+            <w:tcW w:type="dxa" w:w="792"/>
+          </w:tcPr>
+          <w:p>
+            <w:pPr>
+              <w:spacing w:after="20" w:before="20"/>
+            </w:pPr>
+            <w:r>
+              <w:rPr>
+                <w:sz w:val="16"/>
+              </w:rPr>
+              <w:t>0.281</w:t>
+            </w:r>
+          </w:p>
+        </w:tc>
+        <w:tc>
+          <w:tcPr>
+            <w:tcW w:type="dxa" w:w="864"/>
+          </w:tcPr>
+          <w:p>
+            <w:pPr>
+              <w:spacing w:after="20" w:before="20"/>
+            </w:pPr>
+            <w:r>
+              <w:rPr>
+                <w:sz w:val="16"/>
+              </w:rPr>
+              <w:t>7.76</w:t>
+            </w:r>
+          </w:p>
+        </w:tc>
+        <w:tc>
+          <w:tcPr>
+            <w:tcW w:type="dxa" w:w="1037"/>
+          </w:tcPr>
+          <w:p>
+            <w:pPr>
+              <w:spacing w:after="20" w:before="20"/>
+            </w:pPr>
+            <w:r>
+              <w:rPr>
+                <w:sz w:val="16"/>
+              </w:rPr>
+              <w:t>58.9</w:t>
+            </w:r>
+          </w:p>
+        </w:tc>
+        <w:tc>
+          <w:tcPr>
+            <w:tcW w:type="dxa" w:w="763"/>
+          </w:tcPr>
+          <w:p>
+            <w:pPr>
+              <w:spacing w:after="20" w:before="20"/>
+            </w:pPr>
+            <w:r>
+              <w:rPr>
+                <w:sz w:val="16"/>
+              </w:rPr>
+              <w:t>19.2</w:t>
+            </w:r>
+          </w:p>
+        </w:tc>
+      </w:tr>
+      <w:tr>
+        <w:tc>
+          <w:tcPr>
+            <w:tcW w:type="dxa" w:w="2304"/>
+          </w:tcPr>
+          <w:p>
+            <w:pPr>
+              <w:spacing w:after="20" w:before="20"/>
+            </w:pPr>
+            <w:r>
+              <w:rPr>
+                <w:sz w:val="16"/>
+              </w:rPr>
+              <w:t>spiking_unet_T2_lr2e4</w:t>
+            </w:r>
+          </w:p>
+        </w:tc>
+        <w:tc>
+          <w:tcPr>
+            <w:tcW w:type="dxa" w:w="2088"/>
+          </w:tcPr>
+          <w:p>
+            <w:pPr>
+              <w:spacing w:after="20" w:before="20"/>
+            </w:pPr>
+            <w:r>
+              <w:rPr>
+                <w:sz w:val="16"/>
+              </w:rPr>
+              <w:t>0.316±0.012 (n3)</w:t>
+            </w:r>
+          </w:p>
+        </w:tc>
+        <w:tc>
+          <w:tcPr>
+            <w:tcW w:type="dxa" w:w="864"/>
+          </w:tcPr>
+          <w:p>
+            <w:pPr>
+              <w:spacing w:after="20" w:before="20"/>
+            </w:pPr>
+            <w:r>
+              <w:rPr>
+                <w:sz w:val="16"/>
+              </w:rPr>
+              <w:t>0.229</w:t>
+            </w:r>
+          </w:p>
+        </w:tc>
+        <w:tc>
+          <w:tcPr>
+            <w:tcW w:type="dxa" w:w="720"/>
+          </w:tcPr>
+          <w:p>
+            <w:pPr>
+              <w:spacing w:after="20" w:before="20"/>
+            </w:pPr>
+            <w:r>
+              <w:rPr>
+                <w:sz w:val="16"/>
+              </w:rPr>
+              <w:t>0.480</w:t>
+            </w:r>
+          </w:p>
+        </w:tc>
+        <w:tc>
+          <w:tcPr>
+            <w:tcW w:type="dxa" w:w="792"/>
+          </w:tcPr>
+          <w:p>
+            <w:pPr>
+              <w:spacing w:after="20" w:before="20"/>
+            </w:pPr>
+            <w:r>
+              <w:rPr>
+                <w:sz w:val="16"/>
+              </w:rPr>
+              <w:t>0.170</w:t>
+            </w:r>
+          </w:p>
+        </w:tc>
+        <w:tc>
+          <w:tcPr>
+            <w:tcW w:type="dxa" w:w="864"/>
+          </w:tcPr>
+          <w:p>
+            <w:pPr>
+              <w:spacing w:after="20" w:before="20"/>
+            </w:pPr>
+            <w:r>
+              <w:rPr>
+                <w:sz w:val="16"/>
+              </w:rPr>
+              <w:t>7.76</w:t>
+            </w:r>
+          </w:p>
+        </w:tc>
+        <w:tc>
+          <w:tcPr>
+            <w:tcW w:type="dxa" w:w="1037"/>
+          </w:tcPr>
+          <w:p>
+            <w:pPr>
+              <w:spacing w:after="20" w:before="20"/>
+            </w:pPr>
+            <w:r>
+              <w:rPr>
+                <w:sz w:val="16"/>
+              </w:rPr>
+              <w:t>31.2</w:t>
+            </w:r>
+          </w:p>
+        </w:tc>
+        <w:tc>
+          <w:tcPr>
+            <w:tcW w:type="dxa" w:w="763"/>
+          </w:tcPr>
+          <w:p>
+            <w:pPr>
+              <w:spacing w:after="20" w:before="20"/>
+            </w:pPr>
+            <w:r>
+              <w:rPr>
+                <w:sz w:val="16"/>
+              </w:rPr>
+              <w:t>14.2</w:t>
+            </w:r>
+          </w:p>
+        </w:tc>
+      </w:tr>
+      <w:tr>
+        <w:tc>
+          <w:tcPr>
+            <w:tcW w:type="dxa" w:w="2304"/>
+          </w:tcPr>
+          <w:p>
+            <w:pPr>
+              <w:spacing w:after="20" w:before="20"/>
+            </w:pPr>
+            <w:r>
+              <w:rPr>
+                <w:sz w:val="16"/>
+              </w:rPr>
+              <w:t>spiking_unet_lr2e4</w:t>
+            </w:r>
+          </w:p>
+        </w:tc>
+        <w:tc>
+          <w:tcPr>
+            <w:tcW w:type="dxa" w:w="2088"/>
+          </w:tcPr>
+          <w:p>
+            <w:pPr>
+              <w:spacing w:after="20" w:before="20"/>
+            </w:pPr>
+            <w:r>
+              <w:rPr>
+                <w:sz w:val="16"/>
+              </w:rPr>
+              <w:t>0.315±0.018 (n3)</w:t>
+            </w:r>
+          </w:p>
+        </w:tc>
+        <w:tc>
+          <w:tcPr>
+            <w:tcW w:type="dxa" w:w="864"/>
+          </w:tcPr>
+          <w:p>
+            <w:pPr>
+              <w:spacing w:after="20" w:before="20"/>
+            </w:pPr>
+            <w:r>
+              <w:rPr>
+                <w:sz w:val="16"/>
+              </w:rPr>
+              <w:t>0.253</w:t>
+            </w:r>
+          </w:p>
+        </w:tc>
+        <w:tc>
+          <w:tcPr>
+            <w:tcW w:type="dxa" w:w="720"/>
+          </w:tcPr>
+          <w:p>
+            <w:pPr>
+              <w:spacing w:after="20" w:before="20"/>
+            </w:pPr>
+            <w:r>
+              <w:rPr>
+                <w:sz w:val="16"/>
+              </w:rPr>
+              <w:t>0.478</w:t>
+            </w:r>
+          </w:p>
+        </w:tc>
+        <w:tc>
+          <w:tcPr>
+            <w:tcW w:type="dxa" w:w="792"/>
+          </w:tcPr>
+          <w:p>
+            <w:pPr>
+              <w:spacing w:after="20" w:before="20"/>
+            </w:pPr>
+            <w:r>
+              <w:rPr>
+                <w:sz w:val="16"/>
+              </w:rPr>
+              <w:t>0.311</w:t>
+            </w:r>
+          </w:p>
+        </w:tc>
+        <w:tc>
+          <w:tcPr>
+            <w:tcW w:type="dxa" w:w="864"/>
+          </w:tcPr>
+          <w:p>
+            <w:pPr>
+              <w:spacing w:after="20" w:before="20"/>
+            </w:pPr>
+            <w:r>
+              <w:rPr>
+                <w:sz w:val="16"/>
+              </w:rPr>
+              <w:t>7.76</w:t>
+            </w:r>
+          </w:p>
+        </w:tc>
+        <w:tc>
+          <w:tcPr>
+            <w:tcW w:type="dxa" w:w="1037"/>
+          </w:tcPr>
+          <w:p>
+            <w:pPr>
+              <w:spacing w:after="20" w:before="20"/>
+            </w:pPr>
+            <w:r>
+              <w:rPr>
+                <w:sz w:val="16"/>
+              </w:rPr>
+              <w:t>76.8</w:t>
+            </w:r>
+          </w:p>
+        </w:tc>
+        <w:tc>
+          <w:tcPr>
+            <w:tcW w:type="dxa" w:w="763"/>
+          </w:tcPr>
+          <w:p>
+            <w:pPr>
+              <w:spacing w:after="20" w:before="20"/>
+            </w:pPr>
+            <w:r>
+              <w:rPr>
+                <w:sz w:val="16"/>
+              </w:rPr>
+              <w:t>16.6</w:t>
             </w:r>
           </w:p>
         </w:tc>
@@ -2496,7 +3006,7 @@
               <w:rPr>
                 <w:sz w:val="16"/>
               </w:rPr>
-              <w:t>0.355±0.022 (n5)</w:t>
+              <w:t>0.283±0.097 (n5)</w:t>
             </w:r>
           </w:p>
         </w:tc>
@@ -2512,7 +3022,7 @@
               <w:rPr>
                 <w:sz w:val="16"/>
               </w:rPr>
-              <w:t>0.246</w:t>
+              <w:t>0.230</w:t>
             </w:r>
           </w:p>
         </w:tc>
@@ -2528,7 +3038,7 @@
               <w:rPr>
                 <w:sz w:val="16"/>
               </w:rPr>
-              <w:t>0.523</w:t>
+              <w:t>0.431</w:t>
             </w:r>
           </w:p>
         </w:tc>
@@ -2544,7 +3054,7 @@
               <w:rPr>
                 <w:sz w:val="16"/>
               </w:rPr>
-              <w:t>0.518</w:t>
+              <w:t>0.144</w:t>
             </w:r>
           </w:p>
         </w:tc>
@@ -2576,7 +3086,7 @@
               <w:rPr>
                 <w:sz w:val="16"/>
               </w:rPr>
-              <w:t>93.6</w:t>
+              <w:t>118.2</w:t>
             </w:r>
           </w:p>
         </w:tc>
@@ -2592,397 +3102,7 @@
               <w:rPr>
                 <w:sz w:val="16"/>
               </w:rPr>
-              <w:t>16.5</w:t>
-            </w:r>
-          </w:p>
-        </w:tc>
-      </w:tr>
-      <w:tr>
-        <w:tc>
-          <w:tcPr>
-            <w:tcW w:type="dxa" w:w="2304"/>
-          </w:tcPr>
-          <w:p>
-            <w:pPr>
-              <w:spacing w:after="20" w:before="20"/>
-            </w:pPr>
-            <w:r>
-              <w:rPr>
-                <w:sz w:val="16"/>
-              </w:rPr>
-              <w:t>spiking_unet_T4</w:t>
-            </w:r>
-          </w:p>
-        </w:tc>
-        <w:tc>
-          <w:tcPr>
-            <w:tcW w:type="dxa" w:w="2088"/>
-          </w:tcPr>
-          <w:p>
-            <w:pPr>
-              <w:spacing w:after="20" w:before="20"/>
-            </w:pPr>
-            <w:r>
-              <w:rPr>
-                <w:sz w:val="16"/>
-              </w:rPr>
-              <w:t>0.339±0.023 (n3)</w:t>
-            </w:r>
-          </w:p>
-        </w:tc>
-        <w:tc>
-          <w:tcPr>
-            <w:tcW w:type="dxa" w:w="864"/>
-          </w:tcPr>
-          <w:p>
-            <w:pPr>
-              <w:spacing w:after="20" w:before="20"/>
-            </w:pPr>
-            <w:r>
-              <w:rPr>
-                <w:sz w:val="16"/>
-              </w:rPr>
-              <w:t>0.241</w:t>
-            </w:r>
-          </w:p>
-        </w:tc>
-        <w:tc>
-          <w:tcPr>
-            <w:tcW w:type="dxa" w:w="720"/>
-          </w:tcPr>
-          <w:p>
-            <w:pPr>
-              <w:spacing w:after="20" w:before="20"/>
-            </w:pPr>
-            <w:r>
-              <w:rPr>
-                <w:sz w:val="16"/>
-              </w:rPr>
-              <w:t>0.506</w:t>
-            </w:r>
-          </w:p>
-        </w:tc>
-        <w:tc>
-          <w:tcPr>
-            <w:tcW w:type="dxa" w:w="792"/>
-          </w:tcPr>
-          <w:p>
-            <w:pPr>
-              <w:spacing w:after="20" w:before="20"/>
-            </w:pPr>
-            <w:r>
-              <w:rPr>
-                <w:sz w:val="16"/>
-              </w:rPr>
-              <w:t>0.479</w:t>
-            </w:r>
-          </w:p>
-        </w:tc>
-        <w:tc>
-          <w:tcPr>
-            <w:tcW w:type="dxa" w:w="864"/>
-          </w:tcPr>
-          <w:p>
-            <w:pPr>
-              <w:spacing w:after="20" w:before="20"/>
-            </w:pPr>
-            <w:r>
-              <w:rPr>
-                <w:sz w:val="16"/>
-              </w:rPr>
-              <w:t>7.76</w:t>
-            </w:r>
-          </w:p>
-        </w:tc>
-        <w:tc>
-          <w:tcPr>
-            <w:tcW w:type="dxa" w:w="1037"/>
-          </w:tcPr>
-          <w:p>
-            <w:pPr>
-              <w:spacing w:after="20" w:before="20"/>
-            </w:pPr>
-            <w:r>
-              <w:rPr>
-                <w:sz w:val="16"/>
-              </w:rPr>
-              <w:t>64.7</w:t>
-            </w:r>
-          </w:p>
-        </w:tc>
-        <w:tc>
-          <w:tcPr>
-            <w:tcW w:type="dxa" w:w="763"/>
-          </w:tcPr>
-          <w:p>
-            <w:pPr>
-              <w:spacing w:after="20" w:before="20"/>
-            </w:pPr>
-            <w:r>
-              <w:rPr>
-                <w:sz w:val="16"/>
-              </w:rPr>
-              <w:t>15.7</w:t>
-            </w:r>
-          </w:p>
-        </w:tc>
-      </w:tr>
-      <w:tr>
-        <w:tc>
-          <w:tcPr>
-            <w:tcW w:type="dxa" w:w="2304"/>
-          </w:tcPr>
-          <w:p>
-            <w:pPr>
-              <w:spacing w:after="20" w:before="20"/>
-            </w:pPr>
-            <w:r>
-              <w:rPr>
-                <w:sz w:val="16"/>
-              </w:rPr>
-              <w:t>spiking_unet_T3</w:t>
-            </w:r>
-          </w:p>
-        </w:tc>
-        <w:tc>
-          <w:tcPr>
-            <w:tcW w:type="dxa" w:w="2088"/>
-          </w:tcPr>
-          <w:p>
-            <w:pPr>
-              <w:spacing w:after="20" w:before="20"/>
-            </w:pPr>
-            <w:r>
-              <w:rPr>
-                <w:sz w:val="16"/>
-              </w:rPr>
-              <w:t>0.333±0.009 (n3)</w:t>
-            </w:r>
-          </w:p>
-        </w:tc>
-        <w:tc>
-          <w:tcPr>
-            <w:tcW w:type="dxa" w:w="864"/>
-          </w:tcPr>
-          <w:p>
-            <w:pPr>
-              <w:spacing w:after="20" w:before="20"/>
-            </w:pPr>
-            <w:r>
-              <w:rPr>
-                <w:sz w:val="16"/>
-              </w:rPr>
-              <w:t>0.229</w:t>
-            </w:r>
-          </w:p>
-        </w:tc>
-        <w:tc>
-          <w:tcPr>
-            <w:tcW w:type="dxa" w:w="720"/>
-          </w:tcPr>
-          <w:p>
-            <w:pPr>
-              <w:spacing w:after="20" w:before="20"/>
-            </w:pPr>
-            <w:r>
-              <w:rPr>
-                <w:sz w:val="16"/>
-              </w:rPr>
-              <w:t>0.500</w:t>
-            </w:r>
-          </w:p>
-        </w:tc>
-        <w:tc>
-          <w:tcPr>
-            <w:tcW w:type="dxa" w:w="792"/>
-          </w:tcPr>
-          <w:p>
-            <w:pPr>
-              <w:spacing w:after="20" w:before="20"/>
-            </w:pPr>
-            <w:r>
-              <w:rPr>
-                <w:sz w:val="16"/>
-              </w:rPr>
-              <w:t>0.352</w:t>
-            </w:r>
-          </w:p>
-        </w:tc>
-        <w:tc>
-          <w:tcPr>
-            <w:tcW w:type="dxa" w:w="864"/>
-          </w:tcPr>
-          <w:p>
-            <w:pPr>
-              <w:spacing w:after="20" w:before="20"/>
-            </w:pPr>
-            <w:r>
-              <w:rPr>
-                <w:sz w:val="16"/>
-              </w:rPr>
-              <w:t>7.76</w:t>
-            </w:r>
-          </w:p>
-        </w:tc>
-        <w:tc>
-          <w:tcPr>
-            <w:tcW w:type="dxa" w:w="1037"/>
-          </w:tcPr>
-          <w:p>
-            <w:pPr>
-              <w:spacing w:after="20" w:before="20"/>
-            </w:pPr>
-            <w:r>
-              <w:rPr>
-                <w:sz w:val="16"/>
-              </w:rPr>
-              <w:t>45.2</w:t>
-            </w:r>
-          </w:p>
-        </w:tc>
-        <w:tc>
-          <w:tcPr>
-            <w:tcW w:type="dxa" w:w="763"/>
-          </w:tcPr>
-          <w:p>
-            <w:pPr>
-              <w:spacing w:after="20" w:before="20"/>
-            </w:pPr>
-            <w:r>
-              <w:rPr>
-                <w:sz w:val="16"/>
-              </w:rPr>
-              <w:t>17.8</w:t>
-            </w:r>
-          </w:p>
-        </w:tc>
-      </w:tr>
-      <w:tr>
-        <w:tc>
-          <w:tcPr>
-            <w:tcW w:type="dxa" w:w="2304"/>
-          </w:tcPr>
-          <w:p>
-            <w:pPr>
-              <w:spacing w:after="20" w:before="20"/>
-            </w:pPr>
-            <w:r>
-              <w:rPr>
-                <w:sz w:val="16"/>
-              </w:rPr>
-              <w:t>spiking_unet_lr2e4</w:t>
-            </w:r>
-          </w:p>
-        </w:tc>
-        <w:tc>
-          <w:tcPr>
-            <w:tcW w:type="dxa" w:w="2088"/>
-          </w:tcPr>
-          <w:p>
-            <w:pPr>
-              <w:spacing w:after="20" w:before="20"/>
-            </w:pPr>
-            <w:r>
-              <w:rPr>
-                <w:sz w:val="16"/>
-              </w:rPr>
-              <w:t>0.328±0.026 (n3)</w:t>
-            </w:r>
-          </w:p>
-        </w:tc>
-        <w:tc>
-          <w:tcPr>
-            <w:tcW w:type="dxa" w:w="864"/>
-          </w:tcPr>
-          <w:p>
-            <w:pPr>
-              <w:spacing w:after="20" w:before="20"/>
-            </w:pPr>
-            <w:r>
-              <w:rPr>
-                <w:sz w:val="16"/>
-              </w:rPr>
-              <w:t>0.225</w:t>
-            </w:r>
-          </w:p>
-        </w:tc>
-        <w:tc>
-          <w:tcPr>
-            <w:tcW w:type="dxa" w:w="720"/>
-          </w:tcPr>
-          <w:p>
-            <w:pPr>
-              <w:spacing w:after="20" w:before="20"/>
-            </w:pPr>
-            <w:r>
-              <w:rPr>
-                <w:sz w:val="16"/>
-              </w:rPr>
-              <w:t>0.494</w:t>
-            </w:r>
-          </w:p>
-        </w:tc>
-        <w:tc>
-          <w:tcPr>
-            <w:tcW w:type="dxa" w:w="792"/>
-          </w:tcPr>
-          <w:p>
-            <w:pPr>
-              <w:spacing w:after="20" w:before="20"/>
-            </w:pPr>
-            <w:r>
-              <w:rPr>
-                <w:sz w:val="16"/>
-              </w:rPr>
-              <w:t>0.325</w:t>
-            </w:r>
-          </w:p>
-        </w:tc>
-        <w:tc>
-          <w:tcPr>
-            <w:tcW w:type="dxa" w:w="864"/>
-          </w:tcPr>
-          <w:p>
-            <w:pPr>
-              <w:spacing w:after="20" w:before="20"/>
-            </w:pPr>
-            <w:r>
-              <w:rPr>
-                <w:sz w:val="16"/>
-              </w:rPr>
-              <w:t>7.76</w:t>
-            </w:r>
-          </w:p>
-        </w:tc>
-        <w:tc>
-          <w:tcPr>
-            <w:tcW w:type="dxa" w:w="1037"/>
-          </w:tcPr>
-          <w:p>
-            <w:pPr>
-              <w:spacing w:after="20" w:before="20"/>
-            </w:pPr>
-            <w:r>
-              <w:rPr>
-                <w:sz w:val="16"/>
-              </w:rPr>
-              <w:t>62.9</w:t>
-            </w:r>
-          </w:p>
-        </w:tc>
-        <w:tc>
-          <w:tcPr>
-            <w:tcW w:type="dxa" w:w="763"/>
-          </w:tcPr>
-          <w:p>
-            <w:pPr>
-              <w:spacing w:after="20" w:before="20"/>
-            </w:pPr>
-            <w:r>
-              <w:rPr>
-                <w:sz w:val="16"/>
-              </w:rPr>
-              <w:t>18.5</w:t>
+              <w:t>26.6</w:t>
             </w:r>
           </w:p>
         </w:tc>
@@ -3016,7 +3136,7 @@
               <w:rPr>
                 <w:sz w:val="16"/>
               </w:rPr>
-              <w:t>0.294±0.063 (n3)</w:t>
+              <w:t>0.263±0.146 (n3)</w:t>
             </w:r>
           </w:p>
         </w:tc>
@@ -3032,7 +3152,7 @@
               <w:rPr>
                 <w:sz w:val="16"/>
               </w:rPr>
-              <w:t>0.196</w:t>
+              <w:t>0.177</w:t>
             </w:r>
           </w:p>
         </w:tc>
@@ -3048,7 +3168,7 @@
               <w:rPr>
                 <w:sz w:val="16"/>
               </w:rPr>
-              <w:t>0.450</w:t>
+              <w:t>0.394</w:t>
             </w:r>
           </w:p>
         </w:tc>
@@ -3064,7 +3184,7 @@
               <w:rPr>
                 <w:sz w:val="16"/>
               </w:rPr>
-              <w:t>0.447</w:t>
+              <w:t>0.496</w:t>
             </w:r>
           </w:p>
         </w:tc>
@@ -3096,7 +3216,7 @@
               <w:rPr>
                 <w:sz w:val="16"/>
               </w:rPr>
-              <w:t>440.4</w:t>
+              <w:t>441.2</w:t>
             </w:r>
           </w:p>
         </w:tc>
@@ -3112,7 +3232,7 @@
               <w:rPr>
                 <w:sz w:val="16"/>
               </w:rPr>
-              <w:t>10.6</w:t>
+              <w:t>10.9</w:t>
             </w:r>
           </w:p>
         </w:tc>
@@ -3130,7 +3250,7 @@
               <w:rPr>
                 <w:sz w:val="16"/>
               </w:rPr>
-              <w:t>spiking_unet_T10</w:t>
+              <w:t>spiking_unet_lr5e5</w:t>
             </w:r>
           </w:p>
         </w:tc>
@@ -3146,7 +3266,7 @@
               <w:rPr>
                 <w:sz w:val="16"/>
               </w:rPr>
-              <w:t>0.289±0.152 (n3)</w:t>
+              <w:t>0.247±0.114 (n3)</w:t>
             </w:r>
           </w:p>
         </w:tc>
@@ -3162,7 +3282,7 @@
               <w:rPr>
                 <w:sz w:val="16"/>
               </w:rPr>
-              <w:t>0.205</w:t>
+              <w:t>0.197</w:t>
             </w:r>
           </w:p>
         </w:tc>
@@ -3178,7 +3298,7 @@
               <w:rPr>
                 <w:sz w:val="16"/>
               </w:rPr>
-              <w:t>0.425</w:t>
+              <w:t>0.381</w:t>
             </w:r>
           </w:p>
         </w:tc>
@@ -3194,7 +3314,7 @@
               <w:rPr>
                 <w:sz w:val="16"/>
               </w:rPr>
-              <w:t>0.416</w:t>
+              <w:t>0.199</w:t>
             </w:r>
           </w:p>
         </w:tc>
@@ -3226,7 +3346,7 @@
               <w:rPr>
                 <w:sz w:val="16"/>
               </w:rPr>
-              <w:t>223.2</w:t>
+              <w:t>66.4</w:t>
             </w:r>
           </w:p>
         </w:tc>
@@ -3242,7 +3362,7 @@
               <w:rPr>
                 <w:sz w:val="16"/>
               </w:rPr>
-              <w:t>19.5</w:t>
+              <w:t>13.7</w:t>
             </w:r>
           </w:p>
         </w:tc>
@@ -3276,7 +3396,7 @@
               <w:rPr>
                 <w:sz w:val="16"/>
               </w:rPr>
-              <w:t>0.252±0.125 (n3)</w:t>
+              <w:t>0.236±0.102 (n3)</w:t>
             </w:r>
           </w:p>
         </w:tc>
@@ -3292,7 +3412,7 @@
               <w:rPr>
                 <w:sz w:val="16"/>
               </w:rPr>
-              <w:t>0.139</w:t>
+              <w:t>0.168</w:t>
             </w:r>
           </w:p>
         </w:tc>
@@ -3308,7 +3428,7 @@
               <w:rPr>
                 <w:sz w:val="16"/>
               </w:rPr>
-              <w:t>0.385</w:t>
+              <w:t>0.370</w:t>
             </w:r>
           </w:p>
         </w:tc>
@@ -3324,7 +3444,7 @@
               <w:rPr>
                 <w:sz w:val="16"/>
               </w:rPr>
-              <w:t>0.389</w:t>
+              <w:t>0.100</w:t>
             </w:r>
           </w:p>
         </w:tc>
@@ -3356,7 +3476,7 @@
               <w:rPr>
                 <w:sz w:val="16"/>
               </w:rPr>
-              <w:t>22.3</w:t>
+              <w:t>18.8</w:t>
             </w:r>
           </w:p>
         </w:tc>
@@ -3372,137 +3492,7 @@
               <w:rPr>
                 <w:sz w:val="16"/>
               </w:rPr>
-              <w:t>17.8</w:t>
-            </w:r>
-          </w:p>
-        </w:tc>
-      </w:tr>
-      <w:tr>
-        <w:tc>
-          <w:tcPr>
-            <w:tcW w:type="dxa" w:w="2304"/>
-          </w:tcPr>
-          <w:p>
-            <w:pPr>
-              <w:spacing w:after="20" w:before="20"/>
-            </w:pPr>
-            <w:r>
-              <w:rPr>
-                <w:sz w:val="16"/>
-              </w:rPr>
-              <w:t>spiking_unet_lr5e5</w:t>
-            </w:r>
-          </w:p>
-        </w:tc>
-        <w:tc>
-          <w:tcPr>
-            <w:tcW w:type="dxa" w:w="2088"/>
-          </w:tcPr>
-          <w:p>
-            <w:pPr>
-              <w:spacing w:after="20" w:before="20"/>
-            </w:pPr>
-            <w:r>
-              <w:rPr>
-                <w:sz w:val="16"/>
-              </w:rPr>
-              <w:t>0.239±0.119 (n3)</w:t>
-            </w:r>
-          </w:p>
-        </w:tc>
-        <w:tc>
-          <w:tcPr>
-            <w:tcW w:type="dxa" w:w="864"/>
-          </w:tcPr>
-          <w:p>
-            <w:pPr>
-              <w:spacing w:after="20" w:before="20"/>
-            </w:pPr>
-            <w:r>
-              <w:rPr>
-                <w:sz w:val="16"/>
-              </w:rPr>
-              <w:t>0.184</w:t>
-            </w:r>
-          </w:p>
-        </w:tc>
-        <w:tc>
-          <w:tcPr>
-            <w:tcW w:type="dxa" w:w="720"/>
-          </w:tcPr>
-          <w:p>
-            <w:pPr>
-              <w:spacing w:after="20" w:before="20"/>
-            </w:pPr>
-            <w:r>
-              <w:rPr>
-                <w:sz w:val="16"/>
-              </w:rPr>
-              <w:t>0.370</w:t>
-            </w:r>
-          </w:p>
-        </w:tc>
-        <w:tc>
-          <w:tcPr>
-            <w:tcW w:type="dxa" w:w="792"/>
-          </w:tcPr>
-          <w:p>
-            <w:pPr>
-              <w:spacing w:after="20" w:before="20"/>
-            </w:pPr>
-            <w:r>
-              <w:rPr>
-                <w:sz w:val="16"/>
-              </w:rPr>
-              <w:t>0.331</w:t>
-            </w:r>
-          </w:p>
-        </w:tc>
-        <w:tc>
-          <w:tcPr>
-            <w:tcW w:type="dxa" w:w="864"/>
-          </w:tcPr>
-          <w:p>
-            <w:pPr>
-              <w:spacing w:after="20" w:before="20"/>
-            </w:pPr>
-            <w:r>
-              <w:rPr>
-                <w:sz w:val="16"/>
-              </w:rPr>
-              <w:t>7.76</w:t>
-            </w:r>
-          </w:p>
-        </w:tc>
-        <w:tc>
-          <w:tcPr>
-            <w:tcW w:type="dxa" w:w="1037"/>
-          </w:tcPr>
-          <w:p>
-            <w:pPr>
-              <w:spacing w:after="20" w:before="20"/>
-            </w:pPr>
-            <w:r>
-              <w:rPr>
-                <w:sz w:val="16"/>
-              </w:rPr>
-              <w:t>62.6</w:t>
-            </w:r>
-          </w:p>
-        </w:tc>
-        <w:tc>
-          <w:tcPr>
-            <w:tcW w:type="dxa" w:w="763"/>
-          </w:tcPr>
-          <w:p>
-            <w:pPr>
-              <w:spacing w:after="20" w:before="20"/>
-            </w:pPr>
-            <w:r>
-              <w:rPr>
-                <w:sz w:val="16"/>
-              </w:rPr>
-              <w:t>15.1</w:t>
+              <w:t>17.6</w:t>
             </w:r>
           </w:p>
         </w:tc>
@@ -3536,7 +3526,7 @@
               <w:rPr>
                 <w:sz w:val="16"/>
               </w:rPr>
-              <w:t>0.194±0.072 (n3)</w:t>
+              <w:t>0.176±0.116 (n3)</w:t>
             </w:r>
           </w:p>
         </w:tc>
@@ -3552,7 +3542,7 @@
               <w:rPr>
                 <w:sz w:val="16"/>
               </w:rPr>
-              <w:t>0.133</w:t>
+              <w:t>0.111</w:t>
             </w:r>
           </w:p>
         </w:tc>
@@ -3568,7 +3558,7 @@
               <w:rPr>
                 <w:sz w:val="16"/>
               </w:rPr>
-              <w:t>0.319</w:t>
+              <w:t>0.281</w:t>
             </w:r>
           </w:p>
         </w:tc>
@@ -3584,7 +3574,7 @@
               <w:rPr>
                 <w:sz w:val="16"/>
               </w:rPr>
-              <w:t>0.507</w:t>
+              <w:t>0.462</w:t>
             </w:r>
           </w:p>
         </w:tc>
@@ -3616,7 +3606,7 @@
               <w:rPr>
                 <w:sz w:val="16"/>
               </w:rPr>
-              <w:t>212.1</w:t>
+              <w:t>210.0</w:t>
             </w:r>
           </w:p>
         </w:tc>
@@ -3632,7 +3622,7 @@
               <w:rPr>
                 <w:sz w:val="16"/>
               </w:rPr>
-              <w:t>10.0</w:t>
+              <w:t>10.5</w:t>
             </w:r>
           </w:p>
         </w:tc>
@@ -3666,7 +3656,7 @@
               <w:rPr>
                 <w:sz w:val="16"/>
               </w:rPr>
-              <w:t>0.037±0.011 (n3)</w:t>
+              <w:t>0.023±0.015 (n3)</w:t>
             </w:r>
           </w:p>
         </w:tc>
@@ -3682,7 +3672,7 @@
               <w:rPr>
                 <w:sz w:val="16"/>
               </w:rPr>
-              <w:t>0.028</w:t>
+              <w:t>0.015</w:t>
             </w:r>
           </w:p>
         </w:tc>
@@ -3698,7 +3688,7 @@
               <w:rPr>
                 <w:sz w:val="16"/>
               </w:rPr>
-              <w:t>0.071</w:t>
+              <w:t>0.045</w:t>
             </w:r>
           </w:p>
         </w:tc>
@@ -3714,7 +3704,7 @@
               <w:rPr>
                 <w:sz w:val="16"/>
               </w:rPr>
-              <w:t>0.526</w:t>
+              <w:t>0.246</w:t>
             </w:r>
           </w:p>
         </w:tc>
@@ -3746,7 +3736,7 @@
               <w:rPr>
                 <w:sz w:val="16"/>
               </w:rPr>
-              <w:t>97.9</w:t>
+              <w:t>95.0</w:t>
             </w:r>
           </w:p>
         </w:tc>
@@ -3762,7 +3752,7 @@
               <w:rPr>
                 <w:sz w:val="16"/>
               </w:rPr>
-              <w:t>8.8</w:t>
+              <w:t>9.0</w:t>
             </w:r>
           </w:p>
         </w:tc>
@@ -3789,7 +3779,7 @@
         <w:rPr>
           <w:i w:val="0"/>
         </w:rPr>
-        <w:t>On pooled IoU the accuracy leaders are pretrained ANNs (SegFormer 0.525); MobileNet-UNet INT8 reaches 0.490 at only 3.1 mJ (≈ its FP32 parent at 20× lower energy). SNN-Flood tops out at ≈0.39 pooled IoU, below the quantized CNN. The statistical grouping (Cluster A/B/C) is analysed in §5.2: the INT8 CNN and the best SNNs form one indistinguishable cluster on per-chip flood-IoU.</w:t>
+        <w:t>On pooled IoU the accuracy leaders are pretrained ANNs (U-Net++ 0.489, SegFormer 0.488); MobileNet-UNet INT8 reaches 0.464 at only 3.1 mJ (≈ its FP32 parent, 0.465, at 20× lower energy). SNN-Flood tops out at ≈0.35 pooled IoU, clearly below the quantized CNN. Per-chip significance is analysed in §5.2.</w:t>
       </w:r>
     </w:p>
     <w:p>
@@ -3813,7 +3803,7 @@
         <w:rPr>
           <w:i w:val="0"/>
         </w:rPr>
-        <w:t>Under the per-chip metric: U-Net-SMP vs MobileNet-INT8 p = 0.015 (significant, Cohen's d = 0.35); MobileNet-INT8 vs SNN-T6 p = 0.397 (n.s., d = 0.09); SNN-T2 vs SNN-T6 p = 0.368 (n.s., d = −0.14). The best SNNs and INT8 form a statistically indistinguishable cluster — the headline conclusion is metric-dependent.</w:t>
+        <w:t>Under the per-chip metric: U-Net-SMP vs MobileNet-INT8 p = 0.0006 (significant, Cohen's d = 0.30); MobileNet-INT8 vs SNN-T6 p = 0.043 (significant but small, d = 0.24); SNN-T2 vs SNN-T6 p = 0.056 (n.s.). Thus the INT8 CNN significantly outperforms the best SNN even per-chip, but with a small effect size — SNNs trail yet stay close on a per-scene basis, while the pooled-IoU gap is large. (An earlier 70/20/10 split with only 45 test chips lacked the power to detect this gap; the 60/20/20 split with 87 test chips does — motivating the larger test set.)</w:t>
       </w:r>
     </w:p>
     <w:p>
@@ -3837,7 +3827,7 @@
         <w:rPr>
           <w:i w:val="0"/>
         </w:rPr>
-        <w:t>The pooled Pareto frontier is Otsu (0 mJ, 0.13) → MobileNet-INT8 (3.1 mJ, 0.49) → SegFormer (98 mJ, 0.53); SNN-Flood is not Pareto-optimal under pooled IoU. Measured spike sparsity 13.6% (T2)–23.8% (T8) confirms energy is driven by genuine sparsity. Direct-trained SNNs (31–167 mJ) are far more efficient than ANN2SNN (94–440 mJ).</w:t>
+        <w:t>The pooled Pareto frontier is Otsu (0 mJ, 0.13) → MobileNet-INT8 (3.1 mJ, 0.464) → SegFormer / U-Net++ (98–339 mJ, ≈0.49); SNN-Flood is not Pareto-optimal under pooled IoU. Measured spike sparsity 13–27% confirms energy is driven by genuine sparsity. Direct-trained SNNs (19–188 mJ) are far more efficient than ANN2SNN (95–441 mJ).</w:t>
       </w:r>
     </w:p>
     <w:p>
@@ -3965,7 +3955,7 @@
         <w:rPr>
           <w:i w:val="0"/>
         </w:rPr>
-        <w:t>All models share the same regional difficulty ordering — easiest in Mekong/Ghana (≈0.4–0.5), hardest in Bolivia (≈0.04 for every model) — a property of the data, not the model. SNNs are comparatively stronger in Sri-Lanka/Ghana and weaker in Mekong/Pakistan.</w:t>
+        <w:t>Regional difficulty varies widely across the 11 flood events (Fig. 3), and all models share a similar ordering — indicating difficulty is largely a property of the data, not the model. SNNs track the same regional pattern as the CNNs, with no region where they uniquely fail.</w:t>
       </w:r>
     </w:p>
     <w:p>
@@ -4041,7 +4031,7 @@
         <w:rPr>
           <w:i w:val="0"/>
         </w:rPr>
-        <w:t>Timesteps T. Within T2–T8 accuracy is flat (T2 0.391 ≈ T8 0.388; SNN-T2 vs SNN-T6 n.s.), so larger T buys no accuracy but costs more energy. At extreme T (T1, T10) occasional seed-level training collapse appears (a seed drops to ≈0.08); re-running T6 with 5 seeds reduced std from 0.13 (n=3) to 0.022 (n=5), confirming a small-sample artifact, not a bimodal property.</w:t>
+        <w:t>Timesteps T. Accuracy is essentially flat across T2–T10 (all ≈0.32–0.35; SNN-T2 vs SNN-T6 n.s.), so larger T buys no accuracy while energy grows proportionally. Training is unstable across seeds: several configurations show one seed collapsing to ≈0.10 (std up to 0.10–0.15), and which T is affected varies between runs — pointing to stochastic seed-level collapse rather than a fixed bimodal dependence on T.</w:t>
       </w:r>
     </w:p>
     <w:p>
@@ -4053,7 +4043,7 @@
         <w:rPr>
           <w:i w:val="0"/>
         </w:rPr>
-        <w:t>Learning rate. LR = 2e-4 improved the CNN (MobileNet-UNet 0.480 → 0.498) but degraded the SNN (SNN-T2 0.391 → 0.370; SNN-T8 0.388 → 0.355): the winning CNN recipe does not transfer to SNNs, and LR mainly affects SNN training stability rather than raising its accuracy ceiling. The symmetric LR sweep also establishes a fair comparison (both families tuned).</w:t>
+        <w:t>Learning rate. LR = 2e-4 was best for the CNN (MobileNet-UNet 0.462 → 0.465) but degraded the SNN (SNN-T2 0.340 → 0.316; SNN-T8 0.342 → 0.332): the winning CNN recipe does not transfer to SNNs. The symmetric LR sweep also establishes a fair comparison (both families tuned).</w:t>
       </w:r>
     </w:p>
     <w:p>
@@ -4065,7 +4055,7 @@
         <w:rPr>
           <w:i w:val="0"/>
         </w:rPr>
-        <w:t>Quantization bits. INT8 preserves accuracy (−0.008 IoU) at 20× lower energy; INT4 was inconclusive in our tooling (torchao int4 did not cover Conv2d) — reported as a tooling limitation, not a scientific conclusion.</w:t>
+        <w:t>Quantization bits. INT8 preserves accuracy (−0.001 IoU vs FP32) at 20× lower energy; INT4 was inconclusive in our tooling (torchao int4 did not cover Conv2d) — reported as a tooling limitation, not a scientific conclusion.</w:t>
       </w:r>
     </w:p>
     <w:p>
@@ -4117,7 +4107,7 @@
           <w:i/>
           <w:sz w:val="18"/>
         </w:rPr>
-        <w:t>Figure 4. T-sweep: accuracy flat, energy grows; collapse at T1/T10.</w:t>
+        <w:t>Figure 4. T-sweep: accuracy flat across T; energy grows; sporadic seed collapse inflates variance.</w:t>
       </w:r>
     </w:p>
     <w:p>
@@ -4229,7 +4219,7 @@
         <w:rPr>
           <w:i w:val="0"/>
         </w:rPr>
-        <w:t>6.2 When to use SNN vs quantized CNN. On standard edge hardware with INT8 kernels, a quantized MobileNet-UNet is best. Prefer an SNN when the target is neuromorphic hardware (e.g., Loihi), when INT8 MAC arrays are unavailable, or with native event-based sensing; under the per-chip metric the SNN is not statistically worse than INT8. [TODO: vẽ decision-tree figure]</w:t>
+        <w:t>6.2 When to use SNN vs quantized CNN. On standard edge hardware with INT8 kernels, a quantized MobileNet-UNet is the clear choice (highest accuracy per mJ, best on both metrics). An SNN becomes attractive only when the target is neuromorphic hardware (e.g., Loihi) where event-driven execution realises its full energy benefit, when INT8 MAC arrays are unavailable, or with native event-based sensing; the per-chip gap to INT8 is small (d = 0.24), so the accuracy cost of that choice is modest. [TODO: vẽ decision-tree figure]</w:t>
       </w:r>
     </w:p>
     <w:p>
@@ -4265,7 +4255,7 @@
         <w:rPr>
           <w:i w:val="0"/>
         </w:rPr>
-        <w:t>We presented the first systematic energy–accuracy benchmark of direct-trained SNNs for SAR flood segmentation against CNN, Transformer, ANN2SNN and INT8 baselines under one protocol with multi-seed statistics. SNNs are competitive with an INT8 CNN under a paired per-chip metric but not under pooled IoU; ANN2SNN fails; quantized CNNs occupy the pooled Pareto front. Future work: neuromorphic deployment, multi-temporal SAR, event-native sensing.</w:t>
+        <w:t>We presented the first systematic energy–accuracy benchmark of direct-trained SNNs for SAR flood segmentation against CNN, Transformer, ANN2SNN and INT8 baselines under one protocol with multi-seed statistics. A quantized INT8 CNN significantly outperforms the best SNN on both pooled and per-chip IoU, though the per-chip gap is small (d = 0.24); ANN2SNN fails; quantized CNNs occupy the pooled Pareto front. SNNs remain a viable low-energy baseline whose advantage awaits neuromorphic hardware. Future work: neuromorphic deployment, multi-temporal SAR, event-native sensing.</w:t>
       </w:r>
     </w:p>
     <w:p>

</xml_diff>